<commit_message>
Refactor TP POO Mediathèque: Enhance index.php tests for progressive validation, update README for clarity, and improve SQL schema with detailed comments. Implement class structure for Livre, Dvd, and JeuVideo with proper inheritance and interface adherence.
</commit_message>
<xml_diff>
--- a/php/cours-POO+TP-correction/Corrige_Formateur_TP_POO_DWWM.docx
+++ b/php/cours-POO+TP-correction/Corrige_Formateur_TP_POO_DWWM.docx
@@ -2375,24 +2375,7 @@
           <w:sz w:val="22"/>
           <w:szCs w:val="22"/>
         </w:rPr>
-        <w:t xml:space="preserve"> — 4 blocs de test, dont la vérification </w:t>
-      </w:r>
-      <w:r>
-        <w:rPr>
-          <w:rFonts w:ascii="Consolas" w:cs="Consolas" w:eastAsia="Consolas" w:hAnsi="Consolas"/>
-          <w:sz w:val="20"/>
-          <w:szCs w:val="20"/>
-          <w:shd w:fill="ECECEC" w:val="clear"/>
-        </w:rPr>
-        <w:t xml:space="preserve">instanceof</w:t>
-      </w:r>
-      <w:r>
-        <w:rPr>
-          <w:rFonts w:ascii="Calibri" w:cs="Calibri" w:eastAsia="Calibri" w:hAnsi="Calibri"/>
-          <w:sz w:val="22"/>
-          <w:szCs w:val="22"/>
-        </w:rPr>
-        <w:t xml:space="preserve"> sur les 6 objets.</w:t>
+        <w:t xml:space="preserve">.</w:t>
       </w:r>
     </w:p>
     <w:p>
@@ -2409,130 +2392,30 @@
           <w:sz w:val="25"/>
           <w:szCs w:val="25"/>
         </w:rPr>
-        <w:t xml:space="preserve">4.1 Erreurs fréquentes</w:t>
-      </w:r>
-    </w:p>
-    <w:p>
-      <w:pPr>
-        <w:pStyle w:val="Heading3"/>
-        <w:spacing w:after="100" w:before="180"/>
+        <w:t xml:space="preserve">4.1 Répartition du travail — point de vigilance</w:t>
+      </w:r>
+    </w:p>
+    <w:p>
+      <w:pPr>
+        <w:spacing w:after="120"/>
       </w:pPr>
       <w:r>
         <w:rPr>
           <w:rFonts w:ascii="Calibri" w:cs="Calibri" w:eastAsia="Calibri" w:hAnsi="Calibri"/>
           <w:b/>
           <w:bCs/>
-          <w:color w:val="444444"/>
-          <w:sz w:val="22"/>
-          <w:szCs w:val="22"/>
-        </w:rPr>
-        <w:t xml:space="preserve">Oubli de `parent::__construct()`</w:t>
-      </w:r>
-    </w:p>
-    <w:p>
-      <w:pPr>
-        <w:shd w:fill="F5F5F5" w:val="clear"/>
-        <w:spacing w:after="0"/>
-        <w:ind w:left="240"/>
-      </w:pPr>
-      <w:r>
-        <w:rPr>
-          <w:rFonts w:ascii="Consolas" w:cs="Consolas" w:eastAsia="Consolas" w:hAnsi="Consolas"/>
-          <w:sz w:val="18"/>
-          <w:szCs w:val="18"/>
-        </w:rPr>
-        <w:t xml:space="preserve">public function __construct(string $titre, int $annee, private string $realisateur)</w:t>
-      </w:r>
-    </w:p>
-    <w:p>
-      <w:pPr>
-        <w:shd w:fill="F5F5F5" w:val="clear"/>
-        <w:spacing w:after="0"/>
-        <w:ind w:left="240"/>
-      </w:pPr>
-      <w:r>
-        <w:rPr>
-          <w:rFonts w:ascii="Consolas" w:cs="Consolas" w:eastAsia="Consolas" w:hAnsi="Consolas"/>
-          <w:sz w:val="18"/>
-          <w:szCs w:val="18"/>
-        </w:rPr>
-        <w:t xml:space="preserve">{</w:t>
-      </w:r>
-    </w:p>
-    <w:p>
-      <w:pPr>
-        <w:shd w:fill="F5F5F5" w:val="clear"/>
-        <w:spacing w:after="0"/>
-        <w:ind w:left="240"/>
-      </w:pPr>
-      <w:r>
-        <w:rPr>
-          <w:rFonts w:ascii="Consolas" w:cs="Consolas" w:eastAsia="Consolas" w:hAnsi="Consolas"/>
-          <w:sz w:val="18"/>
-          <w:szCs w:val="18"/>
-        </w:rPr>
-        <w:t xml:space="preserve">    // parent::__construct($titre, $annee);   ← oublié</w:t>
-      </w:r>
-    </w:p>
-    <w:p>
-      <w:pPr>
-        <w:shd w:fill="F5F5F5" w:val="clear"/>
-        <w:spacing w:after="160"/>
-        <w:ind w:left="240"/>
-      </w:pPr>
-      <w:r>
-        <w:rPr>
-          <w:rFonts w:ascii="Consolas" w:cs="Consolas" w:eastAsia="Consolas" w:hAnsi="Consolas"/>
-          <w:sz w:val="18"/>
-          <w:szCs w:val="18"/>
-        </w:rPr>
-        <w:t xml:space="preserve">}</w:t>
-      </w:r>
-    </w:p>
-    <w:p>
-      <w:pPr>
-        <w:spacing w:after="120"/>
-      </w:pPr>
-      <w:r>
-        <w:rPr>
-          <w:rFonts w:ascii="Calibri" w:cs="Calibri" w:eastAsia="Calibri" w:hAnsi="Calibri"/>
-          <w:b/>
-          <w:bCs/>
-          <w:sz w:val="22"/>
-          <w:szCs w:val="22"/>
-        </w:rPr>
-        <w:t xml:space="preserve">Fréquence : très élevée.</w:t>
-      </w:r>
-      <w:r>
-        <w:rPr>
-          <w:rFonts w:ascii="Calibri" w:cs="Calibri" w:eastAsia="Calibri" w:hAnsi="Calibri"/>
-          <w:sz w:val="22"/>
-          <w:szCs w:val="22"/>
-        </w:rPr>
-        <w:t xml:space="preserve"> Symptôme : *Error: Typed property Document::$titre must not be accessed before initialization*. Le message est en anglais et impressionne, mais il dit exactement ce qui se passe.</w:t>
-      </w:r>
-    </w:p>
-    <w:p>
-      <w:pPr>
-        <w:spacing w:after="120"/>
-      </w:pPr>
-      <w:r>
-        <w:rPr>
-          <w:rFonts w:ascii="Calibri" w:cs="Calibri" w:eastAsia="Calibri" w:hAnsi="Calibri"/>
-          <w:b/>
-          <w:bCs/>
-          <w:sz w:val="22"/>
-          <w:szCs w:val="22"/>
-        </w:rPr>
-        <w:t xml:space="preserve">Remédiation</w:t>
-      </w:r>
-      <w:r>
-        <w:rPr>
-          <w:rFonts w:ascii="Calibri" w:cs="Calibri" w:eastAsia="Calibri" w:hAnsi="Calibri"/>
-          <w:sz w:val="22"/>
-          <w:szCs w:val="22"/>
-        </w:rPr>
-        <w:t xml:space="preserve"> : faire traduire le message par le stagiaire — c'est du B1, et c'est une compétence transversale du REAC. Puis faire tracer au tableau la chaîne d'appel : </w:t>
+          <w:sz w:val="22"/>
+          <w:szCs w:val="22"/>
+        </w:rPr>
+        <w:t xml:space="preserve">Le niveau 1 n'est pas une lecture, c'est une migration.</w:t>
+      </w:r>
+      <w:r>
+        <w:rPr>
+          <w:rFonts w:ascii="Calibri" w:cs="Calibri" w:eastAsia="Calibri" w:hAnsi="Calibri"/>
+          <w:sz w:val="22"/>
+          <w:szCs w:val="22"/>
+        </w:rPr>
+        <w:t xml:space="preserve"> Le stagiaire reçoit un </w:t>
       </w:r>
       <w:r>
         <w:rPr>
@@ -2541,45 +2424,15 @@
           <w:szCs w:val="20"/>
           <w:shd w:fill="ECECEC" w:val="clear"/>
         </w:rPr>
-        <w:t xml:space="preserve">new Dvd()</w:t>
-      </w:r>
-      <w:r>
-        <w:rPr>
-          <w:rFonts w:ascii="Calibri" w:cs="Calibri" w:eastAsia="Calibri" w:hAnsi="Calibri"/>
-          <w:sz w:val="22"/>
-          <w:szCs w:val="22"/>
-        </w:rPr>
-        <w:t xml:space="preserve"> → constructeur de Dvd → *doit appeler* → constructeur de Document.</w:t>
-      </w:r>
-    </w:p>
-    <w:p>
-      <w:pPr>
-        <w:pStyle w:val="Heading3"/>
-        <w:spacing w:after="100" w:before="180"/>
-      </w:pPr>
-      <w:r>
-        <w:rPr>
-          <w:rFonts w:ascii="Calibri" w:cs="Calibri" w:eastAsia="Calibri" w:hAnsi="Calibri"/>
-          <w:b/>
-          <w:bCs/>
-          <w:color w:val="444444"/>
-          <w:sz w:val="22"/>
-          <w:szCs w:val="22"/>
-        </w:rPr>
-        <w:t xml:space="preserve">Propriétés du parent en `private`</w:t>
-      </w:r>
-    </w:p>
-    <w:p>
-      <w:pPr>
-        <w:spacing w:after="120"/>
-      </w:pPr>
-      <w:r>
-        <w:rPr>
-          <w:rFonts w:ascii="Calibri" w:cs="Calibri" w:eastAsia="Calibri" w:hAnsi="Calibri"/>
-          <w:sz w:val="22"/>
-          <w:szCs w:val="22"/>
-        </w:rPr>
-        <w:t xml:space="preserve">Le stagiaire recopie le réflexe « private par défaut » de l'étape 1 sur </w:t>
+        <w:t xml:space="preserve">Livre.php</w:t>
+      </w:r>
+      <w:r>
+        <w:rPr>
+          <w:rFonts w:ascii="Calibri" w:cs="Calibri" w:eastAsia="Calibri" w:hAnsi="Calibri"/>
+          <w:sz w:val="22"/>
+          <w:szCs w:val="22"/>
+        </w:rPr>
+        <w:t xml:space="preserve"> à trous et doit transformer lui-même sa classe autonome de l'étape 1 en classe héritée. C'est délibéré : le moment où il retire </w:t>
       </w:r>
       <w:r>
         <w:rPr>
@@ -2588,15 +2441,15 @@
           <w:szCs w:val="20"/>
           <w:shd w:fill="ECECEC" w:val="clear"/>
         </w:rPr>
-        <w:t xml:space="preserve">Document</w:t>
-      </w:r>
-      <w:r>
-        <w:rPr>
-          <w:rFonts w:ascii="Calibri" w:cs="Calibri" w:eastAsia="Calibri" w:hAnsi="Calibri"/>
-          <w:sz w:val="22"/>
-          <w:szCs w:val="22"/>
-        </w:rPr>
-        <w:t xml:space="preserve">, puis ne comprend pas pourquoi </w:t>
+        <w:t xml:space="preserve">titre</w:t>
+      </w:r>
+      <w:r>
+        <w:rPr>
+          <w:rFonts w:ascii="Calibri" w:cs="Calibri" w:eastAsia="Calibri" w:hAnsi="Calibri"/>
+          <w:sz w:val="22"/>
+          <w:szCs w:val="22"/>
+        </w:rPr>
+        <w:t xml:space="preserve"> de ses propres propriétés et constate que </w:t>
       </w:r>
       <w:r>
         <w:rPr>
@@ -2605,15 +2458,46 @@
           <w:szCs w:val="20"/>
           <w:shd w:fill="ECECEC" w:val="clear"/>
         </w:rPr>
-        <w:t xml:space="preserve">$this-&gt;titre</w:t>
-      </w:r>
-      <w:r>
-        <w:rPr>
-          <w:rFonts w:ascii="Calibri" w:cs="Calibri" w:eastAsia="Calibri" w:hAnsi="Calibri"/>
-          <w:sz w:val="22"/>
-          <w:szCs w:val="22"/>
-        </w:rPr>
-        <w:t xml:space="preserve"> est inaccessible dans </w:t>
+        <w:t xml:space="preserve">getTitre()</w:t>
+      </w:r>
+      <w:r>
+        <w:rPr>
+          <w:rFonts w:ascii="Calibri" w:cs="Calibri" w:eastAsia="Calibri" w:hAnsi="Calibri"/>
+          <w:sz w:val="22"/>
+          <w:szCs w:val="22"/>
+        </w:rPr>
+        <w:t xml:space="preserve"> fonctionne toujours est </w:t>
+      </w:r>
+      <w:r>
+        <w:rPr>
+          <w:rFonts w:ascii="Calibri" w:cs="Calibri" w:eastAsia="Calibri" w:hAnsi="Calibri"/>
+          <w:b/>
+          <w:bCs/>
+          <w:sz w:val="22"/>
+          <w:szCs w:val="22"/>
+        </w:rPr>
+        <w:t xml:space="preserve">le seul moment de la journée où l'héritage devient concret</w:t>
+      </w:r>
+      <w:r>
+        <w:rPr>
+          <w:rFonts w:ascii="Calibri" w:cs="Calibri" w:eastAsia="Calibri" w:hAnsi="Calibri"/>
+          <w:sz w:val="22"/>
+          <w:szCs w:val="22"/>
+        </w:rPr>
+        <w:t xml:space="preserve">. Le lui donner tout fait viderait l'étape de sa substance.</w:t>
+      </w:r>
+    </w:p>
+    <w:p>
+      <w:pPr>
+        <w:spacing w:after="120"/>
+      </w:pPr>
+      <w:r>
+        <w:rPr>
+          <w:rFonts w:ascii="Calibri" w:cs="Calibri" w:eastAsia="Calibri" w:hAnsi="Calibri"/>
+          <w:sz w:val="22"/>
+          <w:szCs w:val="22"/>
+        </w:rPr>
+        <w:t xml:space="preserve">Conséquence pratique : les erreurs listées ci-dessous surviennent dès le niveau 1, sur </w:t>
       </w:r>
       <w:r>
         <w:rPr>
@@ -2622,38 +2506,15 @@
           <w:szCs w:val="20"/>
           <w:shd w:fill="ECECEC" w:val="clear"/>
         </w:rPr>
-        <w:t xml:space="preserve">Dvd</w:t>
-      </w:r>
-      <w:r>
-        <w:rPr>
-          <w:rFonts w:ascii="Calibri" w:cs="Calibri" w:eastAsia="Calibri" w:hAnsi="Calibri"/>
-          <w:sz w:val="22"/>
-          <w:szCs w:val="22"/>
-        </w:rPr>
-        <w:t xml:space="preserve">.</w:t>
-      </w:r>
-    </w:p>
-    <w:p>
-      <w:pPr>
-        <w:spacing w:after="120"/>
-      </w:pPr>
-      <w:r>
-        <w:rPr>
-          <w:rFonts w:ascii="Calibri" w:cs="Calibri" w:eastAsia="Calibri" w:hAnsi="Calibri"/>
-          <w:b/>
-          <w:bCs/>
-          <w:sz w:val="22"/>
-          <w:szCs w:val="22"/>
-        </w:rPr>
-        <w:t xml:space="preserve">C'est une erreur pédagogiquement précieuse</w:t>
-      </w:r>
-      <w:r>
-        <w:rPr>
-          <w:rFonts w:ascii="Calibri" w:cs="Calibri" w:eastAsia="Calibri" w:hAnsi="Calibri"/>
-          <w:sz w:val="22"/>
-          <w:szCs w:val="22"/>
-        </w:rPr>
-        <w:t xml:space="preserve"> : elle donne le sens exact de </w:t>
+        <w:t xml:space="preserve">Livre</w:t>
+      </w:r>
+      <w:r>
+        <w:rPr>
+          <w:rFonts w:ascii="Calibri" w:cs="Calibri" w:eastAsia="Calibri" w:hAnsi="Calibri"/>
+          <w:sz w:val="22"/>
+          <w:szCs w:val="22"/>
+        </w:rPr>
+        <w:t xml:space="preserve">, et non au niveau 2 sur </w:t>
       </w:r>
       <w:r>
         <w:rPr>
@@ -2662,168 +2523,498 @@
           <w:szCs w:val="20"/>
           <w:shd w:fill="ECECEC" w:val="clear"/>
         </w:rPr>
-        <w:t xml:space="preserve">protected</w:t>
-      </w:r>
-      <w:r>
-        <w:rPr>
-          <w:rFonts w:ascii="Calibri" w:cs="Calibri" w:eastAsia="Calibri" w:hAnsi="Calibri"/>
-          <w:sz w:val="22"/>
-          <w:szCs w:val="22"/>
-        </w:rPr>
-        <w:t xml:space="preserve">, qu'un exposé théorique ne transmet jamais aussi bien. Laissez-la se produire, ne prévenez pas en amont.</w:t>
-      </w:r>
-    </w:p>
-    <w:p>
-      <w:pPr>
-        <w:pStyle w:val="Heading3"/>
-        <w:spacing w:after="100" w:before="180"/>
+        <w:t xml:space="preserve">Dvd</w:t>
+      </w:r>
+      <w:r>
+        <w:rPr>
+          <w:rFonts w:ascii="Calibri" w:cs="Calibri" w:eastAsia="Calibri" w:hAnsi="Calibri"/>
+          <w:sz w:val="22"/>
+          <w:szCs w:val="22"/>
+        </w:rPr>
+        <w:t xml:space="preserve">. C'est une bonne chose — elles se produisent pendant la phase accompagnée, sur une seule classe, plutôt qu'en autonomie sur deux classes simultanément.</w:t>
+      </w:r>
+    </w:p>
+    <w:tbl>
+      <w:tblPr>
+        <w:tblW w:type="dxa" w:w="9600"/>
+        <w:tblBorders>
+          <w:top w:val="single" w:color="auto" w:sz="4"/>
+          <w:left w:val="single" w:color="auto" w:sz="4"/>
+          <w:bottom w:val="single" w:color="auto" w:sz="4"/>
+          <w:right w:val="single" w:color="auto" w:sz="4"/>
+          <w:insideH w:val="single" w:color="auto" w:sz="4"/>
+          <w:insideV w:val="single" w:color="auto" w:sz="4"/>
+        </w:tblBorders>
+      </w:tblPr>
+      <w:tblGrid>
+        <w:gridCol w:w="900"/>
+        <w:gridCol w:w="5600"/>
+        <w:gridCol w:w="3100"/>
+      </w:tblGrid>
+      <w:tr>
+        <w:trPr>
+          <w:tblHeader/>
+        </w:trPr>
+        <w:tc>
+          <w:tcPr>
+            <w:tcW w:type="dxa" w:w="900"/>
+            <w:shd w:fill="1F4E79" w:val="clear"/>
+            <w:tcMar>
+              <w:top w:type="dxa" w:w="60"/>
+              <w:left w:type="dxa" w:w="100"/>
+              <w:bottom w:type="dxa" w:w="60"/>
+              <w:right w:type="dxa" w:w="100"/>
+            </w:tcMar>
+          </w:tcPr>
+          <w:p>
+            <w:pPr>
+              <w:spacing w:after="0"/>
+            </w:pPr>
+            <w:r>
+              <w:rPr>
+                <w:rFonts w:ascii="Calibri" w:cs="Calibri" w:eastAsia="Calibri" w:hAnsi="Calibri"/>
+                <w:b/>
+                <w:bCs/>
+                <w:color w:val="FFFFFF"/>
+                <w:sz w:val="22"/>
+                <w:szCs w:val="22"/>
+              </w:rPr>
+              <w:t xml:space="preserve">Niveau</w:t>
+            </w:r>
+          </w:p>
+        </w:tc>
+        <w:tc>
+          <w:tcPr>
+            <w:tcW w:type="dxa" w:w="5600"/>
+            <w:shd w:fill="1F4E79" w:val="clear"/>
+            <w:tcMar>
+              <w:top w:type="dxa" w:w="60"/>
+              <w:left w:type="dxa" w:w="100"/>
+              <w:bottom w:type="dxa" w:w="60"/>
+              <w:right w:type="dxa" w:w="100"/>
+            </w:tcMar>
+          </w:tcPr>
+          <w:p>
+            <w:pPr>
+              <w:spacing w:after="0"/>
+            </w:pPr>
+            <w:r>
+              <w:rPr>
+                <w:rFonts w:ascii="Calibri" w:cs="Calibri" w:eastAsia="Calibri" w:hAnsi="Calibri"/>
+                <w:b/>
+                <w:bCs/>
+                <w:color w:val="FFFFFF"/>
+                <w:sz w:val="22"/>
+                <w:szCs w:val="22"/>
+              </w:rPr>
+              <w:t xml:space="preserve">Ce que le stagiaire produit</w:t>
+            </w:r>
+          </w:p>
+        </w:tc>
+        <w:tc>
+          <w:tcPr>
+            <w:tcW w:type="dxa" w:w="3100"/>
+            <w:shd w:fill="1F4E79" w:val="clear"/>
+            <w:tcMar>
+              <w:top w:type="dxa" w:w="60"/>
+              <w:left w:type="dxa" w:w="100"/>
+              <w:bottom w:type="dxa" w:w="60"/>
+              <w:right w:type="dxa" w:w="100"/>
+            </w:tcMar>
+          </w:tcPr>
+          <w:p>
+            <w:pPr>
+              <w:spacing w:after="0"/>
+            </w:pPr>
+            <w:r>
+              <w:rPr>
+                <w:rFonts w:ascii="Calibri" w:cs="Calibri" w:eastAsia="Calibri" w:hAnsi="Calibri"/>
+                <w:b/>
+                <w:bCs/>
+                <w:color w:val="FFFFFF"/>
+                <w:sz w:val="22"/>
+                <w:szCs w:val="22"/>
+              </w:rPr>
+              <w:t xml:space="preserve">Accompagnement</w:t>
+            </w:r>
+          </w:p>
+        </w:tc>
+      </w:tr>
+      <w:tr>
+        <w:tc>
+          <w:tcPr>
+            <w:tcW w:type="dxa" w:w="900"/>
+            <w:tcMar>
+              <w:top w:type="dxa" w:w="60"/>
+              <w:left w:type="dxa" w:w="100"/>
+              <w:bottom w:type="dxa" w:w="60"/>
+              <w:right w:type="dxa" w:w="100"/>
+            </w:tcMar>
+          </w:tcPr>
+          <w:p>
+            <w:pPr>
+              <w:spacing w:after="0"/>
+            </w:pPr>
+            <w:r>
+              <w:rPr>
+                <w:rFonts w:ascii="Calibri" w:cs="Calibri" w:eastAsia="Calibri" w:hAnsi="Calibri"/>
+                <w:sz w:val="22"/>
+                <w:szCs w:val="22"/>
+              </w:rPr>
+              <w:t xml:space="preserve">1</w:t>
+            </w:r>
+          </w:p>
+        </w:tc>
+        <w:tc>
+          <w:tcPr>
+            <w:tcW w:type="dxa" w:w="5600"/>
+            <w:tcMar>
+              <w:top w:type="dxa" w:w="60"/>
+              <w:left w:type="dxa" w:w="100"/>
+              <w:bottom w:type="dxa" w:w="60"/>
+              <w:right w:type="dxa" w:w="100"/>
+            </w:tcMar>
+          </w:tcPr>
+          <w:p>
+            <w:pPr>
+              <w:spacing w:after="0"/>
+            </w:pPr>
+            <w:r>
+              <w:rPr>
+                <w:rFonts w:ascii="Calibri" w:cs="Calibri" w:eastAsia="Calibri" w:hAnsi="Calibri"/>
+                <w:sz w:val="22"/>
+                <w:szCs w:val="22"/>
+              </w:rPr>
+              <w:t xml:space="preserve">TODO de </w:t>
+            </w:r>
+            <w:r>
+              <w:rPr>
+                <w:rFonts w:ascii="Consolas" w:cs="Consolas" w:eastAsia="Consolas" w:hAnsi="Consolas"/>
+                <w:sz w:val="20"/>
+                <w:szCs w:val="20"/>
+                <w:shd w:fill="ECECEC" w:val="clear"/>
+              </w:rPr>
+              <w:t xml:space="preserve">Document</w:t>
+            </w:r>
+            <w:r>
+              <w:rPr>
+                <w:rFonts w:ascii="Calibri" w:cs="Calibri" w:eastAsia="Calibri" w:hAnsi="Calibri"/>
+                <w:sz w:val="22"/>
+                <w:szCs w:val="22"/>
+              </w:rPr>
+              <w:t xml:space="preserve"> et </w:t>
+            </w:r>
+            <w:r>
+              <w:rPr>
+                <w:rFonts w:ascii="Consolas" w:cs="Consolas" w:eastAsia="Consolas" w:hAnsi="Consolas"/>
+                <w:sz w:val="20"/>
+                <w:szCs w:val="20"/>
+                <w:shd w:fill="ECECEC" w:val="clear"/>
+              </w:rPr>
+              <w:t xml:space="preserve">Empruntable</w:t>
+            </w:r>
+            <w:r>
+              <w:rPr>
+                <w:rFonts w:ascii="Calibri" w:cs="Calibri" w:eastAsia="Calibri" w:hAnsi="Calibri"/>
+                <w:sz w:val="22"/>
+                <w:szCs w:val="22"/>
+              </w:rPr>
+              <w:t xml:space="preserve"> + migration complète de </w:t>
+            </w:r>
+            <w:r>
+              <w:rPr>
+                <w:rFonts w:ascii="Consolas" w:cs="Consolas" w:eastAsia="Consolas" w:hAnsi="Consolas"/>
+                <w:sz w:val="20"/>
+                <w:szCs w:val="20"/>
+                <w:shd w:fill="ECECEC" w:val="clear"/>
+              </w:rPr>
+              <w:t xml:space="preserve">Livre</w:t>
+            </w:r>
+          </w:p>
+        </w:tc>
+        <w:tc>
+          <w:tcPr>
+            <w:tcW w:type="dxa" w:w="3100"/>
+            <w:tcMar>
+              <w:top w:type="dxa" w:w="60"/>
+              <w:left w:type="dxa" w:w="100"/>
+              <w:bottom w:type="dxa" w:w="60"/>
+              <w:right w:type="dxa" w:w="100"/>
+            </w:tcMar>
+          </w:tcPr>
+          <w:p>
+            <w:pPr>
+              <w:spacing w:after="0"/>
+            </w:pPr>
+            <w:r>
+              <w:rPr>
+                <w:rFonts w:ascii="Calibri" w:cs="Calibri" w:eastAsia="Calibri" w:hAnsi="Calibri"/>
+                <w:sz w:val="22"/>
+                <w:szCs w:val="22"/>
+              </w:rPr>
+              <w:t xml:space="preserve">Guidé, formateur disponible</w:t>
+            </w:r>
+          </w:p>
+        </w:tc>
+      </w:tr>
+      <w:tr>
+        <w:tc>
+          <w:tcPr>
+            <w:tcW w:type="dxa" w:w="900"/>
+            <w:tcMar>
+              <w:top w:type="dxa" w:w="60"/>
+              <w:left w:type="dxa" w:w="100"/>
+              <w:bottom w:type="dxa" w:w="60"/>
+              <w:right w:type="dxa" w:w="100"/>
+            </w:tcMar>
+          </w:tcPr>
+          <w:p>
+            <w:pPr>
+              <w:spacing w:after="0"/>
+            </w:pPr>
+            <w:r>
+              <w:rPr>
+                <w:rFonts w:ascii="Calibri" w:cs="Calibri" w:eastAsia="Calibri" w:hAnsi="Calibri"/>
+                <w:sz w:val="22"/>
+                <w:szCs w:val="22"/>
+              </w:rPr>
+              <w:t xml:space="preserve">2</w:t>
+            </w:r>
+          </w:p>
+        </w:tc>
+        <w:tc>
+          <w:tcPr>
+            <w:tcW w:type="dxa" w:w="5600"/>
+            <w:tcMar>
+              <w:top w:type="dxa" w:w="60"/>
+              <w:left w:type="dxa" w:w="100"/>
+              <w:bottom w:type="dxa" w:w="60"/>
+              <w:right w:type="dxa" w:w="100"/>
+            </w:tcMar>
+          </w:tcPr>
+          <w:p>
+            <w:pPr>
+              <w:spacing w:after="0"/>
+            </w:pPr>
+            <w:r>
+              <w:rPr>
+                <w:rFonts w:ascii="Consolas" w:cs="Consolas" w:eastAsia="Consolas" w:hAnsi="Consolas"/>
+                <w:sz w:val="20"/>
+                <w:szCs w:val="20"/>
+                <w:shd w:fill="ECECEC" w:val="clear"/>
+              </w:rPr>
+              <w:t xml:space="preserve">Dvd</w:t>
+            </w:r>
+            <w:r>
+              <w:rPr>
+                <w:rFonts w:ascii="Calibri" w:cs="Calibri" w:eastAsia="Calibri" w:hAnsi="Calibri"/>
+                <w:sz w:val="22"/>
+                <w:szCs w:val="22"/>
+              </w:rPr>
+              <w:t xml:space="preserve"> et </w:t>
+            </w:r>
+            <w:r>
+              <w:rPr>
+                <w:rFonts w:ascii="Consolas" w:cs="Consolas" w:eastAsia="Consolas" w:hAnsi="Consolas"/>
+                <w:sz w:val="20"/>
+                <w:szCs w:val="20"/>
+                <w:shd w:fill="ECECEC" w:val="clear"/>
+              </w:rPr>
+              <w:t xml:space="preserve">JeuVideo</w:t>
+            </w:r>
+            <w:r>
+              <w:rPr>
+                <w:rFonts w:ascii="Calibri" w:cs="Calibri" w:eastAsia="Calibri" w:hAnsi="Calibri"/>
+                <w:sz w:val="22"/>
+                <w:szCs w:val="22"/>
+              </w:rPr>
+              <w:t xml:space="preserve"> écrites seul, en s'appuyant sur SON </w:t>
+            </w:r>
+            <w:r>
+              <w:rPr>
+                <w:rFonts w:ascii="Consolas" w:cs="Consolas" w:eastAsia="Consolas" w:hAnsi="Consolas"/>
+                <w:sz w:val="20"/>
+                <w:szCs w:val="20"/>
+                <w:shd w:fill="ECECEC" w:val="clear"/>
+              </w:rPr>
+              <w:t xml:space="preserve">Livre</w:t>
+            </w:r>
+          </w:p>
+        </w:tc>
+        <w:tc>
+          <w:tcPr>
+            <w:tcW w:type="dxa" w:w="3100"/>
+            <w:tcMar>
+              <w:top w:type="dxa" w:w="60"/>
+              <w:left w:type="dxa" w:w="100"/>
+              <w:bottom w:type="dxa" w:w="60"/>
+              <w:right w:type="dxa" w:w="100"/>
+            </w:tcMar>
+          </w:tcPr>
+          <w:p>
+            <w:pPr>
+              <w:spacing w:after="0"/>
+            </w:pPr>
+            <w:r>
+              <w:rPr>
+                <w:rFonts w:ascii="Calibri" w:cs="Calibri" w:eastAsia="Calibri" w:hAnsi="Calibri"/>
+                <w:sz w:val="22"/>
+                <w:szCs w:val="22"/>
+              </w:rPr>
+              <w:t xml:space="preserve">Autonomie</w:t>
+            </w:r>
+          </w:p>
+        </w:tc>
+      </w:tr>
+      <w:tr>
+        <w:tc>
+          <w:tcPr>
+            <w:tcW w:type="dxa" w:w="900"/>
+            <w:tcMar>
+              <w:top w:type="dxa" w:w="60"/>
+              <w:left w:type="dxa" w:w="100"/>
+              <w:bottom w:type="dxa" w:w="60"/>
+              <w:right w:type="dxa" w:w="100"/>
+            </w:tcMar>
+          </w:tcPr>
+          <w:p>
+            <w:pPr>
+              <w:spacing w:after="0"/>
+            </w:pPr>
+            <w:r>
+              <w:rPr>
+                <w:rFonts w:ascii="Calibri" w:cs="Calibri" w:eastAsia="Calibri" w:hAnsi="Calibri"/>
+                <w:sz w:val="22"/>
+                <w:szCs w:val="22"/>
+              </w:rPr>
+              <w:t xml:space="preserve">3</w:t>
+            </w:r>
+          </w:p>
+        </w:tc>
+        <w:tc>
+          <w:tcPr>
+            <w:tcW w:type="dxa" w:w="5600"/>
+            <w:tcMar>
+              <w:top w:type="dxa" w:w="60"/>
+              <w:left w:type="dxa" w:w="100"/>
+              <w:bottom w:type="dxa" w:w="60"/>
+              <w:right w:type="dxa" w:w="100"/>
+            </w:tcMar>
+          </w:tcPr>
+          <w:p>
+            <w:pPr>
+              <w:spacing w:after="0"/>
+            </w:pPr>
+            <w:r>
+              <w:rPr>
+                <w:rFonts w:ascii="Calibri" w:cs="Calibri" w:eastAsia="Calibri" w:hAnsi="Calibri"/>
+                <w:sz w:val="22"/>
+                <w:szCs w:val="22"/>
+              </w:rPr>
+              <w:t xml:space="preserve">Interface </w:t>
+            </w:r>
+            <w:r>
+              <w:rPr>
+                <w:rFonts w:ascii="Consolas" w:cs="Consolas" w:eastAsia="Consolas" w:hAnsi="Consolas"/>
+                <w:sz w:val="20"/>
+                <w:szCs w:val="20"/>
+                <w:shd w:fill="ECECEC" w:val="clear"/>
+              </w:rPr>
+              <w:t xml:space="preserve">Reservable</w:t>
+            </w:r>
+            <w:r>
+              <w:rPr>
+                <w:rFonts w:ascii="Calibri" w:cs="Calibri" w:eastAsia="Calibri" w:hAnsi="Calibri"/>
+                <w:sz w:val="22"/>
+                <w:szCs w:val="22"/>
+              </w:rPr>
+              <w:t xml:space="preserve">, </w:t>
+            </w:r>
+            <w:r>
+              <w:rPr>
+                <w:rFonts w:ascii="Consolas" w:cs="Consolas" w:eastAsia="Consolas" w:hAnsi="Consolas"/>
+                <w:sz w:val="20"/>
+                <w:szCs w:val="20"/>
+                <w:shd w:fill="ECECEC" w:val="clear"/>
+              </w:rPr>
+              <w:t xml:space="preserve">instanceof</w:t>
+            </w:r>
+            <w:r>
+              <w:rPr>
+                <w:rFonts w:ascii="Calibri" w:cs="Calibri" w:eastAsia="Calibri" w:hAnsi="Calibri"/>
+                <w:sz w:val="22"/>
+                <w:szCs w:val="22"/>
+              </w:rPr>
+              <w:t xml:space="preserve">, enum </w:t>
+            </w:r>
+            <w:r>
+              <w:rPr>
+                <w:rFonts w:ascii="Consolas" w:cs="Consolas" w:eastAsia="Consolas" w:hAnsi="Consolas"/>
+                <w:sz w:val="20"/>
+                <w:szCs w:val="20"/>
+                <w:shd w:fill="ECECEC" w:val="clear"/>
+              </w:rPr>
+              <w:t xml:space="preserve">TypeDocument</w:t>
+            </w:r>
+          </w:p>
+        </w:tc>
+        <w:tc>
+          <w:tcPr>
+            <w:tcW w:type="dxa" w:w="3100"/>
+            <w:tcMar>
+              <w:top w:type="dxa" w:w="60"/>
+              <w:left w:type="dxa" w:w="100"/>
+              <w:bottom w:type="dxa" w:w="60"/>
+              <w:right w:type="dxa" w:w="100"/>
+            </w:tcMar>
+          </w:tcPr>
+          <w:p>
+            <w:pPr>
+              <w:spacing w:after="0"/>
+            </w:pPr>
+            <w:r>
+              <w:rPr>
+                <w:rFonts w:ascii="Calibri" w:cs="Calibri" w:eastAsia="Calibri" w:hAnsi="Calibri"/>
+                <w:sz w:val="22"/>
+                <w:szCs w:val="22"/>
+              </w:rPr>
+              <w:t xml:space="preserve">Autonomie totale</w:t>
+            </w:r>
+          </w:p>
+        </w:tc>
+      </w:tr>
+    </w:tbl>
+    <w:p>
+      <w:pPr>
+        <w:spacing w:after="60"/>
+      </w:pPr>
+    </w:p>
+    <w:p>
+      <w:pPr>
+        <w:pBdr>
+          <w:left w:val="single" w:color="1F4E79" w:sz="18"/>
+        </w:pBdr>
+        <w:shd w:fill="E2EFDA" w:val="clear"/>
+        <w:spacing w:after="160" w:before="120"/>
+        <w:ind w:left="240" w:right="240"/>
       </w:pPr>
       <w:r>
         <w:rPr>
           <w:rFonts w:ascii="Calibri" w:cs="Calibri" w:eastAsia="Calibri" w:hAnsi="Calibri"/>
           <w:b/>
           <w:bCs/>
-          <w:color w:val="444444"/>
-          <w:sz w:val="22"/>
-          <w:szCs w:val="22"/>
-        </w:rPr>
-        <w:t xml:space="preserve">Redéclaration des propriétés du parent</w:t>
-      </w:r>
-    </w:p>
-    <w:p>
-      <w:pPr>
-        <w:shd w:fill="F5F5F5" w:val="clear"/>
-        <w:spacing w:after="0"/>
-        <w:ind w:left="240"/>
-      </w:pPr>
-      <w:r>
-        <w:rPr>
-          <w:rFonts w:ascii="Consolas" w:cs="Consolas" w:eastAsia="Consolas" w:hAnsi="Consolas"/>
-          <w:sz w:val="18"/>
-          <w:szCs w:val="18"/>
-        </w:rPr>
-        <w:t xml:space="preserve">class Dvd extends Document</w:t>
-      </w:r>
-    </w:p>
-    <w:p>
-      <w:pPr>
-        <w:shd w:fill="F5F5F5" w:val="clear"/>
-        <w:spacing w:after="0"/>
-        <w:ind w:left="240"/>
-      </w:pPr>
-      <w:r>
-        <w:rPr>
-          <w:rFonts w:ascii="Consolas" w:cs="Consolas" w:eastAsia="Consolas" w:hAnsi="Consolas"/>
-          <w:sz w:val="18"/>
-          <w:szCs w:val="18"/>
-        </w:rPr>
-        <w:t xml:space="preserve">{</w:t>
-      </w:r>
-    </w:p>
-    <w:p>
-      <w:pPr>
-        <w:shd w:fill="F5F5F5" w:val="clear"/>
-        <w:spacing w:after="0"/>
-        <w:ind w:left="240"/>
-      </w:pPr>
-      <w:r>
-        <w:rPr>
-          <w:rFonts w:ascii="Consolas" w:cs="Consolas" w:eastAsia="Consolas" w:hAnsi="Consolas"/>
-          <w:sz w:val="18"/>
-          <w:szCs w:val="18"/>
-        </w:rPr>
-        <w:t xml:space="preserve">    protected string $titre;   // FAUX — déjà déclarée dans Document</w:t>
-      </w:r>
-    </w:p>
-    <w:p>
-      <w:pPr>
-        <w:shd w:fill="F5F5F5" w:val="clear"/>
-        <w:spacing w:after="0"/>
-        <w:ind w:left="240"/>
-      </w:pPr>
-      <w:r>
-        <w:rPr>
-          <w:rFonts w:ascii="Consolas" w:cs="Consolas" w:eastAsia="Consolas" w:hAnsi="Consolas"/>
-          <w:sz w:val="18"/>
-          <w:szCs w:val="18"/>
-        </w:rPr>
-        <w:t xml:space="preserve">    private string $realisateur;</w:t>
-      </w:r>
-    </w:p>
-    <w:p>
-      <w:pPr>
-        <w:shd w:fill="F5F5F5" w:val="clear"/>
-        <w:spacing w:after="160"/>
-        <w:ind w:left="240"/>
-      </w:pPr>
-      <w:r>
-        <w:rPr>
-          <w:rFonts w:ascii="Consolas" w:cs="Consolas" w:eastAsia="Consolas" w:hAnsi="Consolas"/>
-          <w:sz w:val="18"/>
-          <w:szCs w:val="18"/>
-        </w:rPr>
-        <w:t xml:space="preserve">}</w:t>
-      </w:r>
-    </w:p>
-    <w:p>
-      <w:pPr>
-        <w:spacing w:after="120"/>
-      </w:pPr>
-      <w:r>
-        <w:rPr>
-          <w:rFonts w:ascii="Calibri" w:cs="Calibri" w:eastAsia="Calibri" w:hAnsi="Calibri"/>
-          <w:sz w:val="22"/>
-          <w:szCs w:val="22"/>
-        </w:rPr>
-        <w:t xml:space="preserve">Ne produit pas toujours d'erreur, mais casse la logique de factorisation. </w:t>
-      </w:r>
-      <w:r>
-        <w:rPr>
-          <w:rFonts w:ascii="Calibri" w:cs="Calibri" w:eastAsia="Calibri" w:hAnsi="Calibri"/>
-          <w:b/>
-          <w:bCs/>
-          <w:sz w:val="22"/>
-          <w:szCs w:val="22"/>
-        </w:rPr>
-        <w:t xml:space="preserve">Question à poser</w:t>
-      </w:r>
-      <w:r>
-        <w:rPr>
-          <w:rFonts w:ascii="Calibri" w:cs="Calibri" w:eastAsia="Calibri" w:hAnsi="Calibri"/>
-          <w:sz w:val="22"/>
-          <w:szCs w:val="22"/>
-        </w:rPr>
-        <w:t xml:space="preserve"> : « Si tu redéclares le titre ici, à quoi sert l'héritage ? »</w:t>
-      </w:r>
-    </w:p>
-    <w:p>
-      <w:pPr>
-        <w:pStyle w:val="Heading3"/>
-        <w:spacing w:after="100" w:before="180"/>
-      </w:pPr>
-      <w:r>
-        <w:rPr>
-          <w:rFonts w:ascii="Calibri" w:cs="Calibri" w:eastAsia="Calibri" w:hAnsi="Calibri"/>
-          <w:b/>
-          <w:bCs/>
-          <w:color w:val="444444"/>
-          <w:sz w:val="22"/>
-          <w:szCs w:val="22"/>
-        </w:rPr>
-        <w:t xml:space="preserve">Confusion `implements` / `extends`</w:t>
-      </w:r>
-    </w:p>
-    <w:p>
-      <w:pPr>
-        <w:spacing w:after="120"/>
-      </w:pPr>
-      <w:r>
-        <w:rPr>
-          <w:rFonts w:ascii="Calibri" w:cs="Calibri" w:eastAsia="Calibri" w:hAnsi="Calibri"/>
-          <w:sz w:val="22"/>
-          <w:szCs w:val="22"/>
-        </w:rPr>
-        <w:t xml:space="preserve">Écrire </w:t>
+          <w:sz w:val="22"/>
+          <w:szCs w:val="22"/>
+        </w:rPr>
+        <w:t xml:space="preserve">[PRO TIP]  </w:t>
+      </w:r>
+      <w:r>
+        <w:rPr>
+          <w:rFonts w:ascii="Calibri" w:cs="Calibri" w:eastAsia="Calibri" w:hAnsi="Calibri"/>
+          <w:sz w:val="22"/>
+          <w:szCs w:val="22"/>
+        </w:rPr>
+        <w:t xml:space="preserve">Le test </w:t>
       </w:r>
       <w:r>
         <w:rPr>
@@ -2832,63 +3023,15 @@
           <w:szCs w:val="20"/>
           <w:shd w:fill="ECECEC" w:val="clear"/>
         </w:rPr>
-        <w:t xml:space="preserve">class Dvd extends Document, Empruntable</w:t>
-      </w:r>
-      <w:r>
-        <w:rPr>
-          <w:rFonts w:ascii="Calibri" w:cs="Calibri" w:eastAsia="Calibri" w:hAnsi="Calibri"/>
-          <w:sz w:val="22"/>
-          <w:szCs w:val="22"/>
-        </w:rPr>
-        <w:t xml:space="preserve"> — erreur de syntaxe immédiate. Bon moment pour marteler la règle : </w:t>
-      </w:r>
-      <w:r>
-        <w:rPr>
-          <w:rFonts w:ascii="Calibri" w:cs="Calibri" w:eastAsia="Calibri" w:hAnsi="Calibri"/>
-          <w:b/>
-          <w:bCs/>
-          <w:sz w:val="22"/>
-          <w:szCs w:val="22"/>
-        </w:rPr>
-        <w:t xml:space="preserve">un seul `extends`, autant d'`implements` que voulu</w:t>
-      </w:r>
-      <w:r>
-        <w:rPr>
-          <w:rFonts w:ascii="Calibri" w:cs="Calibri" w:eastAsia="Calibri" w:hAnsi="Calibri"/>
-          <w:sz w:val="22"/>
-          <w:szCs w:val="22"/>
-        </w:rPr>
-        <w:t xml:space="preserve">, et dans cet ordre.</w:t>
-      </w:r>
-    </w:p>
-    <w:p>
-      <w:pPr>
-        <w:pStyle w:val="Heading3"/>
-        <w:spacing w:after="100" w:before="180"/>
-      </w:pPr>
-      <w:r>
-        <w:rPr>
-          <w:rFonts w:ascii="Calibri" w:cs="Calibri" w:eastAsia="Calibri" w:hAnsi="Calibri"/>
-          <w:b/>
-          <w:bCs/>
-          <w:color w:val="444444"/>
-          <w:sz w:val="22"/>
-          <w:szCs w:val="22"/>
-        </w:rPr>
-        <w:t xml:space="preserve">Interface implémentée à moitié</w:t>
-      </w:r>
-    </w:p>
-    <w:p>
-      <w:pPr>
-        <w:spacing w:after="120"/>
-      </w:pPr>
-      <w:r>
-        <w:rPr>
-          <w:rFonts w:ascii="Calibri" w:cs="Calibri" w:eastAsia="Calibri" w:hAnsi="Calibri"/>
-          <w:sz w:val="22"/>
-          <w:szCs w:val="22"/>
-        </w:rPr>
-        <w:t xml:space="preserve">Le stagiaire écrit </w:t>
+        <w:t xml:space="preserve">index.php</w:t>
+      </w:r>
+      <w:r>
+        <w:rPr>
+          <w:rFonts w:ascii="Calibri" w:cs="Calibri" w:eastAsia="Calibri" w:hAnsi="Calibri"/>
+          <w:sz w:val="22"/>
+          <w:szCs w:val="22"/>
+        </w:rPr>
+        <w:t xml:space="preserve"> de l'étape 2 est progressif : il valide le niveau 1 seul et refuse d'aller plus loin tant que </w:t>
       </w:r>
       <w:r>
         <w:rPr>
@@ -2897,55 +3040,15 @@
           <w:szCs w:val="20"/>
           <w:shd w:fill="ECECEC" w:val="clear"/>
         </w:rPr>
-        <w:t xml:space="preserve">implements Empruntable</w:t>
-      </w:r>
-      <w:r>
-        <w:rPr>
-          <w:rFonts w:ascii="Calibri" w:cs="Calibri" w:eastAsia="Calibri" w:hAnsi="Calibri"/>
-          <w:sz w:val="22"/>
-          <w:szCs w:val="22"/>
-        </w:rPr>
-        <w:t xml:space="preserve"> mais n'implémente que </w:t>
-      </w:r>
-      <w:r>
-        <w:rPr>
-          <w:rFonts w:ascii="Consolas" w:cs="Consolas" w:eastAsia="Consolas" w:hAnsi="Consolas"/>
-          <w:sz w:val="20"/>
-          <w:szCs w:val="20"/>
-          <w:shd w:fill="ECECEC" w:val="clear"/>
-        </w:rPr>
-        <w:t xml:space="preserve">emprunter()</w:t>
-      </w:r>
-      <w:r>
-        <w:rPr>
-          <w:rFonts w:ascii="Calibri" w:cs="Calibri" w:eastAsia="Calibri" w:hAnsi="Calibri"/>
-          <w:sz w:val="22"/>
-          <w:szCs w:val="22"/>
-        </w:rPr>
-        <w:t xml:space="preserve">. PHP refuse de charger la classe : *Class Dvd contains 1 abstract method...*</w:t>
-      </w:r>
-    </w:p>
-    <w:p>
-      <w:pPr>
-        <w:spacing w:after="120"/>
-      </w:pPr>
-      <w:r>
-        <w:rPr>
-          <w:rFonts w:ascii="Calibri" w:cs="Calibri" w:eastAsia="Calibri" w:hAnsi="Calibri"/>
-          <w:b/>
-          <w:bCs/>
-          <w:sz w:val="22"/>
-          <w:szCs w:val="22"/>
-        </w:rPr>
-        <w:t xml:space="preserve">Exploitez ce message</w:t>
-      </w:r>
-      <w:r>
-        <w:rPr>
-          <w:rFonts w:ascii="Calibri" w:cs="Calibri" w:eastAsia="Calibri" w:hAnsi="Calibri"/>
-          <w:sz w:val="22"/>
-          <w:szCs w:val="22"/>
-        </w:rPr>
-        <w:t xml:space="preserve"> : c'est la démonstration en direct de ce qu'est un contrat. PHP a vérifié l'engagement et l'a fait respecter. Aucun exposé ne vaut cette erreur vécue.</w:t>
+        <w:t xml:space="preserve">Livre</w:t>
+      </w:r>
+      <w:r>
+        <w:rPr>
+          <w:rFonts w:ascii="Calibri" w:cs="Calibri" w:eastAsia="Calibri" w:hAnsi="Calibri"/>
+          <w:sz w:val="22"/>
+          <w:szCs w:val="22"/>
+        </w:rPr>
+        <w:t xml:space="preserve"> n'hérite pas correctement. Utilisez-le comme instrument de régulation — un stagiaire qui vous appelle en disant « ça marche pas » doit d'abord vous montrer la sortie de ce test.</w:t>
       </w:r>
     </w:p>
     <w:p>
@@ -2962,80 +3065,90 @@
           <w:sz w:val="25"/>
           <w:szCs w:val="25"/>
         </w:rPr>
-        <w:t xml:space="preserve">4.2 Le moment clé de la journée</w:t>
-      </w:r>
-    </w:p>
-    <w:p>
-      <w:pPr>
-        <w:spacing w:after="120"/>
-      </w:pPr>
-      <w:r>
-        <w:rPr>
-          <w:rFonts w:ascii="Calibri" w:cs="Calibri" w:eastAsia="Calibri" w:hAnsi="Calibri"/>
-          <w:sz w:val="22"/>
-          <w:szCs w:val="22"/>
-        </w:rPr>
-        <w:t xml:space="preserve">Le bloc de test qui affiche 6 documents de 3 types via une seule boucle est </w:t>
-      </w:r>
+        <w:t xml:space="preserve">4.2 Erreurs fréquentes</w:t>
+      </w:r>
+    </w:p>
+    <w:p>
+      <w:pPr>
+        <w:pStyle w:val="Heading3"/>
+        <w:spacing w:after="100" w:before="180"/>
+      </w:pPr>
       <w:r>
         <w:rPr>
           <w:rFonts w:ascii="Calibri" w:cs="Calibri" w:eastAsia="Calibri" w:hAnsi="Calibri"/>
           <w:b/>
           <w:bCs/>
-          <w:sz w:val="22"/>
-          <w:szCs w:val="22"/>
-        </w:rPr>
-        <w:t xml:space="preserve">le point de bascule pédagogique de la journée</w:t>
-      </w:r>
-      <w:r>
-        <w:rPr>
-          <w:rFonts w:ascii="Calibri" w:cs="Calibri" w:eastAsia="Calibri" w:hAnsi="Calibri"/>
-          <w:sz w:val="22"/>
-          <w:szCs w:val="22"/>
-        </w:rPr>
-        <w:t xml:space="preserve">. Ne le laissez pas passer dans le flux.</w:t>
+          <w:color w:val="444444"/>
+          <w:sz w:val="22"/>
+          <w:szCs w:val="22"/>
+        </w:rPr>
+        <w:t xml:space="preserve">Oubli de `parent::__construct()`</w:t>
+      </w:r>
+    </w:p>
+    <w:p>
+      <w:pPr>
+        <w:shd w:fill="F5F5F5" w:val="clear"/>
+        <w:spacing w:after="0"/>
+        <w:ind w:left="240"/>
+      </w:pPr>
+      <w:r>
+        <w:rPr>
+          <w:rFonts w:ascii="Consolas" w:cs="Consolas" w:eastAsia="Consolas" w:hAnsi="Consolas"/>
+          <w:sz w:val="18"/>
+          <w:szCs w:val="18"/>
+        </w:rPr>
+        <w:t xml:space="preserve">public function __construct(string $titre, int $annee, private string $realisateur)</w:t>
+      </w:r>
+    </w:p>
+    <w:p>
+      <w:pPr>
+        <w:shd w:fill="F5F5F5" w:val="clear"/>
+        <w:spacing w:after="0"/>
+        <w:ind w:left="240"/>
+      </w:pPr>
+      <w:r>
+        <w:rPr>
+          <w:rFonts w:ascii="Consolas" w:cs="Consolas" w:eastAsia="Consolas" w:hAnsi="Consolas"/>
+          <w:sz w:val="18"/>
+          <w:szCs w:val="18"/>
+        </w:rPr>
+        <w:t xml:space="preserve">{</w:t>
+      </w:r>
+    </w:p>
+    <w:p>
+      <w:pPr>
+        <w:shd w:fill="F5F5F5" w:val="clear"/>
+        <w:spacing w:after="0"/>
+        <w:ind w:left="240"/>
+      </w:pPr>
+      <w:r>
+        <w:rPr>
+          <w:rFonts w:ascii="Consolas" w:cs="Consolas" w:eastAsia="Consolas" w:hAnsi="Consolas"/>
+          <w:sz w:val="18"/>
+          <w:szCs w:val="18"/>
+        </w:rPr>
+        <w:t xml:space="preserve">    // parent::__construct($titre, $annee);   ← oublié</w:t>
+      </w:r>
+    </w:p>
+    <w:p>
+      <w:pPr>
+        <w:shd w:fill="F5F5F5" w:val="clear"/>
+        <w:spacing w:after="160"/>
+        <w:ind w:left="240"/>
+      </w:pPr>
+      <w:r>
+        <w:rPr>
+          <w:rFonts w:ascii="Consolas" w:cs="Consolas" w:eastAsia="Consolas" w:hAnsi="Consolas"/>
+          <w:sz w:val="18"/>
+          <w:szCs w:val="18"/>
+        </w:rPr>
+        <w:t xml:space="preserve">}</w:t>
       </w:r>
     </w:p>
     <w:p>
       <w:pPr>
         <w:spacing w:after="120"/>
       </w:pPr>
-      <w:r>
-        <w:rPr>
-          <w:rFonts w:ascii="Calibri" w:cs="Calibri" w:eastAsia="Calibri" w:hAnsi="Calibri"/>
-          <w:sz w:val="22"/>
-          <w:szCs w:val="22"/>
-        </w:rPr>
-        <w:t xml:space="preserve">Conduite recommandée : dès que trois ou quatre stagiaires y arrivent, arrêtez la salle 3 minutes, projetez la boucle et posez la question :</w:t>
-      </w:r>
-    </w:p>
-    <w:p>
-      <w:pPr>
-        <w:spacing w:after="120"/>
-      </w:pPr>
-      <w:r>
-        <w:rPr>
-          <w:rFonts w:ascii="Calibri" w:cs="Calibri" w:eastAsia="Calibri" w:hAnsi="Calibri"/>
-          <w:i/>
-          <w:iCs/>
-          <w:sz w:val="22"/>
-          <w:szCs w:val="22"/>
-        </w:rPr>
-        <w:t xml:space="preserve">« Il y a une seule ligne d'affichage. Comment PHP peut-il produire trois formats différents ? »</w:t>
-      </w:r>
-    </w:p>
-    <w:p>
-      <w:pPr>
-        <w:spacing w:after="120"/>
-      </w:pPr>
-      <w:r>
-        <w:rPr>
-          <w:rFonts w:ascii="Calibri" w:cs="Calibri" w:eastAsia="Calibri" w:hAnsi="Calibri"/>
-          <w:sz w:val="22"/>
-          <w:szCs w:val="22"/>
-        </w:rPr>
-        <w:t xml:space="preserve">Laissez le silence. Quelqu'un formulera le mécanisme. C'est le mot </w:t>
-      </w:r>
       <w:r>
         <w:rPr>
           <w:rFonts w:ascii="Calibri" w:cs="Calibri" w:eastAsia="Calibri" w:hAnsi="Calibri"/>
@@ -3044,15 +3157,451 @@
           <w:sz w:val="22"/>
           <w:szCs w:val="22"/>
         </w:rPr>
-        <w:t xml:space="preserve">polymorphisme</w:t>
-      </w:r>
-      <w:r>
-        <w:rPr>
-          <w:rFonts w:ascii="Calibri" w:cs="Calibri" w:eastAsia="Calibri" w:hAnsi="Calibri"/>
-          <w:sz w:val="22"/>
-          <w:szCs w:val="22"/>
-        </w:rPr>
-        <w:t xml:space="preserve"> qui doit sortir de la salle, pas de vous.</w:t>
+        <w:t xml:space="preserve">Fréquence : très élevée.</w:t>
+      </w:r>
+      <w:r>
+        <w:rPr>
+          <w:rFonts w:ascii="Calibri" w:cs="Calibri" w:eastAsia="Calibri" w:hAnsi="Calibri"/>
+          <w:sz w:val="22"/>
+          <w:szCs w:val="22"/>
+        </w:rPr>
+        <w:t xml:space="preserve"> Symptôme : *Error: Typed property Document::$titre must not be accessed before initialization*. Le message est en anglais et impressionne, mais il dit exactement ce qui se passe.</w:t>
+      </w:r>
+    </w:p>
+    <w:p>
+      <w:pPr>
+        <w:spacing w:after="120"/>
+      </w:pPr>
+      <w:r>
+        <w:rPr>
+          <w:rFonts w:ascii="Calibri" w:cs="Calibri" w:eastAsia="Calibri" w:hAnsi="Calibri"/>
+          <w:b/>
+          <w:bCs/>
+          <w:sz w:val="22"/>
+          <w:szCs w:val="22"/>
+        </w:rPr>
+        <w:t xml:space="preserve">Remédiation</w:t>
+      </w:r>
+      <w:r>
+        <w:rPr>
+          <w:rFonts w:ascii="Calibri" w:cs="Calibri" w:eastAsia="Calibri" w:hAnsi="Calibri"/>
+          <w:sz w:val="22"/>
+          <w:szCs w:val="22"/>
+        </w:rPr>
+        <w:t xml:space="preserve"> : faire traduire le message par le stagiaire — c'est du B1, et c'est une compétence transversale du REAC. Puis faire tracer au tableau la chaîne d'appel : </w:t>
+      </w:r>
+      <w:r>
+        <w:rPr>
+          <w:rFonts w:ascii="Consolas" w:cs="Consolas" w:eastAsia="Consolas" w:hAnsi="Consolas"/>
+          <w:sz w:val="20"/>
+          <w:szCs w:val="20"/>
+          <w:shd w:fill="ECECEC" w:val="clear"/>
+        </w:rPr>
+        <w:t xml:space="preserve">new Dvd()</w:t>
+      </w:r>
+      <w:r>
+        <w:rPr>
+          <w:rFonts w:ascii="Calibri" w:cs="Calibri" w:eastAsia="Calibri" w:hAnsi="Calibri"/>
+          <w:sz w:val="22"/>
+          <w:szCs w:val="22"/>
+        </w:rPr>
+        <w:t xml:space="preserve"> → constructeur de Dvd → *doit appeler* → constructeur de Document.</w:t>
+      </w:r>
+    </w:p>
+    <w:p>
+      <w:pPr>
+        <w:pStyle w:val="Heading3"/>
+        <w:spacing w:after="100" w:before="180"/>
+      </w:pPr>
+      <w:r>
+        <w:rPr>
+          <w:rFonts w:ascii="Calibri" w:cs="Calibri" w:eastAsia="Calibri" w:hAnsi="Calibri"/>
+          <w:b/>
+          <w:bCs/>
+          <w:color w:val="444444"/>
+          <w:sz w:val="22"/>
+          <w:szCs w:val="22"/>
+        </w:rPr>
+        <w:t xml:space="preserve">Propriétés du parent en `private`</w:t>
+      </w:r>
+    </w:p>
+    <w:p>
+      <w:pPr>
+        <w:spacing w:after="120"/>
+      </w:pPr>
+      <w:r>
+        <w:rPr>
+          <w:rFonts w:ascii="Calibri" w:cs="Calibri" w:eastAsia="Calibri" w:hAnsi="Calibri"/>
+          <w:sz w:val="22"/>
+          <w:szCs w:val="22"/>
+        </w:rPr>
+        <w:t xml:space="preserve">Le stagiaire recopie le réflexe « private par défaut » de l'étape 1 sur </w:t>
+      </w:r>
+      <w:r>
+        <w:rPr>
+          <w:rFonts w:ascii="Consolas" w:cs="Consolas" w:eastAsia="Consolas" w:hAnsi="Consolas"/>
+          <w:sz w:val="20"/>
+          <w:szCs w:val="20"/>
+          <w:shd w:fill="ECECEC" w:val="clear"/>
+        </w:rPr>
+        <w:t xml:space="preserve">Document</w:t>
+      </w:r>
+      <w:r>
+        <w:rPr>
+          <w:rFonts w:ascii="Calibri" w:cs="Calibri" w:eastAsia="Calibri" w:hAnsi="Calibri"/>
+          <w:sz w:val="22"/>
+          <w:szCs w:val="22"/>
+        </w:rPr>
+        <w:t xml:space="preserve">, puis ne comprend pas pourquoi </w:t>
+      </w:r>
+      <w:r>
+        <w:rPr>
+          <w:rFonts w:ascii="Consolas" w:cs="Consolas" w:eastAsia="Consolas" w:hAnsi="Consolas"/>
+          <w:sz w:val="20"/>
+          <w:szCs w:val="20"/>
+          <w:shd w:fill="ECECEC" w:val="clear"/>
+        </w:rPr>
+        <w:t xml:space="preserve">$this-&gt;titre</w:t>
+      </w:r>
+      <w:r>
+        <w:rPr>
+          <w:rFonts w:ascii="Calibri" w:cs="Calibri" w:eastAsia="Calibri" w:hAnsi="Calibri"/>
+          <w:sz w:val="22"/>
+          <w:szCs w:val="22"/>
+        </w:rPr>
+        <w:t xml:space="preserve"> est inaccessible dans </w:t>
+      </w:r>
+      <w:r>
+        <w:rPr>
+          <w:rFonts w:ascii="Consolas" w:cs="Consolas" w:eastAsia="Consolas" w:hAnsi="Consolas"/>
+          <w:sz w:val="20"/>
+          <w:szCs w:val="20"/>
+          <w:shd w:fill="ECECEC" w:val="clear"/>
+        </w:rPr>
+        <w:t xml:space="preserve">Dvd</w:t>
+      </w:r>
+      <w:r>
+        <w:rPr>
+          <w:rFonts w:ascii="Calibri" w:cs="Calibri" w:eastAsia="Calibri" w:hAnsi="Calibri"/>
+          <w:sz w:val="22"/>
+          <w:szCs w:val="22"/>
+        </w:rPr>
+        <w:t xml:space="preserve">.</w:t>
+      </w:r>
+    </w:p>
+    <w:p>
+      <w:pPr>
+        <w:spacing w:after="120"/>
+      </w:pPr>
+      <w:r>
+        <w:rPr>
+          <w:rFonts w:ascii="Calibri" w:cs="Calibri" w:eastAsia="Calibri" w:hAnsi="Calibri"/>
+          <w:b/>
+          <w:bCs/>
+          <w:sz w:val="22"/>
+          <w:szCs w:val="22"/>
+        </w:rPr>
+        <w:t xml:space="preserve">C'est une erreur pédagogiquement précieuse</w:t>
+      </w:r>
+      <w:r>
+        <w:rPr>
+          <w:rFonts w:ascii="Calibri" w:cs="Calibri" w:eastAsia="Calibri" w:hAnsi="Calibri"/>
+          <w:sz w:val="22"/>
+          <w:szCs w:val="22"/>
+        </w:rPr>
+        <w:t xml:space="preserve"> : elle donne le sens exact de </w:t>
+      </w:r>
+      <w:r>
+        <w:rPr>
+          <w:rFonts w:ascii="Consolas" w:cs="Consolas" w:eastAsia="Consolas" w:hAnsi="Consolas"/>
+          <w:sz w:val="20"/>
+          <w:szCs w:val="20"/>
+          <w:shd w:fill="ECECEC" w:val="clear"/>
+        </w:rPr>
+        <w:t xml:space="preserve">protected</w:t>
+      </w:r>
+      <w:r>
+        <w:rPr>
+          <w:rFonts w:ascii="Calibri" w:cs="Calibri" w:eastAsia="Calibri" w:hAnsi="Calibri"/>
+          <w:sz w:val="22"/>
+          <w:szCs w:val="22"/>
+        </w:rPr>
+        <w:t xml:space="preserve">, qu'un exposé théorique ne transmet jamais aussi bien. Laissez-la se produire, ne prévenez pas en amont.</w:t>
+      </w:r>
+    </w:p>
+    <w:p>
+      <w:pPr>
+        <w:pStyle w:val="Heading3"/>
+        <w:spacing w:after="100" w:before="180"/>
+      </w:pPr>
+      <w:r>
+        <w:rPr>
+          <w:rFonts w:ascii="Calibri" w:cs="Calibri" w:eastAsia="Calibri" w:hAnsi="Calibri"/>
+          <w:b/>
+          <w:bCs/>
+          <w:color w:val="444444"/>
+          <w:sz w:val="22"/>
+          <w:szCs w:val="22"/>
+        </w:rPr>
+        <w:t xml:space="preserve">Redéclaration des propriétés du parent</w:t>
+      </w:r>
+    </w:p>
+    <w:p>
+      <w:pPr>
+        <w:shd w:fill="F5F5F5" w:val="clear"/>
+        <w:spacing w:after="0"/>
+        <w:ind w:left="240"/>
+      </w:pPr>
+      <w:r>
+        <w:rPr>
+          <w:rFonts w:ascii="Consolas" w:cs="Consolas" w:eastAsia="Consolas" w:hAnsi="Consolas"/>
+          <w:sz w:val="18"/>
+          <w:szCs w:val="18"/>
+        </w:rPr>
+        <w:t xml:space="preserve">class Dvd extends Document</w:t>
+      </w:r>
+    </w:p>
+    <w:p>
+      <w:pPr>
+        <w:shd w:fill="F5F5F5" w:val="clear"/>
+        <w:spacing w:after="0"/>
+        <w:ind w:left="240"/>
+      </w:pPr>
+      <w:r>
+        <w:rPr>
+          <w:rFonts w:ascii="Consolas" w:cs="Consolas" w:eastAsia="Consolas" w:hAnsi="Consolas"/>
+          <w:sz w:val="18"/>
+          <w:szCs w:val="18"/>
+        </w:rPr>
+        <w:t xml:space="preserve">{</w:t>
+      </w:r>
+    </w:p>
+    <w:p>
+      <w:pPr>
+        <w:shd w:fill="F5F5F5" w:val="clear"/>
+        <w:spacing w:after="0"/>
+        <w:ind w:left="240"/>
+      </w:pPr>
+      <w:r>
+        <w:rPr>
+          <w:rFonts w:ascii="Consolas" w:cs="Consolas" w:eastAsia="Consolas" w:hAnsi="Consolas"/>
+          <w:sz w:val="18"/>
+          <w:szCs w:val="18"/>
+        </w:rPr>
+        <w:t xml:space="preserve">    protected string $titre;   // FAUX — déjà déclarée dans Document</w:t>
+      </w:r>
+    </w:p>
+    <w:p>
+      <w:pPr>
+        <w:shd w:fill="F5F5F5" w:val="clear"/>
+        <w:spacing w:after="0"/>
+        <w:ind w:left="240"/>
+      </w:pPr>
+      <w:r>
+        <w:rPr>
+          <w:rFonts w:ascii="Consolas" w:cs="Consolas" w:eastAsia="Consolas" w:hAnsi="Consolas"/>
+          <w:sz w:val="18"/>
+          <w:szCs w:val="18"/>
+        </w:rPr>
+        <w:t xml:space="preserve">    private string $realisateur;</w:t>
+      </w:r>
+    </w:p>
+    <w:p>
+      <w:pPr>
+        <w:shd w:fill="F5F5F5" w:val="clear"/>
+        <w:spacing w:after="160"/>
+        <w:ind w:left="240"/>
+      </w:pPr>
+      <w:r>
+        <w:rPr>
+          <w:rFonts w:ascii="Consolas" w:cs="Consolas" w:eastAsia="Consolas" w:hAnsi="Consolas"/>
+          <w:sz w:val="18"/>
+          <w:szCs w:val="18"/>
+        </w:rPr>
+        <w:t xml:space="preserve">}</w:t>
+      </w:r>
+    </w:p>
+    <w:p>
+      <w:pPr>
+        <w:spacing w:after="120"/>
+      </w:pPr>
+      <w:r>
+        <w:rPr>
+          <w:rFonts w:ascii="Calibri" w:cs="Calibri" w:eastAsia="Calibri" w:hAnsi="Calibri"/>
+          <w:sz w:val="22"/>
+          <w:szCs w:val="22"/>
+        </w:rPr>
+        <w:t xml:space="preserve">Ne produit pas toujours d'erreur, mais casse la logique de factorisation. </w:t>
+      </w:r>
+      <w:r>
+        <w:rPr>
+          <w:rFonts w:ascii="Calibri" w:cs="Calibri" w:eastAsia="Calibri" w:hAnsi="Calibri"/>
+          <w:b/>
+          <w:bCs/>
+          <w:sz w:val="22"/>
+          <w:szCs w:val="22"/>
+        </w:rPr>
+        <w:t xml:space="preserve">Question à poser</w:t>
+      </w:r>
+      <w:r>
+        <w:rPr>
+          <w:rFonts w:ascii="Calibri" w:cs="Calibri" w:eastAsia="Calibri" w:hAnsi="Calibri"/>
+          <w:sz w:val="22"/>
+          <w:szCs w:val="22"/>
+        </w:rPr>
+        <w:t xml:space="preserve"> : « Si tu redéclares le titre ici, à quoi sert l'héritage ? »</w:t>
+      </w:r>
+    </w:p>
+    <w:p>
+      <w:pPr>
+        <w:pStyle w:val="Heading3"/>
+        <w:spacing w:after="100" w:before="180"/>
+      </w:pPr>
+      <w:r>
+        <w:rPr>
+          <w:rFonts w:ascii="Calibri" w:cs="Calibri" w:eastAsia="Calibri" w:hAnsi="Calibri"/>
+          <w:b/>
+          <w:bCs/>
+          <w:color w:val="444444"/>
+          <w:sz w:val="22"/>
+          <w:szCs w:val="22"/>
+        </w:rPr>
+        <w:t xml:space="preserve">Confusion `implements` / `extends`</w:t>
+      </w:r>
+    </w:p>
+    <w:p>
+      <w:pPr>
+        <w:spacing w:after="120"/>
+      </w:pPr>
+      <w:r>
+        <w:rPr>
+          <w:rFonts w:ascii="Calibri" w:cs="Calibri" w:eastAsia="Calibri" w:hAnsi="Calibri"/>
+          <w:sz w:val="22"/>
+          <w:szCs w:val="22"/>
+        </w:rPr>
+        <w:t xml:space="preserve">Écrire </w:t>
+      </w:r>
+      <w:r>
+        <w:rPr>
+          <w:rFonts w:ascii="Consolas" w:cs="Consolas" w:eastAsia="Consolas" w:hAnsi="Consolas"/>
+          <w:sz w:val="20"/>
+          <w:szCs w:val="20"/>
+          <w:shd w:fill="ECECEC" w:val="clear"/>
+        </w:rPr>
+        <w:t xml:space="preserve">class Dvd extends Document, Empruntable</w:t>
+      </w:r>
+      <w:r>
+        <w:rPr>
+          <w:rFonts w:ascii="Calibri" w:cs="Calibri" w:eastAsia="Calibri" w:hAnsi="Calibri"/>
+          <w:sz w:val="22"/>
+          <w:szCs w:val="22"/>
+        </w:rPr>
+        <w:t xml:space="preserve"> — erreur de syntaxe immédiate. Bon moment pour marteler la règle : </w:t>
+      </w:r>
+      <w:r>
+        <w:rPr>
+          <w:rFonts w:ascii="Calibri" w:cs="Calibri" w:eastAsia="Calibri" w:hAnsi="Calibri"/>
+          <w:b/>
+          <w:bCs/>
+          <w:sz w:val="22"/>
+          <w:szCs w:val="22"/>
+        </w:rPr>
+        <w:t xml:space="preserve">un seul `extends`, autant d'`implements` que voulu</w:t>
+      </w:r>
+      <w:r>
+        <w:rPr>
+          <w:rFonts w:ascii="Calibri" w:cs="Calibri" w:eastAsia="Calibri" w:hAnsi="Calibri"/>
+          <w:sz w:val="22"/>
+          <w:szCs w:val="22"/>
+        </w:rPr>
+        <w:t xml:space="preserve">, et dans cet ordre.</w:t>
+      </w:r>
+    </w:p>
+    <w:p>
+      <w:pPr>
+        <w:pStyle w:val="Heading3"/>
+        <w:spacing w:after="100" w:before="180"/>
+      </w:pPr>
+      <w:r>
+        <w:rPr>
+          <w:rFonts w:ascii="Calibri" w:cs="Calibri" w:eastAsia="Calibri" w:hAnsi="Calibri"/>
+          <w:b/>
+          <w:bCs/>
+          <w:color w:val="444444"/>
+          <w:sz w:val="22"/>
+          <w:szCs w:val="22"/>
+        </w:rPr>
+        <w:t xml:space="preserve">Interface implémentée à moitié</w:t>
+      </w:r>
+    </w:p>
+    <w:p>
+      <w:pPr>
+        <w:spacing w:after="120"/>
+      </w:pPr>
+      <w:r>
+        <w:rPr>
+          <w:rFonts w:ascii="Calibri" w:cs="Calibri" w:eastAsia="Calibri" w:hAnsi="Calibri"/>
+          <w:sz w:val="22"/>
+          <w:szCs w:val="22"/>
+        </w:rPr>
+        <w:t xml:space="preserve">Le stagiaire écrit </w:t>
+      </w:r>
+      <w:r>
+        <w:rPr>
+          <w:rFonts w:ascii="Consolas" w:cs="Consolas" w:eastAsia="Consolas" w:hAnsi="Consolas"/>
+          <w:sz w:val="20"/>
+          <w:szCs w:val="20"/>
+          <w:shd w:fill="ECECEC" w:val="clear"/>
+        </w:rPr>
+        <w:t xml:space="preserve">implements Empruntable</w:t>
+      </w:r>
+      <w:r>
+        <w:rPr>
+          <w:rFonts w:ascii="Calibri" w:cs="Calibri" w:eastAsia="Calibri" w:hAnsi="Calibri"/>
+          <w:sz w:val="22"/>
+          <w:szCs w:val="22"/>
+        </w:rPr>
+        <w:t xml:space="preserve"> mais n'implémente que </w:t>
+      </w:r>
+      <w:r>
+        <w:rPr>
+          <w:rFonts w:ascii="Consolas" w:cs="Consolas" w:eastAsia="Consolas" w:hAnsi="Consolas"/>
+          <w:sz w:val="20"/>
+          <w:szCs w:val="20"/>
+          <w:shd w:fill="ECECEC" w:val="clear"/>
+        </w:rPr>
+        <w:t xml:space="preserve">emprunter()</w:t>
+      </w:r>
+      <w:r>
+        <w:rPr>
+          <w:rFonts w:ascii="Calibri" w:cs="Calibri" w:eastAsia="Calibri" w:hAnsi="Calibri"/>
+          <w:sz w:val="22"/>
+          <w:szCs w:val="22"/>
+        </w:rPr>
+        <w:t xml:space="preserve">. PHP refuse de charger la classe : *Class Dvd contains 1 abstract method...*</w:t>
+      </w:r>
+    </w:p>
+    <w:p>
+      <w:pPr>
+        <w:spacing w:after="120"/>
+      </w:pPr>
+      <w:r>
+        <w:rPr>
+          <w:rFonts w:ascii="Calibri" w:cs="Calibri" w:eastAsia="Calibri" w:hAnsi="Calibri"/>
+          <w:b/>
+          <w:bCs/>
+          <w:sz w:val="22"/>
+          <w:szCs w:val="22"/>
+        </w:rPr>
+        <w:t xml:space="preserve">Exploitez ce message</w:t>
+      </w:r>
+      <w:r>
+        <w:rPr>
+          <w:rFonts w:ascii="Calibri" w:cs="Calibri" w:eastAsia="Calibri" w:hAnsi="Calibri"/>
+          <w:sz w:val="22"/>
+          <w:szCs w:val="22"/>
+        </w:rPr>
+        <w:t xml:space="preserve"> : c'est la démonstration en direct de ce qu'est un contrat. PHP a vérifié l'engagement et l'a fait respecter. Aucun exposé ne vaut cette erreur vécue.</w:t>
       </w:r>
     </w:p>
     <w:p>
@@ -3069,7 +3618,131 @@
           <w:sz w:val="25"/>
           <w:szCs w:val="25"/>
         </w:rPr>
-        <w:t xml:space="preserve">4.3 Critères de validation — niveau 2</w:t>
+        <w:t xml:space="preserve">4.3 Le moment clé de la journée</w:t>
+      </w:r>
+    </w:p>
+    <w:p>
+      <w:pPr>
+        <w:spacing w:after="120"/>
+      </w:pPr>
+      <w:r>
+        <w:rPr>
+          <w:rFonts w:ascii="Calibri" w:cs="Calibri" w:eastAsia="Calibri" w:hAnsi="Calibri"/>
+          <w:sz w:val="22"/>
+          <w:szCs w:val="22"/>
+        </w:rPr>
+        <w:t xml:space="preserve">Le bloc de test qui affiche 6 documents de 3 types via une seule boucle est </w:t>
+      </w:r>
+      <w:r>
+        <w:rPr>
+          <w:rFonts w:ascii="Calibri" w:cs="Calibri" w:eastAsia="Calibri" w:hAnsi="Calibri"/>
+          <w:b/>
+          <w:bCs/>
+          <w:sz w:val="22"/>
+          <w:szCs w:val="22"/>
+        </w:rPr>
+        <w:t xml:space="preserve">le point de bascule pédagogique de la journée</w:t>
+      </w:r>
+      <w:r>
+        <w:rPr>
+          <w:rFonts w:ascii="Calibri" w:cs="Calibri" w:eastAsia="Calibri" w:hAnsi="Calibri"/>
+          <w:sz w:val="22"/>
+          <w:szCs w:val="22"/>
+        </w:rPr>
+        <w:t xml:space="preserve">. Ne le laissez pas passer dans le flux.</w:t>
+      </w:r>
+    </w:p>
+    <w:p>
+      <w:pPr>
+        <w:spacing w:after="120"/>
+      </w:pPr>
+      <w:r>
+        <w:rPr>
+          <w:rFonts w:ascii="Calibri" w:cs="Calibri" w:eastAsia="Calibri" w:hAnsi="Calibri"/>
+          <w:sz w:val="22"/>
+          <w:szCs w:val="22"/>
+        </w:rPr>
+        <w:t xml:space="preserve">Conduite recommandée : dès que trois ou quatre stagiaires y arrivent, arrêtez la salle 3 minutes, projetez la boucle et posez la question :</w:t>
+      </w:r>
+    </w:p>
+    <w:p>
+      <w:pPr>
+        <w:spacing w:after="120"/>
+      </w:pPr>
+      <w:r>
+        <w:rPr>
+          <w:rFonts w:ascii="Calibri" w:cs="Calibri" w:eastAsia="Calibri" w:hAnsi="Calibri"/>
+          <w:i/>
+          <w:iCs/>
+          <w:sz w:val="22"/>
+          <w:szCs w:val="22"/>
+        </w:rPr>
+        <w:t xml:space="preserve">« Il y a une seule ligne d'affichage. Comment PHP peut-il produire trois formats différents ? »</w:t>
+      </w:r>
+    </w:p>
+    <w:p>
+      <w:pPr>
+        <w:spacing w:after="120"/>
+      </w:pPr>
+      <w:r>
+        <w:rPr>
+          <w:rFonts w:ascii="Calibri" w:cs="Calibri" w:eastAsia="Calibri" w:hAnsi="Calibri"/>
+          <w:sz w:val="22"/>
+          <w:szCs w:val="22"/>
+        </w:rPr>
+        <w:t xml:space="preserve">Laissez le silence. Quelqu'un formulera le mécanisme. C'est le mot </w:t>
+      </w:r>
+      <w:r>
+        <w:rPr>
+          <w:rFonts w:ascii="Calibri" w:cs="Calibri" w:eastAsia="Calibri" w:hAnsi="Calibri"/>
+          <w:b/>
+          <w:bCs/>
+          <w:sz w:val="22"/>
+          <w:szCs w:val="22"/>
+        </w:rPr>
+        <w:t xml:space="preserve">polymorphisme</w:t>
+      </w:r>
+      <w:r>
+        <w:rPr>
+          <w:rFonts w:ascii="Calibri" w:cs="Calibri" w:eastAsia="Calibri" w:hAnsi="Calibri"/>
+          <w:sz w:val="22"/>
+          <w:szCs w:val="22"/>
+        </w:rPr>
+        <w:t xml:space="preserve"> qui doit sortir de la salle, pas de vous.</w:t>
+      </w:r>
+    </w:p>
+    <w:p>
+      <w:pPr>
+        <w:pStyle w:val="Heading2"/>
+        <w:spacing w:after="120" w:before="240"/>
+      </w:pPr>
+      <w:r>
+        <w:rPr>
+          <w:rFonts w:ascii="Calibri" w:cs="Calibri" w:eastAsia="Calibri" w:hAnsi="Calibri"/>
+          <w:b/>
+          <w:bCs/>
+          <w:color w:val="1F4E79"/>
+          <w:sz w:val="25"/>
+          <w:szCs w:val="25"/>
+        </w:rPr>
+        <w:t xml:space="preserve">4.4 Critères de validation</w:t>
+      </w:r>
+    </w:p>
+    <w:p>
+      <w:pPr>
+        <w:pStyle w:val="Heading3"/>
+        <w:spacing w:after="100" w:before="180"/>
+      </w:pPr>
+      <w:r>
+        <w:rPr>
+          <w:rFonts w:ascii="Calibri" w:cs="Calibri" w:eastAsia="Calibri" w:hAnsi="Calibri"/>
+          <w:b/>
+          <w:bCs/>
+          <w:color w:val="444444"/>
+          <w:sz w:val="22"/>
+          <w:szCs w:val="22"/>
+        </w:rPr>
+        <w:t xml:space="preserve">Niveau 1 — la migration de Livre</w:t>
       </w:r>
     </w:p>
     <w:tbl>
@@ -3282,7 +3955,7 @@
                 <w:sz w:val="22"/>
                 <w:szCs w:val="22"/>
               </w:rPr>
-              <w:t xml:space="preserve">Héritage</w:t>
+              <w:t xml:space="preserve">Déclaration abstraite</w:t>
             </w:r>
           </w:p>
         </w:tc>
@@ -3307,15 +3980,15 @@
                 <w:szCs w:val="20"/>
                 <w:shd w:fill="ECECEC" w:val="clear"/>
               </w:rPr>
-              <w:t xml:space="preserve">parent::__construct()</w:t>
-            </w:r>
-            <w:r>
-              <w:rPr>
-                <w:rFonts w:ascii="Calibri" w:cs="Calibri" w:eastAsia="Calibri" w:hAnsi="Calibri"/>
-                <w:sz w:val="22"/>
-                <w:szCs w:val="22"/>
-              </w:rPr>
-              <w:t xml:space="preserve"> présent dans les 3 filles</w:t>
+              <w:t xml:space="preserve">getDescription()</w:t>
+            </w:r>
+            <w:r>
+              <w:rPr>
+                <w:rFonts w:ascii="Calibri" w:cs="Calibri" w:eastAsia="Calibri" w:hAnsi="Calibri"/>
+                <w:sz w:val="22"/>
+                <w:szCs w:val="22"/>
+              </w:rPr>
+              <w:t xml:space="preserve"> déclarée sans corps dans le parent</w:t>
             </w:r>
           </w:p>
         </w:tc>
@@ -3365,7 +4038,7 @@
                 <w:sz w:val="22"/>
                 <w:szCs w:val="22"/>
               </w:rPr>
-              <w:t xml:space="preserve">Visibilité</w:t>
+              <w:t xml:space="preserve">Interface</w:t>
             </w:r>
           </w:p>
         </w:tc>
@@ -3383,14 +4056,6 @@
             <w:pPr>
               <w:spacing w:after="0"/>
             </w:pPr>
-            <w:r>
-              <w:rPr>
-                <w:rFonts w:ascii="Calibri" w:cs="Calibri" w:eastAsia="Calibri" w:hAnsi="Calibri"/>
-                <w:sz w:val="22"/>
-                <w:szCs w:val="22"/>
-              </w:rPr>
-              <w:t xml:space="preserve">Propriétés du parent en </w:t>
-            </w:r>
             <w:r>
               <w:rPr>
                 <w:rFonts w:ascii="Consolas" w:cs="Consolas" w:eastAsia="Consolas" w:hAnsi="Consolas"/>
@@ -3398,7 +4063,41 @@
                 <w:szCs w:val="20"/>
                 <w:shd w:fill="ECECEC" w:val="clear"/>
               </w:rPr>
-              <w:t xml:space="preserve">protected</w:t>
+              <w:t xml:space="preserve">emprunter()</w:t>
+            </w:r>
+            <w:r>
+              <w:rPr>
+                <w:rFonts w:ascii="Calibri" w:cs="Calibri" w:eastAsia="Calibri" w:hAnsi="Calibri"/>
+                <w:sz w:val="22"/>
+                <w:szCs w:val="22"/>
+              </w:rPr>
+              <w:t xml:space="preserve"> et </w:t>
+            </w:r>
+            <w:r>
+              <w:rPr>
+                <w:rFonts w:ascii="Consolas" w:cs="Consolas" w:eastAsia="Consolas" w:hAnsi="Consolas"/>
+                <w:sz w:val="20"/>
+                <w:szCs w:val="20"/>
+                <w:shd w:fill="ECECEC" w:val="clear"/>
+              </w:rPr>
+              <w:t xml:space="preserve">rendre()</w:t>
+            </w:r>
+            <w:r>
+              <w:rPr>
+                <w:rFonts w:ascii="Calibri" w:cs="Calibri" w:eastAsia="Calibri" w:hAnsi="Calibri"/>
+                <w:sz w:val="22"/>
+                <w:szCs w:val="22"/>
+              </w:rPr>
+              <w:t xml:space="preserve"> déclarées dans </w:t>
+            </w:r>
+            <w:r>
+              <w:rPr>
+                <w:rFonts w:ascii="Consolas" w:cs="Consolas" w:eastAsia="Consolas" w:hAnsi="Consolas"/>
+                <w:sz w:val="20"/>
+                <w:szCs w:val="20"/>
+                <w:shd w:fill="ECECEC" w:val="clear"/>
+              </w:rPr>
+              <w:t xml:space="preserve">Empruntable</w:t>
             </w:r>
           </w:p>
         </w:tc>
@@ -3448,6 +4147,207 @@
                 <w:sz w:val="22"/>
                 <w:szCs w:val="22"/>
               </w:rPr>
+              <w:t xml:space="preserve">Factorisation</w:t>
+            </w:r>
+          </w:p>
+        </w:tc>
+        <w:tc>
+          <w:tcPr>
+            <w:tcW w:type="dxa" w:w="3900"/>
+            <w:tcMar>
+              <w:top w:type="dxa" w:w="60"/>
+              <w:left w:type="dxa" w:w="100"/>
+              <w:bottom w:type="dxa" w:w="60"/>
+              <w:right w:type="dxa" w:w="100"/>
+            </w:tcMar>
+          </w:tcPr>
+          <w:p>
+            <w:pPr>
+              <w:spacing w:after="0"/>
+            </w:pPr>
+            <w:r>
+              <w:rPr>
+                <w:rFonts w:ascii="Consolas" w:cs="Consolas" w:eastAsia="Consolas" w:hAnsi="Consolas"/>
+                <w:sz w:val="20"/>
+                <w:szCs w:val="20"/>
+                <w:shd w:fill="ECECEC" w:val="clear"/>
+              </w:rPr>
+              <w:t xml:space="preserve">getTitre()</w:t>
+            </w:r>
+            <w:r>
+              <w:rPr>
+                <w:rFonts w:ascii="Calibri" w:cs="Calibri" w:eastAsia="Calibri" w:hAnsi="Calibri"/>
+                <w:sz w:val="22"/>
+                <w:szCs w:val="22"/>
+              </w:rPr>
+              <w:t xml:space="preserve"> et </w:t>
+            </w:r>
+            <w:r>
+              <w:rPr>
+                <w:rFonts w:ascii="Consolas" w:cs="Consolas" w:eastAsia="Consolas" w:hAnsi="Consolas"/>
+                <w:sz w:val="20"/>
+                <w:szCs w:val="20"/>
+                <w:shd w:fill="ECECEC" w:val="clear"/>
+              </w:rPr>
+              <w:t xml:space="preserve">getAnnee()</w:t>
+            </w:r>
+            <w:r>
+              <w:rPr>
+                <w:rFonts w:ascii="Calibri" w:cs="Calibri" w:eastAsia="Calibri" w:hAnsi="Calibri"/>
+                <w:sz w:val="22"/>
+                <w:szCs w:val="22"/>
+              </w:rPr>
+              <w:t xml:space="preserve"> absentes de </w:t>
+            </w:r>
+            <w:r>
+              <w:rPr>
+                <w:rFonts w:ascii="Consolas" w:cs="Consolas" w:eastAsia="Consolas" w:hAnsi="Consolas"/>
+                <w:sz w:val="20"/>
+                <w:szCs w:val="20"/>
+                <w:shd w:fill="ECECEC" w:val="clear"/>
+              </w:rPr>
+              <w:t xml:space="preserve">Livre</w:t>
+            </w:r>
+          </w:p>
+        </w:tc>
+        <w:tc>
+          <w:tcPr>
+            <w:tcW w:type="dxa" w:w="3500"/>
+            <w:tcMar>
+              <w:top w:type="dxa" w:w="60"/>
+              <w:left w:type="dxa" w:w="100"/>
+              <w:bottom w:type="dxa" w:w="60"/>
+              <w:right w:type="dxa" w:w="100"/>
+            </w:tcMar>
+          </w:tcPr>
+          <w:p>
+            <w:pPr>
+              <w:spacing w:after="0"/>
+            </w:pPr>
+            <w:r>
+              <w:rPr>
+                <w:rFonts w:ascii="Calibri" w:cs="Calibri" w:eastAsia="Calibri" w:hAnsi="Calibri"/>
+                <w:sz w:val="22"/>
+                <w:szCs w:val="22"/>
+              </w:rPr>
+              <w:t xml:space="preserve">CP7 — bonnes pratiques POO</w:t>
+            </w:r>
+          </w:p>
+        </w:tc>
+      </w:tr>
+      <w:tr>
+        <w:tc>
+          <w:tcPr>
+            <w:tcW w:type="dxa" w:w="2200"/>
+            <w:tcMar>
+              <w:top w:type="dxa" w:w="60"/>
+              <w:left w:type="dxa" w:w="100"/>
+              <w:bottom w:type="dxa" w:w="60"/>
+              <w:right w:type="dxa" w:w="100"/>
+            </w:tcMar>
+          </w:tcPr>
+          <w:p>
+            <w:pPr>
+              <w:spacing w:after="0"/>
+            </w:pPr>
+            <w:r>
+              <w:rPr>
+                <w:rFonts w:ascii="Calibri" w:cs="Calibri" w:eastAsia="Calibri" w:hAnsi="Calibri"/>
+                <w:sz w:val="22"/>
+                <w:szCs w:val="22"/>
+              </w:rPr>
+              <w:t xml:space="preserve">Délégation</w:t>
+            </w:r>
+          </w:p>
+        </w:tc>
+        <w:tc>
+          <w:tcPr>
+            <w:tcW w:type="dxa" w:w="3900"/>
+            <w:tcMar>
+              <w:top w:type="dxa" w:w="60"/>
+              <w:left w:type="dxa" w:w="100"/>
+              <w:bottom w:type="dxa" w:w="60"/>
+              <w:right w:type="dxa" w:w="100"/>
+            </w:tcMar>
+          </w:tcPr>
+          <w:p>
+            <w:pPr>
+              <w:spacing w:after="0"/>
+            </w:pPr>
+            <w:r>
+              <w:rPr>
+                <w:rFonts w:ascii="Consolas" w:cs="Consolas" w:eastAsia="Consolas" w:hAnsi="Consolas"/>
+                <w:sz w:val="20"/>
+                <w:szCs w:val="20"/>
+                <w:shd w:fill="ECECEC" w:val="clear"/>
+              </w:rPr>
+              <w:t xml:space="preserve">parent::__construct()</w:t>
+            </w:r>
+            <w:r>
+              <w:rPr>
+                <w:rFonts w:ascii="Calibri" w:cs="Calibri" w:eastAsia="Calibri" w:hAnsi="Calibri"/>
+                <w:sz w:val="22"/>
+                <w:szCs w:val="22"/>
+              </w:rPr>
+              <w:t xml:space="preserve"> présent dans </w:t>
+            </w:r>
+            <w:r>
+              <w:rPr>
+                <w:rFonts w:ascii="Consolas" w:cs="Consolas" w:eastAsia="Consolas" w:hAnsi="Consolas"/>
+                <w:sz w:val="20"/>
+                <w:szCs w:val="20"/>
+                <w:shd w:fill="ECECEC" w:val="clear"/>
+              </w:rPr>
+              <w:t xml:space="preserve">Livre</w:t>
+            </w:r>
+          </w:p>
+        </w:tc>
+        <w:tc>
+          <w:tcPr>
+            <w:tcW w:type="dxa" w:w="3500"/>
+            <w:tcMar>
+              <w:top w:type="dxa" w:w="60"/>
+              <w:left w:type="dxa" w:w="100"/>
+              <w:bottom w:type="dxa" w:w="60"/>
+              <w:right w:type="dxa" w:w="100"/>
+            </w:tcMar>
+          </w:tcPr>
+          <w:p>
+            <w:pPr>
+              <w:spacing w:after="0"/>
+            </w:pPr>
+            <w:r>
+              <w:rPr>
+                <w:rFonts w:ascii="Calibri" w:cs="Calibri" w:eastAsia="Calibri" w:hAnsi="Calibri"/>
+                <w:sz w:val="22"/>
+                <w:szCs w:val="22"/>
+              </w:rPr>
+              <w:t xml:space="preserve">CP7 — bonnes pratiques POO</w:t>
+            </w:r>
+          </w:p>
+        </w:tc>
+      </w:tr>
+      <w:tr>
+        <w:tc>
+          <w:tcPr>
+            <w:tcW w:type="dxa" w:w="2200"/>
+            <w:tcMar>
+              <w:top w:type="dxa" w:w="60"/>
+              <w:left w:type="dxa" w:w="100"/>
+              <w:bottom w:type="dxa" w:w="60"/>
+              <w:right w:type="dxa" w:w="100"/>
+            </w:tcMar>
+          </w:tcPr>
+          <w:p>
+            <w:pPr>
+              <w:spacing w:after="0"/>
+            </w:pPr>
+            <w:r>
+              <w:rPr>
+                <w:rFonts w:ascii="Calibri" w:cs="Calibri" w:eastAsia="Calibri" w:hAnsi="Calibri"/>
+                <w:sz w:val="22"/>
+                <w:szCs w:val="22"/>
+              </w:rPr>
               <w:t xml:space="preserve">Contrat</w:t>
             </w:r>
           </w:p>
@@ -3468,11 +4368,389 @@
             </w:pPr>
             <w:r>
               <w:rPr>
-                <w:rFonts w:ascii="Calibri" w:cs="Calibri" w:eastAsia="Calibri" w:hAnsi="Calibri"/>
-                <w:sz w:val="22"/>
-                <w:szCs w:val="22"/>
-              </w:rPr>
-              <w:t xml:space="preserve">Les 3 classes passent le test </w:t>
+                <w:rFonts w:ascii="Consolas" w:cs="Consolas" w:eastAsia="Consolas" w:hAnsi="Consolas"/>
+                <w:sz w:val="20"/>
+                <w:szCs w:val="20"/>
+                <w:shd w:fill="ECECEC" w:val="clear"/>
+              </w:rPr>
+              <w:t xml:space="preserve">Livre</w:t>
+            </w:r>
+            <w:r>
+              <w:rPr>
+                <w:rFonts w:ascii="Calibri" w:cs="Calibri" w:eastAsia="Calibri" w:hAnsi="Calibri"/>
+                <w:sz w:val="22"/>
+                <w:szCs w:val="22"/>
+              </w:rPr>
+              <w:t xml:space="preserve"> passe les deux tests </w:t>
+            </w:r>
+            <w:r>
+              <w:rPr>
+                <w:rFonts w:ascii="Consolas" w:cs="Consolas" w:eastAsia="Consolas" w:hAnsi="Consolas"/>
+                <w:sz w:val="20"/>
+                <w:szCs w:val="20"/>
+                <w:shd w:fill="ECECEC" w:val="clear"/>
+              </w:rPr>
+              <w:t xml:space="preserve">instanceof</w:t>
+            </w:r>
+          </w:p>
+        </w:tc>
+        <w:tc>
+          <w:tcPr>
+            <w:tcW w:type="dxa" w:w="3500"/>
+            <w:tcMar>
+              <w:top w:type="dxa" w:w="60"/>
+              <w:left w:type="dxa" w:w="100"/>
+              <w:bottom w:type="dxa" w:w="60"/>
+              <w:right w:type="dxa" w:w="100"/>
+            </w:tcMar>
+          </w:tcPr>
+          <w:p>
+            <w:pPr>
+              <w:spacing w:after="0"/>
+            </w:pPr>
+            <w:r>
+              <w:rPr>
+                <w:rFonts w:ascii="Calibri" w:cs="Calibri" w:eastAsia="Calibri" w:hAnsi="Calibri"/>
+                <w:sz w:val="22"/>
+                <w:szCs w:val="22"/>
+              </w:rPr>
+              <w:t xml:space="preserve">CP7 — bonnes pratiques POO</w:t>
+            </w:r>
+          </w:p>
+        </w:tc>
+      </w:tr>
+    </w:tbl>
+    <w:p>
+      <w:pPr>
+        <w:spacing w:after="120"/>
+      </w:pPr>
+    </w:p>
+    <w:p>
+      <w:pPr>
+        <w:pStyle w:val="Heading3"/>
+        <w:spacing w:after="100" w:before="180"/>
+      </w:pPr>
+      <w:r>
+        <w:rPr>
+          <w:rFonts w:ascii="Calibri" w:cs="Calibri" w:eastAsia="Calibri" w:hAnsi="Calibri"/>
+          <w:b/>
+          <w:bCs/>
+          <w:color w:val="444444"/>
+          <w:sz w:val="22"/>
+          <w:szCs w:val="22"/>
+        </w:rPr>
+        <w:t xml:space="preserve">Niveau 2 — Dvd et JeuVideo</w:t>
+      </w:r>
+    </w:p>
+    <w:tbl>
+      <w:tblPr>
+        <w:tblW w:type="dxa" w:w="9600"/>
+        <w:tblBorders>
+          <w:top w:val="single" w:color="auto" w:sz="4"/>
+          <w:left w:val="single" w:color="auto" w:sz="4"/>
+          <w:bottom w:val="single" w:color="auto" w:sz="4"/>
+          <w:right w:val="single" w:color="auto" w:sz="4"/>
+          <w:insideH w:val="single" w:color="auto" w:sz="4"/>
+          <w:insideV w:val="single" w:color="auto" w:sz="4"/>
+        </w:tblBorders>
+      </w:tblPr>
+      <w:tblGrid>
+        <w:gridCol w:w="2200"/>
+        <w:gridCol w:w="3900"/>
+        <w:gridCol w:w="3500"/>
+      </w:tblGrid>
+      <w:tr>
+        <w:trPr>
+          <w:tblHeader/>
+        </w:trPr>
+        <w:tc>
+          <w:tcPr>
+            <w:tcW w:type="dxa" w:w="2200"/>
+            <w:shd w:fill="1F4E79" w:val="clear"/>
+            <w:tcMar>
+              <w:top w:type="dxa" w:w="60"/>
+              <w:left w:type="dxa" w:w="100"/>
+              <w:bottom w:type="dxa" w:w="60"/>
+              <w:right w:type="dxa" w:w="100"/>
+            </w:tcMar>
+          </w:tcPr>
+          <w:p>
+            <w:pPr>
+              <w:spacing w:after="0"/>
+            </w:pPr>
+            <w:r>
+              <w:rPr>
+                <w:rFonts w:ascii="Calibri" w:cs="Calibri" w:eastAsia="Calibri" w:hAnsi="Calibri"/>
+                <w:b/>
+                <w:bCs/>
+                <w:color w:val="FFFFFF"/>
+                <w:sz w:val="22"/>
+                <w:szCs w:val="22"/>
+              </w:rPr>
+              <w:t xml:space="preserve">Critère</w:t>
+            </w:r>
+          </w:p>
+        </w:tc>
+        <w:tc>
+          <w:tcPr>
+            <w:tcW w:type="dxa" w:w="3900"/>
+            <w:shd w:fill="1F4E79" w:val="clear"/>
+            <w:tcMar>
+              <w:top w:type="dxa" w:w="60"/>
+              <w:left w:type="dxa" w:w="100"/>
+              <w:bottom w:type="dxa" w:w="60"/>
+              <w:right w:type="dxa" w:w="100"/>
+            </w:tcMar>
+          </w:tcPr>
+          <w:p>
+            <w:pPr>
+              <w:spacing w:after="0"/>
+            </w:pPr>
+            <w:r>
+              <w:rPr>
+                <w:rFonts w:ascii="Calibri" w:cs="Calibri" w:eastAsia="Calibri" w:hAnsi="Calibri"/>
+                <w:b/>
+                <w:bCs/>
+                <w:color w:val="FFFFFF"/>
+                <w:sz w:val="22"/>
+                <w:szCs w:val="22"/>
+              </w:rPr>
+              <w:t xml:space="preserve">Acquis si</w:t>
+            </w:r>
+          </w:p>
+        </w:tc>
+        <w:tc>
+          <w:tcPr>
+            <w:tcW w:type="dxa" w:w="3500"/>
+            <w:shd w:fill="1F4E79" w:val="clear"/>
+            <w:tcMar>
+              <w:top w:type="dxa" w:w="60"/>
+              <w:left w:type="dxa" w:w="100"/>
+              <w:bottom w:type="dxa" w:w="60"/>
+              <w:right w:type="dxa" w:w="100"/>
+            </w:tcMar>
+          </w:tcPr>
+          <w:p>
+            <w:pPr>
+              <w:spacing w:after="0"/>
+            </w:pPr>
+            <w:r>
+              <w:rPr>
+                <w:rFonts w:ascii="Calibri" w:cs="Calibri" w:eastAsia="Calibri" w:hAnsi="Calibri"/>
+                <w:b/>
+                <w:bCs/>
+                <w:color w:val="FFFFFF"/>
+                <w:sz w:val="22"/>
+                <w:szCs w:val="22"/>
+              </w:rPr>
+              <w:t xml:space="preserve">REAC</w:t>
+            </w:r>
+          </w:p>
+        </w:tc>
+      </w:tr>
+      <w:tr>
+        <w:tc>
+          <w:tcPr>
+            <w:tcW w:type="dxa" w:w="2200"/>
+            <w:tcMar>
+              <w:top w:type="dxa" w:w="60"/>
+              <w:left w:type="dxa" w:w="100"/>
+              <w:bottom w:type="dxa" w:w="60"/>
+              <w:right w:type="dxa" w:w="100"/>
+            </w:tcMar>
+          </w:tcPr>
+          <w:p>
+            <w:pPr>
+              <w:spacing w:after="0"/>
+            </w:pPr>
+            <w:r>
+              <w:rPr>
+                <w:rFonts w:ascii="Calibri" w:cs="Calibri" w:eastAsia="Calibri" w:hAnsi="Calibri"/>
+                <w:sz w:val="22"/>
+                <w:szCs w:val="22"/>
+              </w:rPr>
+              <w:t xml:space="preserve">Héritage</w:t>
+            </w:r>
+          </w:p>
+        </w:tc>
+        <w:tc>
+          <w:tcPr>
+            <w:tcW w:type="dxa" w:w="3900"/>
+            <w:tcMar>
+              <w:top w:type="dxa" w:w="60"/>
+              <w:left w:type="dxa" w:w="100"/>
+              <w:bottom w:type="dxa" w:w="60"/>
+              <w:right w:type="dxa" w:w="100"/>
+            </w:tcMar>
+          </w:tcPr>
+          <w:p>
+            <w:pPr>
+              <w:spacing w:after="0"/>
+            </w:pPr>
+            <w:r>
+              <w:rPr>
+                <w:rFonts w:ascii="Consolas" w:cs="Consolas" w:eastAsia="Consolas" w:hAnsi="Consolas"/>
+                <w:sz w:val="20"/>
+                <w:szCs w:val="20"/>
+                <w:shd w:fill="ECECEC" w:val="clear"/>
+              </w:rPr>
+              <w:t xml:space="preserve">parent::__construct()</w:t>
+            </w:r>
+            <w:r>
+              <w:rPr>
+                <w:rFonts w:ascii="Calibri" w:cs="Calibri" w:eastAsia="Calibri" w:hAnsi="Calibri"/>
+                <w:sz w:val="22"/>
+                <w:szCs w:val="22"/>
+              </w:rPr>
+              <w:t xml:space="preserve"> présent dans les 3 filles</w:t>
+            </w:r>
+          </w:p>
+        </w:tc>
+        <w:tc>
+          <w:tcPr>
+            <w:tcW w:type="dxa" w:w="3500"/>
+            <w:tcMar>
+              <w:top w:type="dxa" w:w="60"/>
+              <w:left w:type="dxa" w:w="100"/>
+              <w:bottom w:type="dxa" w:w="60"/>
+              <w:right w:type="dxa" w:w="100"/>
+            </w:tcMar>
+          </w:tcPr>
+          <w:p>
+            <w:pPr>
+              <w:spacing w:after="0"/>
+            </w:pPr>
+            <w:r>
+              <w:rPr>
+                <w:rFonts w:ascii="Calibri" w:cs="Calibri" w:eastAsia="Calibri" w:hAnsi="Calibri"/>
+                <w:sz w:val="22"/>
+                <w:szCs w:val="22"/>
+              </w:rPr>
+              <w:t xml:space="preserve">CP7 — bonnes pratiques POO</w:t>
+            </w:r>
+          </w:p>
+        </w:tc>
+      </w:tr>
+      <w:tr>
+        <w:tc>
+          <w:tcPr>
+            <w:tcW w:type="dxa" w:w="2200"/>
+            <w:tcMar>
+              <w:top w:type="dxa" w:w="60"/>
+              <w:left w:type="dxa" w:w="100"/>
+              <w:bottom w:type="dxa" w:w="60"/>
+              <w:right w:type="dxa" w:w="100"/>
+            </w:tcMar>
+          </w:tcPr>
+          <w:p>
+            <w:pPr>
+              <w:spacing w:after="0"/>
+            </w:pPr>
+            <w:r>
+              <w:rPr>
+                <w:rFonts w:ascii="Calibri" w:cs="Calibri" w:eastAsia="Calibri" w:hAnsi="Calibri"/>
+                <w:sz w:val="22"/>
+                <w:szCs w:val="22"/>
+              </w:rPr>
+              <w:t xml:space="preserve">Visibilité</w:t>
+            </w:r>
+          </w:p>
+        </w:tc>
+        <w:tc>
+          <w:tcPr>
+            <w:tcW w:type="dxa" w:w="3900"/>
+            <w:tcMar>
+              <w:top w:type="dxa" w:w="60"/>
+              <w:left w:type="dxa" w:w="100"/>
+              <w:bottom w:type="dxa" w:w="60"/>
+              <w:right w:type="dxa" w:w="100"/>
+            </w:tcMar>
+          </w:tcPr>
+          <w:p>
+            <w:pPr>
+              <w:spacing w:after="0"/>
+            </w:pPr>
+            <w:r>
+              <w:rPr>
+                <w:rFonts w:ascii="Calibri" w:cs="Calibri" w:eastAsia="Calibri" w:hAnsi="Calibri"/>
+                <w:sz w:val="22"/>
+                <w:szCs w:val="22"/>
+              </w:rPr>
+              <w:t xml:space="preserve">Aucune propriété du parent redéclarée</w:t>
+            </w:r>
+          </w:p>
+        </w:tc>
+        <w:tc>
+          <w:tcPr>
+            <w:tcW w:type="dxa" w:w="3500"/>
+            <w:tcMar>
+              <w:top w:type="dxa" w:w="60"/>
+              <w:left w:type="dxa" w:w="100"/>
+              <w:bottom w:type="dxa" w:w="60"/>
+              <w:right w:type="dxa" w:w="100"/>
+            </w:tcMar>
+          </w:tcPr>
+          <w:p>
+            <w:pPr>
+              <w:spacing w:after="0"/>
+            </w:pPr>
+            <w:r>
+              <w:rPr>
+                <w:rFonts w:ascii="Calibri" w:cs="Calibri" w:eastAsia="Calibri" w:hAnsi="Calibri"/>
+                <w:sz w:val="22"/>
+                <w:szCs w:val="22"/>
+              </w:rPr>
+              <w:t xml:space="preserve">CP7 — bonnes pratiques POO</w:t>
+            </w:r>
+          </w:p>
+        </w:tc>
+      </w:tr>
+      <w:tr>
+        <w:tc>
+          <w:tcPr>
+            <w:tcW w:type="dxa" w:w="2200"/>
+            <w:tcMar>
+              <w:top w:type="dxa" w:w="60"/>
+              <w:left w:type="dxa" w:w="100"/>
+              <w:bottom w:type="dxa" w:w="60"/>
+              <w:right w:type="dxa" w:w="100"/>
+            </w:tcMar>
+          </w:tcPr>
+          <w:p>
+            <w:pPr>
+              <w:spacing w:after="0"/>
+            </w:pPr>
+            <w:r>
+              <w:rPr>
+                <w:rFonts w:ascii="Calibri" w:cs="Calibri" w:eastAsia="Calibri" w:hAnsi="Calibri"/>
+                <w:sz w:val="22"/>
+                <w:szCs w:val="22"/>
+              </w:rPr>
+              <w:t xml:space="preserve">Contrat</w:t>
+            </w:r>
+          </w:p>
+        </w:tc>
+        <w:tc>
+          <w:tcPr>
+            <w:tcW w:type="dxa" w:w="3900"/>
+            <w:tcMar>
+              <w:top w:type="dxa" w:w="60"/>
+              <w:left w:type="dxa" w:w="100"/>
+              <w:bottom w:type="dxa" w:w="60"/>
+              <w:right w:type="dxa" w:w="100"/>
+            </w:tcMar>
+          </w:tcPr>
+          <w:p>
+            <w:pPr>
+              <w:spacing w:after="0"/>
+            </w:pPr>
+            <w:r>
+              <w:rPr>
+                <w:rFonts w:ascii="Calibri" w:cs="Calibri" w:eastAsia="Calibri" w:hAnsi="Calibri"/>
+                <w:sz w:val="22"/>
+                <w:szCs w:val="22"/>
+              </w:rPr>
+              <w:t xml:space="preserve">Les 6 objets passent le test </w:t>
             </w:r>
             <w:r>
               <w:rPr>

</xml_diff>

<commit_message>
feat: Add level 3 corrections for the Mediatheque project
- Remove obsolete document file.
- Introduce enriched Livre class with ISBN validation and __toString() method.
- Create test suite for Livre class to validate functionality.
- Implement Document, Dvd, and JeuVideo classes for level 3, demonstrating multi-contract interfaces.
- Add Reservable and Empruntable interfaces with respective implementations.
- Introduce TraitReservation for shared reservation logic between Livre and JeuVideo.
- Implement TypeDocument enum for better type handling.
- Create DocumentRepositoryHydrate for database interactions and object hydration.
- Add EmpruntService for managing document borrowing with transaction support.
- Ensure comprehensive testing for all new functionalities and error handling.
</commit_message>
<xml_diff>
--- a/php/cours-POO+TP-correction/Corrige_Formateur_TP_POO_DWWM.docx
+++ b/php/cours-POO+TP-correction/Corrige_Formateur_TP_POO_DWWM.docx
@@ -1229,7 +1229,7 @@
           <w:sz w:val="22"/>
           <w:szCs w:val="22"/>
         </w:rPr>
-        <w:t xml:space="preserve">Oubli de `$this-&gt;` dans le getter</w:t>
+        <w:t xml:space="preserve">Oubli de $this-&gt; dans le getter</w:t>
       </w:r>
     </w:p>
     <w:p>
@@ -1609,7 +1609,7 @@
           <w:sz w:val="22"/>
           <w:szCs w:val="22"/>
         </w:rPr>
-        <w:t xml:space="preserve">`echo` dans la méthode `afficher()`</w:t>
+        <w:t xml:space="preserve">echo dans la méthode afficher()</w:t>
       </w:r>
     </w:p>
     <w:p>
@@ -3082,7 +3082,7 @@
           <w:sz w:val="22"/>
           <w:szCs w:val="22"/>
         </w:rPr>
-        <w:t xml:space="preserve">Oubli de `parent::__construct()`</w:t>
+        <w:t xml:space="preserve">Oubli de parent::__construct()</w:t>
       </w:r>
     </w:p>
     <w:p>
@@ -3222,7 +3222,7 @@
           <w:sz w:val="22"/>
           <w:szCs w:val="22"/>
         </w:rPr>
-        <w:t xml:space="preserve">Propriétés du parent en `private`</w:t>
+        <w:t xml:space="preserve">Propriétés du parent en private</w:t>
       </w:r>
     </w:p>
     <w:p>
@@ -3466,7 +3466,7 @@
           <w:sz w:val="22"/>
           <w:szCs w:val="22"/>
         </w:rPr>
-        <w:t xml:space="preserve">Confusion `implements` / `extends`</w:t>
+        <w:t xml:space="preserve">Confusion implements / extends</w:t>
       </w:r>
     </w:p>
     <w:p>
@@ -3506,7 +3506,49 @@
           <w:sz w:val="22"/>
           <w:szCs w:val="22"/>
         </w:rPr>
-        <w:t xml:space="preserve">un seul `extends`, autant d'`implements` que voulu</w:t>
+        <w:t xml:space="preserve">un seul </w:t>
+      </w:r>
+      <w:r>
+        <w:rPr>
+          <w:rFonts w:ascii="Consolas" w:cs="Consolas" w:eastAsia="Consolas" w:hAnsi="Consolas"/>
+          <w:b/>
+          <w:bCs/>
+          <w:sz w:val="20"/>
+          <w:szCs w:val="20"/>
+          <w:shd w:fill="ECECEC" w:val="clear"/>
+        </w:rPr>
+        <w:t xml:space="preserve">extends</w:t>
+      </w:r>
+      <w:r>
+        <w:rPr>
+          <w:rFonts w:ascii="Calibri" w:cs="Calibri" w:eastAsia="Calibri" w:hAnsi="Calibri"/>
+          <w:b/>
+          <w:bCs/>
+          <w:sz w:val="22"/>
+          <w:szCs w:val="22"/>
+        </w:rPr>
+        <w:t xml:space="preserve">, autant d'</w:t>
+      </w:r>
+      <w:r>
+        <w:rPr>
+          <w:rFonts w:ascii="Consolas" w:cs="Consolas" w:eastAsia="Consolas" w:hAnsi="Consolas"/>
+          <w:b/>
+          <w:bCs/>
+          <w:sz w:val="20"/>
+          <w:szCs w:val="20"/>
+          <w:shd w:fill="ECECEC" w:val="clear"/>
+        </w:rPr>
+        <w:t xml:space="preserve">implements</w:t>
+      </w:r>
+      <w:r>
+        <w:rPr>
+          <w:rFonts w:ascii="Calibri" w:cs="Calibri" w:eastAsia="Calibri" w:hAnsi="Calibri"/>
+          <w:b/>
+          <w:bCs/>
+          <w:sz w:val="22"/>
+          <w:szCs w:val="22"/>
+        </w:rPr>
+        <w:t xml:space="preserve"> que voulu</w:t>
       </w:r>
       <w:r>
         <w:rPr>
@@ -5400,7 +5442,7 @@
           <w:sz w:val="22"/>
           <w:szCs w:val="22"/>
         </w:rPr>
-        <w:t xml:space="preserve">`htmlspecialchars()` oublié</w:t>
+        <w:t xml:space="preserve">htmlspecialchars() oublié</w:t>
       </w:r>
     </w:p>
     <w:p>
@@ -6675,7 +6717,7 @@
           <w:sz w:val="30"/>
           <w:szCs w:val="30"/>
         </w:rPr>
-        <w:t xml:space="preserve">6. Extensions de niveau 3</w:t>
+        <w:t xml:space="preserve">6. Niveau 3 — extensions et traçabilité</w:t>
       </w:r>
     </w:p>
     <w:p>
@@ -6697,15 +6739,33 @@
           <w:szCs w:val="20"/>
           <w:shd w:fill="ECECEC" w:val="clear"/>
         </w:rPr>
-        <w:t xml:space="preserve">formateur/extensions-niveau3/</w:t>
-      </w:r>
-      <w:r>
-        <w:rPr>
-          <w:rFonts w:ascii="Calibri" w:cs="Calibri" w:eastAsia="Calibri" w:hAnsi="Calibri"/>
-          <w:sz w:val="22"/>
-          <w:szCs w:val="22"/>
-        </w:rPr>
-        <w:t xml:space="preserve">. Ces extensions ne sont pas un programme à couvrir : ce sont des soupapes individuelles. Distribuez-les à la demande, une à la fois.</w:t>
+        <w:t xml:space="preserve">formateur/niveau3/</w:t>
+      </w:r>
+      <w:r>
+        <w:rPr>
+          <w:rFonts w:ascii="Calibri" w:cs="Calibri" w:eastAsia="Calibri" w:hAnsi="Calibri"/>
+          <w:sz w:val="22"/>
+          <w:szCs w:val="22"/>
+        </w:rPr>
+        <w:t xml:space="preserve">, organisés </w:t>
+      </w:r>
+      <w:r>
+        <w:rPr>
+          <w:rFonts w:ascii="Calibri" w:cs="Calibri" w:eastAsia="Calibri" w:hAnsi="Calibri"/>
+          <w:b/>
+          <w:bCs/>
+          <w:sz w:val="22"/>
+          <w:szCs w:val="22"/>
+        </w:rPr>
+        <w:t xml:space="preserve">par étape</w:t>
+      </w:r>
+      <w:r>
+        <w:rPr>
+          <w:rFonts w:ascii="Calibri" w:cs="Calibri" w:eastAsia="Calibri" w:hAnsi="Calibri"/>
+          <w:sz w:val="22"/>
+          <w:szCs w:val="22"/>
+        </w:rPr>
+        <w:t xml:space="preserve"> et non à plat, pour que chaque corrigé se trouve là où on le cherche.</w:t>
       </w:r>
     </w:p>
     <w:p>
@@ -6722,7 +6782,7 @@
           <w:sz w:val="25"/>
           <w:szCs w:val="25"/>
         </w:rPr>
-        <w:t xml:space="preserve">6.1 Hydratation — la plus rentable</w:t>
+        <w:t xml:space="preserve">6.1 Matrice de traçabilité</w:t>
       </w:r>
     </w:p>
     <w:p>
@@ -6735,7 +6795,1196 @@
           <w:sz w:val="22"/>
           <w:szCs w:val="22"/>
         </w:rPr>
-        <w:t xml:space="preserve">Fichier </w:t>
+        <w:t xml:space="preserve">Tout défi annoncé dans le support de cours a son corrigé exécutable. Cette matrice sert de contrôle avant chaque session : si une ligne est vide, un stagiaire se retrouvera sans référence.</w:t>
+      </w:r>
+    </w:p>
+    <w:tbl>
+      <w:tblPr>
+        <w:tblW w:type="dxa" w:w="10200"/>
+        <w:tblBorders>
+          <w:top w:val="single" w:color="auto" w:sz="4"/>
+          <w:left w:val="single" w:color="auto" w:sz="4"/>
+          <w:bottom w:val="single" w:color="auto" w:sz="4"/>
+          <w:right w:val="single" w:color="auto" w:sz="4"/>
+          <w:insideH w:val="single" w:color="auto" w:sz="4"/>
+          <w:insideV w:val="single" w:color="auto" w:sz="4"/>
+        </w:tblBorders>
+      </w:tblPr>
+      <w:tblGrid>
+        <w:gridCol w:w="4300"/>
+        <w:gridCol w:w="3600"/>
+        <w:gridCol w:w="2300"/>
+      </w:tblGrid>
+      <w:tr>
+        <w:trPr>
+          <w:tblHeader/>
+        </w:trPr>
+        <w:tc>
+          <w:tcPr>
+            <w:tcW w:type="dxa" w:w="4300"/>
+            <w:shd w:fill="1F4E79" w:val="clear"/>
+            <w:tcMar>
+              <w:top w:type="dxa" w:w="60"/>
+              <w:left w:type="dxa" w:w="100"/>
+              <w:bottom w:type="dxa" w:w="60"/>
+              <w:right w:type="dxa" w:w="100"/>
+            </w:tcMar>
+          </w:tcPr>
+          <w:p>
+            <w:pPr>
+              <w:spacing w:after="0"/>
+            </w:pPr>
+            <w:r>
+              <w:rPr>
+                <w:rFonts w:ascii="Calibri" w:cs="Calibri" w:eastAsia="Calibri" w:hAnsi="Calibri"/>
+                <w:b/>
+                <w:bCs/>
+                <w:color w:val="FFFFFF"/>
+                <w:sz w:val="22"/>
+                <w:szCs w:val="22"/>
+              </w:rPr>
+              <w:t xml:space="preserve">Défi annoncé dans le cours</w:t>
+            </w:r>
+          </w:p>
+        </w:tc>
+        <w:tc>
+          <w:tcPr>
+            <w:tcW w:type="dxa" w:w="3600"/>
+            <w:shd w:fill="1F4E79" w:val="clear"/>
+            <w:tcMar>
+              <w:top w:type="dxa" w:w="60"/>
+              <w:left w:type="dxa" w:w="100"/>
+              <w:bottom w:type="dxa" w:w="60"/>
+              <w:right w:type="dxa" w:w="100"/>
+            </w:tcMar>
+          </w:tcPr>
+          <w:p>
+            <w:pPr>
+              <w:spacing w:after="0"/>
+            </w:pPr>
+            <w:r>
+              <w:rPr>
+                <w:rFonts w:ascii="Calibri" w:cs="Calibri" w:eastAsia="Calibri" w:hAnsi="Calibri"/>
+                <w:b/>
+                <w:bCs/>
+                <w:color w:val="FFFFFF"/>
+                <w:sz w:val="22"/>
+                <w:szCs w:val="22"/>
+              </w:rPr>
+              <w:t xml:space="preserve">Fichier corrigé</w:t>
+            </w:r>
+          </w:p>
+        </w:tc>
+        <w:tc>
+          <w:tcPr>
+            <w:tcW w:type="dxa" w:w="2300"/>
+            <w:shd w:fill="1F4E79" w:val="clear"/>
+            <w:tcMar>
+              <w:top w:type="dxa" w:w="60"/>
+              <w:left w:type="dxa" w:w="100"/>
+              <w:bottom w:type="dxa" w:w="60"/>
+              <w:right w:type="dxa" w:w="100"/>
+            </w:tcMar>
+          </w:tcPr>
+          <w:p>
+            <w:pPr>
+              <w:spacing w:after="0"/>
+            </w:pPr>
+            <w:r>
+              <w:rPr>
+                <w:rFonts w:ascii="Calibri" w:cs="Calibri" w:eastAsia="Calibri" w:hAnsi="Calibri"/>
+                <w:b/>
+                <w:bCs/>
+                <w:color w:val="FFFFFF"/>
+                <w:sz w:val="22"/>
+                <w:szCs w:val="22"/>
+              </w:rPr>
+              <w:t xml:space="preserve">Vérification</w:t>
+            </w:r>
+          </w:p>
+        </w:tc>
+      </w:tr>
+      <w:tr>
+        <w:tc>
+          <w:tcPr>
+            <w:tcW w:type="dxa" w:w="4300"/>
+            <w:tcMar>
+              <w:top w:type="dxa" w:w="60"/>
+              <w:left w:type="dxa" w:w="100"/>
+              <w:bottom w:type="dxa" w:w="60"/>
+              <w:right w:type="dxa" w:w="100"/>
+            </w:tcMar>
+          </w:tcPr>
+          <w:p>
+            <w:pPr>
+              <w:spacing w:after="0"/>
+            </w:pPr>
+            <w:r>
+              <w:rPr>
+                <w:rFonts w:ascii="Calibri" w:cs="Calibri" w:eastAsia="Calibri" w:hAnsi="Calibri"/>
+                <w:b/>
+                <w:bCs/>
+                <w:sz w:val="22"/>
+                <w:szCs w:val="22"/>
+              </w:rPr>
+              <w:t xml:space="preserve">E1 N3</w:t>
+            </w:r>
+            <w:r>
+              <w:rPr>
+                <w:rFonts w:ascii="Calibri" w:cs="Calibri" w:eastAsia="Calibri" w:hAnsi="Calibri"/>
+                <w:sz w:val="22"/>
+                <w:szCs w:val="22"/>
+              </w:rPr>
+              <w:t xml:space="preserve"> — propriété </w:t>
+            </w:r>
+            <w:r>
+              <w:rPr>
+                <w:rFonts w:ascii="Consolas" w:cs="Consolas" w:eastAsia="Consolas" w:hAnsi="Consolas"/>
+                <w:sz w:val="20"/>
+                <w:szCs w:val="20"/>
+                <w:shd w:fill="ECECEC" w:val="clear"/>
+              </w:rPr>
+              <w:t xml:space="preserve">isbn</w:t>
+            </w:r>
+            <w:r>
+              <w:rPr>
+                <w:rFonts w:ascii="Calibri" w:cs="Calibri" w:eastAsia="Calibri" w:hAnsi="Calibri"/>
+                <w:sz w:val="22"/>
+                <w:szCs w:val="22"/>
+              </w:rPr>
+              <w:t xml:space="preserve"> validée dans le setter</w:t>
+            </w:r>
+          </w:p>
+        </w:tc>
+        <w:tc>
+          <w:tcPr>
+            <w:tcW w:type="dxa" w:w="3600"/>
+            <w:tcMar>
+              <w:top w:type="dxa" w:w="60"/>
+              <w:left w:type="dxa" w:w="100"/>
+              <w:bottom w:type="dxa" w:w="60"/>
+              <w:right w:type="dxa" w:w="100"/>
+            </w:tcMar>
+          </w:tcPr>
+          <w:p>
+            <w:pPr>
+              <w:spacing w:after="0"/>
+            </w:pPr>
+            <w:r>
+              <w:rPr>
+                <w:rFonts w:ascii="Consolas" w:cs="Consolas" w:eastAsia="Consolas" w:hAnsi="Consolas"/>
+                <w:sz w:val="20"/>
+                <w:szCs w:val="20"/>
+                <w:shd w:fill="ECECEC" w:val="clear"/>
+              </w:rPr>
+              <w:t xml:space="preserve">niveau3/etape1/Livre.php</w:t>
+            </w:r>
+          </w:p>
+        </w:tc>
+        <w:tc>
+          <w:tcPr>
+            <w:tcW w:type="dxa" w:w="2300"/>
+            <w:tcMar>
+              <w:top w:type="dxa" w:w="60"/>
+              <w:left w:type="dxa" w:w="100"/>
+              <w:bottom w:type="dxa" w:w="60"/>
+              <w:right w:type="dxa" w:w="100"/>
+            </w:tcMar>
+          </w:tcPr>
+          <w:p>
+            <w:pPr>
+              <w:spacing w:after="0"/>
+            </w:pPr>
+            <w:r>
+              <w:rPr>
+                <w:rFonts w:ascii="Consolas" w:cs="Consolas" w:eastAsia="Consolas" w:hAnsi="Consolas"/>
+                <w:sz w:val="20"/>
+                <w:szCs w:val="20"/>
+                <w:shd w:fill="ECECEC" w:val="clear"/>
+              </w:rPr>
+              <w:t xml:space="preserve">php jeu-essai.php</w:t>
+            </w:r>
+            <w:r>
+              <w:rPr>
+                <w:rFonts w:ascii="Calibri" w:cs="Calibri" w:eastAsia="Calibri" w:hAnsi="Calibri"/>
+                <w:sz w:val="22"/>
+                <w:szCs w:val="22"/>
+              </w:rPr>
+              <w:t xml:space="preserve"> → 5/5</w:t>
+            </w:r>
+          </w:p>
+        </w:tc>
+      </w:tr>
+      <w:tr>
+        <w:tc>
+          <w:tcPr>
+            <w:tcW w:type="dxa" w:w="4300"/>
+            <w:tcMar>
+              <w:top w:type="dxa" w:w="60"/>
+              <w:left w:type="dxa" w:w="100"/>
+              <w:bottom w:type="dxa" w:w="60"/>
+              <w:right w:type="dxa" w:w="100"/>
+            </w:tcMar>
+          </w:tcPr>
+          <w:p>
+            <w:pPr>
+              <w:spacing w:after="0"/>
+            </w:pPr>
+            <w:r>
+              <w:rPr>
+                <w:rFonts w:ascii="Calibri" w:cs="Calibri" w:eastAsia="Calibri" w:hAnsi="Calibri"/>
+                <w:b/>
+                <w:bCs/>
+                <w:sz w:val="22"/>
+                <w:szCs w:val="22"/>
+              </w:rPr>
+              <w:t xml:space="preserve">E1 N3</w:t>
+            </w:r>
+            <w:r>
+              <w:rPr>
+                <w:rFonts w:ascii="Calibri" w:cs="Calibri" w:eastAsia="Calibri" w:hAnsi="Calibri"/>
+                <w:sz w:val="22"/>
+                <w:szCs w:val="22"/>
+              </w:rPr>
+              <w:t xml:space="preserve"> — </w:t>
+            </w:r>
+            <w:r>
+              <w:rPr>
+                <w:rFonts w:ascii="Consolas" w:cs="Consolas" w:eastAsia="Consolas" w:hAnsi="Consolas"/>
+                <w:sz w:val="20"/>
+                <w:szCs w:val="20"/>
+                <w:shd w:fill="ECECEC" w:val="clear"/>
+              </w:rPr>
+              <w:t xml:space="preserve">__toString()</w:t>
+            </w:r>
+            <w:r>
+              <w:rPr>
+                <w:rFonts w:ascii="Calibri" w:cs="Calibri" w:eastAsia="Calibri" w:hAnsi="Calibri"/>
+                <w:sz w:val="22"/>
+                <w:szCs w:val="22"/>
+              </w:rPr>
+              <w:t xml:space="preserve"> et sa différence avec </w:t>
+            </w:r>
+            <w:r>
+              <w:rPr>
+                <w:rFonts w:ascii="Consolas" w:cs="Consolas" w:eastAsia="Consolas" w:hAnsi="Consolas"/>
+                <w:sz w:val="20"/>
+                <w:szCs w:val="20"/>
+                <w:shd w:fill="ECECEC" w:val="clear"/>
+              </w:rPr>
+              <w:t xml:space="preserve">afficher()</w:t>
+            </w:r>
+          </w:p>
+        </w:tc>
+        <w:tc>
+          <w:tcPr>
+            <w:tcW w:type="dxa" w:w="3600"/>
+            <w:tcMar>
+              <w:top w:type="dxa" w:w="60"/>
+              <w:left w:type="dxa" w:w="100"/>
+              <w:bottom w:type="dxa" w:w="60"/>
+              <w:right w:type="dxa" w:w="100"/>
+            </w:tcMar>
+          </w:tcPr>
+          <w:p>
+            <w:pPr>
+              <w:spacing w:after="0"/>
+            </w:pPr>
+            <w:r>
+              <w:rPr>
+                <w:rFonts w:ascii="Consolas" w:cs="Consolas" w:eastAsia="Consolas" w:hAnsi="Consolas"/>
+                <w:sz w:val="20"/>
+                <w:szCs w:val="20"/>
+                <w:shd w:fill="ECECEC" w:val="clear"/>
+              </w:rPr>
+              <w:t xml:space="preserve">niveau3/etape1/Livre.php</w:t>
+            </w:r>
+          </w:p>
+        </w:tc>
+        <w:tc>
+          <w:tcPr>
+            <w:tcW w:type="dxa" w:w="2300"/>
+            <w:tcMar>
+              <w:top w:type="dxa" w:w="60"/>
+              <w:left w:type="dxa" w:w="100"/>
+              <w:bottom w:type="dxa" w:w="60"/>
+              <w:right w:type="dxa" w:w="100"/>
+            </w:tcMar>
+          </w:tcPr>
+          <w:p>
+            <w:pPr>
+              <w:spacing w:after="0"/>
+            </w:pPr>
+            <w:r>
+              <w:rPr>
+                <w:rFonts w:ascii="Calibri" w:cs="Calibri" w:eastAsia="Calibri" w:hAnsi="Calibri"/>
+                <w:sz w:val="22"/>
+                <w:szCs w:val="22"/>
+              </w:rPr>
+              <w:t xml:space="preserve">idem</w:t>
+            </w:r>
+          </w:p>
+        </w:tc>
+      </w:tr>
+      <w:tr>
+        <w:tc>
+          <w:tcPr>
+            <w:tcW w:type="dxa" w:w="4300"/>
+            <w:tcMar>
+              <w:top w:type="dxa" w:w="60"/>
+              <w:left w:type="dxa" w:w="100"/>
+              <w:bottom w:type="dxa" w:w="60"/>
+              <w:right w:type="dxa" w:w="100"/>
+            </w:tcMar>
+          </w:tcPr>
+          <w:p>
+            <w:pPr>
+              <w:spacing w:after="0"/>
+            </w:pPr>
+            <w:r>
+              <w:rPr>
+                <w:rFonts w:ascii="Calibri" w:cs="Calibri" w:eastAsia="Calibri" w:hAnsi="Calibri"/>
+                <w:b/>
+                <w:bCs/>
+                <w:sz w:val="22"/>
+                <w:szCs w:val="22"/>
+              </w:rPr>
+              <w:t xml:space="preserve">E1 N3</w:t>
+            </w:r>
+            <w:r>
+              <w:rPr>
+                <w:rFonts w:ascii="Calibri" w:cs="Calibri" w:eastAsia="Calibri" w:hAnsi="Calibri"/>
+                <w:sz w:val="22"/>
+                <w:szCs w:val="22"/>
+              </w:rPr>
+              <w:t xml:space="preserve"> — jeu d'essai 3 cas passants / 2 cas d'erreur</w:t>
+            </w:r>
+          </w:p>
+        </w:tc>
+        <w:tc>
+          <w:tcPr>
+            <w:tcW w:type="dxa" w:w="3600"/>
+            <w:tcMar>
+              <w:top w:type="dxa" w:w="60"/>
+              <w:left w:type="dxa" w:w="100"/>
+              <w:bottom w:type="dxa" w:w="60"/>
+              <w:right w:type="dxa" w:w="100"/>
+            </w:tcMar>
+          </w:tcPr>
+          <w:p>
+            <w:pPr>
+              <w:spacing w:after="0"/>
+            </w:pPr>
+            <w:r>
+              <w:rPr>
+                <w:rFonts w:ascii="Consolas" w:cs="Consolas" w:eastAsia="Consolas" w:hAnsi="Consolas"/>
+                <w:sz w:val="20"/>
+                <w:szCs w:val="20"/>
+                <w:shd w:fill="ECECEC" w:val="clear"/>
+              </w:rPr>
+              <w:t xml:space="preserve">niveau3/etape1/jeu-essai.php</w:t>
+            </w:r>
+          </w:p>
+        </w:tc>
+        <w:tc>
+          <w:tcPr>
+            <w:tcW w:type="dxa" w:w="2300"/>
+            <w:tcMar>
+              <w:top w:type="dxa" w:w="60"/>
+              <w:left w:type="dxa" w:w="100"/>
+              <w:bottom w:type="dxa" w:w="60"/>
+              <w:right w:type="dxa" w:w="100"/>
+            </w:tcMar>
+          </w:tcPr>
+          <w:p>
+            <w:pPr>
+              <w:spacing w:after="0"/>
+            </w:pPr>
+            <w:r>
+              <w:rPr>
+                <w:rFonts w:ascii="Calibri" w:cs="Calibri" w:eastAsia="Calibri" w:hAnsi="Calibri"/>
+                <w:sz w:val="22"/>
+                <w:szCs w:val="22"/>
+              </w:rPr>
+              <w:t xml:space="preserve">idem</w:t>
+            </w:r>
+          </w:p>
+        </w:tc>
+      </w:tr>
+      <w:tr>
+        <w:tc>
+          <w:tcPr>
+            <w:tcW w:type="dxa" w:w="4300"/>
+            <w:tcMar>
+              <w:top w:type="dxa" w:w="60"/>
+              <w:left w:type="dxa" w:w="100"/>
+              <w:bottom w:type="dxa" w:w="60"/>
+              <w:right w:type="dxa" w:w="100"/>
+            </w:tcMar>
+          </w:tcPr>
+          <w:p>
+            <w:pPr>
+              <w:spacing w:after="0"/>
+            </w:pPr>
+            <w:r>
+              <w:rPr>
+                <w:rFonts w:ascii="Calibri" w:cs="Calibri" w:eastAsia="Calibri" w:hAnsi="Calibri"/>
+                <w:b/>
+                <w:bCs/>
+                <w:sz w:val="22"/>
+                <w:szCs w:val="22"/>
+              </w:rPr>
+              <w:t xml:space="preserve">E2 N2 bonus</w:t>
+            </w:r>
+            <w:r>
+              <w:rPr>
+                <w:rFonts w:ascii="Calibri" w:cs="Calibri" w:eastAsia="Calibri" w:hAnsi="Calibri"/>
+                <w:sz w:val="22"/>
+                <w:szCs w:val="22"/>
+              </w:rPr>
+              <w:t xml:space="preserve"> — </w:t>
+            </w:r>
+            <w:r>
+              <w:rPr>
+                <w:rFonts w:ascii="Consolas" w:cs="Consolas" w:eastAsia="Consolas" w:hAnsi="Consolas"/>
+                <w:sz w:val="20"/>
+                <w:szCs w:val="20"/>
+                <w:shd w:fill="ECECEC" w:val="clear"/>
+              </w:rPr>
+              <w:t xml:space="preserve">setPegi()</w:t>
+            </w:r>
+            <w:r>
+              <w:rPr>
+                <w:rFonts w:ascii="Calibri" w:cs="Calibri" w:eastAsia="Calibri" w:hAnsi="Calibri"/>
+                <w:sz w:val="22"/>
+                <w:szCs w:val="22"/>
+              </w:rPr>
+              <w:t xml:space="preserve"> par liste blanche</w:t>
+            </w:r>
+          </w:p>
+        </w:tc>
+        <w:tc>
+          <w:tcPr>
+            <w:tcW w:type="dxa" w:w="3600"/>
+            <w:tcMar>
+              <w:top w:type="dxa" w:w="60"/>
+              <w:left w:type="dxa" w:w="100"/>
+              <w:bottom w:type="dxa" w:w="60"/>
+              <w:right w:type="dxa" w:w="100"/>
+            </w:tcMar>
+          </w:tcPr>
+          <w:p>
+            <w:pPr>
+              <w:spacing w:after="0"/>
+            </w:pPr>
+            <w:r>
+              <w:rPr>
+                <w:rFonts w:ascii="Consolas" w:cs="Consolas" w:eastAsia="Consolas" w:hAnsi="Consolas"/>
+                <w:sz w:val="20"/>
+                <w:szCs w:val="20"/>
+                <w:shd w:fill="ECECEC" w:val="clear"/>
+              </w:rPr>
+              <w:t xml:space="preserve">etape2/src/JeuVideo.php</w:t>
+            </w:r>
+          </w:p>
+        </w:tc>
+        <w:tc>
+          <w:tcPr>
+            <w:tcW w:type="dxa" w:w="2300"/>
+            <w:tcMar>
+              <w:top w:type="dxa" w:w="60"/>
+              <w:left w:type="dxa" w:w="100"/>
+              <w:bottom w:type="dxa" w:w="60"/>
+              <w:right w:type="dxa" w:w="100"/>
+            </w:tcMar>
+          </w:tcPr>
+          <w:p>
+            <w:pPr>
+              <w:spacing w:after="0"/>
+            </w:pPr>
+            <w:r>
+              <w:rPr>
+                <w:rFonts w:ascii="Consolas" w:cs="Consolas" w:eastAsia="Consolas" w:hAnsi="Consolas"/>
+                <w:sz w:val="20"/>
+                <w:szCs w:val="20"/>
+                <w:shd w:fill="ECECEC" w:val="clear"/>
+              </w:rPr>
+              <w:t xml:space="preserve">php etape2/index.php</w:t>
+            </w:r>
+          </w:p>
+        </w:tc>
+      </w:tr>
+      <w:tr>
+        <w:tc>
+          <w:tcPr>
+            <w:tcW w:type="dxa" w:w="4300"/>
+            <w:tcMar>
+              <w:top w:type="dxa" w:w="60"/>
+              <w:left w:type="dxa" w:w="100"/>
+              <w:bottom w:type="dxa" w:w="60"/>
+              <w:right w:type="dxa" w:w="100"/>
+            </w:tcMar>
+          </w:tcPr>
+          <w:p>
+            <w:pPr>
+              <w:spacing w:after="0"/>
+            </w:pPr>
+            <w:r>
+              <w:rPr>
+                <w:rFonts w:ascii="Calibri" w:cs="Calibri" w:eastAsia="Calibri" w:hAnsi="Calibri"/>
+                <w:b/>
+                <w:bCs/>
+                <w:sz w:val="22"/>
+                <w:szCs w:val="22"/>
+              </w:rPr>
+              <w:t xml:space="preserve">E2 N3</w:t>
+            </w:r>
+            <w:r>
+              <w:rPr>
+                <w:rFonts w:ascii="Calibri" w:cs="Calibri" w:eastAsia="Calibri" w:hAnsi="Calibri"/>
+                <w:sz w:val="22"/>
+                <w:szCs w:val="22"/>
+              </w:rPr>
+              <w:t xml:space="preserve"> — interface </w:t>
+            </w:r>
+            <w:r>
+              <w:rPr>
+                <w:rFonts w:ascii="Consolas" w:cs="Consolas" w:eastAsia="Consolas" w:hAnsi="Consolas"/>
+                <w:sz w:val="20"/>
+                <w:szCs w:val="20"/>
+                <w:shd w:fill="ECECEC" w:val="clear"/>
+              </w:rPr>
+              <w:t xml:space="preserve">Reservable</w:t>
+            </w:r>
+            <w:r>
+              <w:rPr>
+                <w:rFonts w:ascii="Calibri" w:cs="Calibri" w:eastAsia="Calibri" w:hAnsi="Calibri"/>
+                <w:sz w:val="22"/>
+                <w:szCs w:val="22"/>
+              </w:rPr>
+              <w:t xml:space="preserve"> sur </w:t>
+            </w:r>
+            <w:r>
+              <w:rPr>
+                <w:rFonts w:ascii="Consolas" w:cs="Consolas" w:eastAsia="Consolas" w:hAnsi="Consolas"/>
+                <w:sz w:val="20"/>
+                <w:szCs w:val="20"/>
+                <w:shd w:fill="ECECEC" w:val="clear"/>
+              </w:rPr>
+              <w:t xml:space="preserve">Livre</w:t>
+            </w:r>
+            <w:r>
+              <w:rPr>
+                <w:rFonts w:ascii="Calibri" w:cs="Calibri" w:eastAsia="Calibri" w:hAnsi="Calibri"/>
+                <w:sz w:val="22"/>
+                <w:szCs w:val="22"/>
+              </w:rPr>
+              <w:t xml:space="preserve"> et </w:t>
+            </w:r>
+            <w:r>
+              <w:rPr>
+                <w:rFonts w:ascii="Consolas" w:cs="Consolas" w:eastAsia="Consolas" w:hAnsi="Consolas"/>
+                <w:sz w:val="20"/>
+                <w:szCs w:val="20"/>
+                <w:shd w:fill="ECECEC" w:val="clear"/>
+              </w:rPr>
+              <w:t xml:space="preserve">JeuVideo</w:t>
+            </w:r>
+            <w:r>
+              <w:rPr>
+                <w:rFonts w:ascii="Calibri" w:cs="Calibri" w:eastAsia="Calibri" w:hAnsi="Calibri"/>
+                <w:sz w:val="22"/>
+                <w:szCs w:val="22"/>
+              </w:rPr>
+              <w:t xml:space="preserve"> seuls</w:t>
+            </w:r>
+          </w:p>
+        </w:tc>
+        <w:tc>
+          <w:tcPr>
+            <w:tcW w:type="dxa" w:w="3600"/>
+            <w:tcMar>
+              <w:top w:type="dxa" w:w="60"/>
+              <w:left w:type="dxa" w:w="100"/>
+              <w:bottom w:type="dxa" w:w="60"/>
+              <w:right w:type="dxa" w:w="100"/>
+            </w:tcMar>
+          </w:tcPr>
+          <w:p>
+            <w:pPr>
+              <w:spacing w:after="0"/>
+            </w:pPr>
+            <w:r>
+              <w:rPr>
+                <w:rFonts w:ascii="Consolas" w:cs="Consolas" w:eastAsia="Consolas" w:hAnsi="Consolas"/>
+                <w:sz w:val="20"/>
+                <w:szCs w:val="20"/>
+                <w:shd w:fill="ECECEC" w:val="clear"/>
+              </w:rPr>
+              <w:t xml:space="preserve">niveau3/etape2/Reservable.php</w:t>
+            </w:r>
+          </w:p>
+        </w:tc>
+        <w:tc>
+          <w:tcPr>
+            <w:tcW w:type="dxa" w:w="2300"/>
+            <w:tcMar>
+              <w:top w:type="dxa" w:w="60"/>
+              <w:left w:type="dxa" w:w="100"/>
+              <w:bottom w:type="dxa" w:w="60"/>
+              <w:right w:type="dxa" w:w="100"/>
+            </w:tcMar>
+          </w:tcPr>
+          <w:p>
+            <w:pPr>
+              <w:spacing w:after="0"/>
+            </w:pPr>
+            <w:r>
+              <w:rPr>
+                <w:rFonts w:ascii="Consolas" w:cs="Consolas" w:eastAsia="Consolas" w:hAnsi="Consolas"/>
+                <w:sz w:val="20"/>
+                <w:szCs w:val="20"/>
+                <w:shd w:fill="ECECEC" w:val="clear"/>
+              </w:rPr>
+              <w:t xml:space="preserve">php niveau3/etape2/index.php</w:t>
+            </w:r>
+          </w:p>
+        </w:tc>
+      </w:tr>
+      <w:tr>
+        <w:tc>
+          <w:tcPr>
+            <w:tcW w:type="dxa" w:w="4300"/>
+            <w:tcMar>
+              <w:top w:type="dxa" w:w="60"/>
+              <w:left w:type="dxa" w:w="100"/>
+              <w:bottom w:type="dxa" w:w="60"/>
+              <w:right w:type="dxa" w:w="100"/>
+            </w:tcMar>
+          </w:tcPr>
+          <w:p>
+            <w:pPr>
+              <w:spacing w:after="0"/>
+            </w:pPr>
+            <w:r>
+              <w:rPr>
+                <w:rFonts w:ascii="Calibri" w:cs="Calibri" w:eastAsia="Calibri" w:hAnsi="Calibri"/>
+                <w:b/>
+                <w:bCs/>
+                <w:sz w:val="22"/>
+                <w:szCs w:val="22"/>
+              </w:rPr>
+              <w:t xml:space="preserve">E2 N3</w:t>
+            </w:r>
+            <w:r>
+              <w:rPr>
+                <w:rFonts w:ascii="Calibri" w:cs="Calibri" w:eastAsia="Calibri" w:hAnsi="Calibri"/>
+                <w:sz w:val="22"/>
+                <w:szCs w:val="22"/>
+              </w:rPr>
+              <w:t xml:space="preserve"> — </w:t>
+            </w:r>
+            <w:r>
+              <w:rPr>
+                <w:rFonts w:ascii="Consolas" w:cs="Consolas" w:eastAsia="Consolas" w:hAnsi="Consolas"/>
+                <w:sz w:val="20"/>
+                <w:szCs w:val="20"/>
+                <w:shd w:fill="ECECEC" w:val="clear"/>
+              </w:rPr>
+              <w:t xml:space="preserve">instanceof</w:t>
+            </w:r>
+            <w:r>
+              <w:rPr>
+                <w:rFonts w:ascii="Calibri" w:cs="Calibri" w:eastAsia="Calibri" w:hAnsi="Calibri"/>
+                <w:sz w:val="22"/>
+                <w:szCs w:val="22"/>
+              </w:rPr>
+              <w:t xml:space="preserve"> pour le bouton « réserver »</w:t>
+            </w:r>
+          </w:p>
+        </w:tc>
+        <w:tc>
+          <w:tcPr>
+            <w:tcW w:type="dxa" w:w="3600"/>
+            <w:tcMar>
+              <w:top w:type="dxa" w:w="60"/>
+              <w:left w:type="dxa" w:w="100"/>
+              <w:bottom w:type="dxa" w:w="60"/>
+              <w:right w:type="dxa" w:w="100"/>
+            </w:tcMar>
+          </w:tcPr>
+          <w:p>
+            <w:pPr>
+              <w:spacing w:after="0"/>
+            </w:pPr>
+            <w:r>
+              <w:rPr>
+                <w:rFonts w:ascii="Consolas" w:cs="Consolas" w:eastAsia="Consolas" w:hAnsi="Consolas"/>
+                <w:sz w:val="20"/>
+                <w:szCs w:val="20"/>
+                <w:shd w:fill="ECECEC" w:val="clear"/>
+              </w:rPr>
+              <w:t xml:space="preserve">niveau3/etape2/index.php</w:t>
+            </w:r>
+          </w:p>
+        </w:tc>
+        <w:tc>
+          <w:tcPr>
+            <w:tcW w:type="dxa" w:w="2300"/>
+            <w:tcMar>
+              <w:top w:type="dxa" w:w="60"/>
+              <w:left w:type="dxa" w:w="100"/>
+              <w:bottom w:type="dxa" w:w="60"/>
+              <w:right w:type="dxa" w:w="100"/>
+            </w:tcMar>
+          </w:tcPr>
+          <w:p>
+            <w:pPr>
+              <w:spacing w:after="0"/>
+            </w:pPr>
+            <w:r>
+              <w:rPr>
+                <w:rFonts w:ascii="Calibri" w:cs="Calibri" w:eastAsia="Calibri" w:hAnsi="Calibri"/>
+                <w:sz w:val="22"/>
+                <w:szCs w:val="22"/>
+              </w:rPr>
+              <w:t xml:space="preserve">idem, bloc 2</w:t>
+            </w:r>
+          </w:p>
+        </w:tc>
+      </w:tr>
+      <w:tr>
+        <w:tc>
+          <w:tcPr>
+            <w:tcW w:type="dxa" w:w="4300"/>
+            <w:tcMar>
+              <w:top w:type="dxa" w:w="60"/>
+              <w:left w:type="dxa" w:w="100"/>
+              <w:bottom w:type="dxa" w:w="60"/>
+              <w:right w:type="dxa" w:w="100"/>
+            </w:tcMar>
+          </w:tcPr>
+          <w:p>
+            <w:pPr>
+              <w:spacing w:after="0"/>
+            </w:pPr>
+            <w:r>
+              <w:rPr>
+                <w:rFonts w:ascii="Calibri" w:cs="Calibri" w:eastAsia="Calibri" w:hAnsi="Calibri"/>
+                <w:b/>
+                <w:bCs/>
+                <w:sz w:val="22"/>
+                <w:szCs w:val="22"/>
+              </w:rPr>
+              <w:t xml:space="preserve">E2 N3</w:t>
+            </w:r>
+            <w:r>
+              <w:rPr>
+                <w:rFonts w:ascii="Calibri" w:cs="Calibri" w:eastAsia="Calibri" w:hAnsi="Calibri"/>
+                <w:sz w:val="22"/>
+                <w:szCs w:val="22"/>
+              </w:rPr>
+              <w:t xml:space="preserve"> — enum </w:t>
+            </w:r>
+            <w:r>
+              <w:rPr>
+                <w:rFonts w:ascii="Consolas" w:cs="Consolas" w:eastAsia="Consolas" w:hAnsi="Consolas"/>
+                <w:sz w:val="20"/>
+                <w:szCs w:val="20"/>
+                <w:shd w:fill="ECECEC" w:val="clear"/>
+              </w:rPr>
+              <w:t xml:space="preserve">TypeDocument</w:t>
+            </w:r>
+            <w:r>
+              <w:rPr>
+                <w:rFonts w:ascii="Calibri" w:cs="Calibri" w:eastAsia="Calibri" w:hAnsi="Calibri"/>
+                <w:sz w:val="22"/>
+                <w:szCs w:val="22"/>
+              </w:rPr>
+              <w:t xml:space="preserve"> et justification</w:t>
+            </w:r>
+          </w:p>
+        </w:tc>
+        <w:tc>
+          <w:tcPr>
+            <w:tcW w:type="dxa" w:w="3600"/>
+            <w:tcMar>
+              <w:top w:type="dxa" w:w="60"/>
+              <w:left w:type="dxa" w:w="100"/>
+              <w:bottom w:type="dxa" w:w="60"/>
+              <w:right w:type="dxa" w:w="100"/>
+            </w:tcMar>
+          </w:tcPr>
+          <w:p>
+            <w:pPr>
+              <w:spacing w:after="0"/>
+            </w:pPr>
+            <w:r>
+              <w:rPr>
+                <w:rFonts w:ascii="Consolas" w:cs="Consolas" w:eastAsia="Consolas" w:hAnsi="Consolas"/>
+                <w:sz w:val="20"/>
+                <w:szCs w:val="20"/>
+                <w:shd w:fill="ECECEC" w:val="clear"/>
+              </w:rPr>
+              <w:t xml:space="preserve">niveau3/etape2/TypeDocument.php</w:t>
+            </w:r>
+          </w:p>
+        </w:tc>
+        <w:tc>
+          <w:tcPr>
+            <w:tcW w:type="dxa" w:w="2300"/>
+            <w:tcMar>
+              <w:top w:type="dxa" w:w="60"/>
+              <w:left w:type="dxa" w:w="100"/>
+              <w:bottom w:type="dxa" w:w="60"/>
+              <w:right w:type="dxa" w:w="100"/>
+            </w:tcMar>
+          </w:tcPr>
+          <w:p>
+            <w:pPr>
+              <w:spacing w:after="0"/>
+            </w:pPr>
+            <w:r>
+              <w:rPr>
+                <w:rFonts w:ascii="Calibri" w:cs="Calibri" w:eastAsia="Calibri" w:hAnsi="Calibri"/>
+                <w:sz w:val="22"/>
+                <w:szCs w:val="22"/>
+              </w:rPr>
+              <w:t xml:space="preserve">idem, bloc 5</w:t>
+            </w:r>
+          </w:p>
+        </w:tc>
+      </w:tr>
+      <w:tr>
+        <w:tc>
+          <w:tcPr>
+            <w:tcW w:type="dxa" w:w="4300"/>
+            <w:tcMar>
+              <w:top w:type="dxa" w:w="60"/>
+              <w:left w:type="dxa" w:w="100"/>
+              <w:bottom w:type="dxa" w:w="60"/>
+              <w:right w:type="dxa" w:w="100"/>
+            </w:tcMar>
+          </w:tcPr>
+          <w:p>
+            <w:pPr>
+              <w:spacing w:after="0"/>
+            </w:pPr>
+            <w:r>
+              <w:rPr>
+                <w:rFonts w:ascii="Calibri" w:cs="Calibri" w:eastAsia="Calibri" w:hAnsi="Calibri"/>
+                <w:b/>
+                <w:bCs/>
+                <w:sz w:val="22"/>
+                <w:szCs w:val="22"/>
+              </w:rPr>
+              <w:t xml:space="preserve">E3 N3</w:t>
+            </w:r>
+            <w:r>
+              <w:rPr>
+                <w:rFonts w:ascii="Calibri" w:cs="Calibri" w:eastAsia="Calibri" w:hAnsi="Calibri"/>
+                <w:sz w:val="22"/>
+                <w:szCs w:val="22"/>
+              </w:rPr>
+              <w:t xml:space="preserve"> — hydratation </w:t>
+            </w:r>
+            <w:r>
+              <w:rPr>
+                <w:rFonts w:ascii="Consolas" w:cs="Consolas" w:eastAsia="Consolas" w:hAnsi="Consolas"/>
+                <w:sz w:val="20"/>
+                <w:szCs w:val="20"/>
+                <w:shd w:fill="ECECEC" w:val="clear"/>
+              </w:rPr>
+              <w:t xml:space="preserve">hydrate(array): Document</w:t>
+            </w:r>
+          </w:p>
+        </w:tc>
+        <w:tc>
+          <w:tcPr>
+            <w:tcW w:type="dxa" w:w="3600"/>
+            <w:tcMar>
+              <w:top w:type="dxa" w:w="60"/>
+              <w:left w:type="dxa" w:w="100"/>
+              <w:bottom w:type="dxa" w:w="60"/>
+              <w:right w:type="dxa" w:w="100"/>
+            </w:tcMar>
+          </w:tcPr>
+          <w:p>
+            <w:pPr>
+              <w:spacing w:after="0"/>
+            </w:pPr>
+            <w:r>
+              <w:rPr>
+                <w:rFonts w:ascii="Consolas" w:cs="Consolas" w:eastAsia="Consolas" w:hAnsi="Consolas"/>
+                <w:sz w:val="20"/>
+                <w:szCs w:val="20"/>
+                <w:shd w:fill="ECECEC" w:val="clear"/>
+              </w:rPr>
+              <w:t xml:space="preserve">niveau3/etape3/DocumentRepositoryHydrate.php</w:t>
+            </w:r>
+          </w:p>
+        </w:tc>
+        <w:tc>
+          <w:tcPr>
+            <w:tcW w:type="dxa" w:w="2300"/>
+            <w:tcMar>
+              <w:top w:type="dxa" w:w="60"/>
+              <w:left w:type="dxa" w:w="100"/>
+              <w:bottom w:type="dxa" w:w="60"/>
+              <w:right w:type="dxa" w:w="100"/>
+            </w:tcMar>
+          </w:tcPr>
+          <w:p>
+            <w:pPr>
+              <w:spacing w:after="0"/>
+            </w:pPr>
+            <w:r>
+              <w:rPr>
+                <w:rFonts w:ascii="Calibri" w:cs="Calibri" w:eastAsia="Calibri" w:hAnsi="Calibri"/>
+                <w:sz w:val="22"/>
+                <w:szCs w:val="22"/>
+              </w:rPr>
+              <w:t xml:space="preserve">base requise</w:t>
+            </w:r>
+          </w:p>
+        </w:tc>
+      </w:tr>
+      <w:tr>
+        <w:tc>
+          <w:tcPr>
+            <w:tcW w:type="dxa" w:w="4300"/>
+            <w:tcMar>
+              <w:top w:type="dxa" w:w="60"/>
+              <w:left w:type="dxa" w:w="100"/>
+              <w:bottom w:type="dxa" w:w="60"/>
+              <w:right w:type="dxa" w:w="100"/>
+            </w:tcMar>
+          </w:tcPr>
+          <w:p>
+            <w:pPr>
+              <w:spacing w:after="0"/>
+            </w:pPr>
+            <w:r>
+              <w:rPr>
+                <w:rFonts w:ascii="Calibri" w:cs="Calibri" w:eastAsia="Calibri" w:hAnsi="Calibri"/>
+                <w:b/>
+                <w:bCs/>
+                <w:sz w:val="22"/>
+                <w:szCs w:val="22"/>
+              </w:rPr>
+              <w:t xml:space="preserve">E3 N3</w:t>
+            </w:r>
+            <w:r>
+              <w:rPr>
+                <w:rFonts w:ascii="Calibri" w:cs="Calibri" w:eastAsia="Calibri" w:hAnsi="Calibri"/>
+                <w:sz w:val="22"/>
+                <w:szCs w:val="22"/>
+              </w:rPr>
+              <w:t xml:space="preserve"> — </w:t>
+            </w:r>
+            <w:r>
+              <w:rPr>
+                <w:rFonts w:ascii="Consolas" w:cs="Consolas" w:eastAsia="Consolas" w:hAnsi="Consolas"/>
+                <w:sz w:val="20"/>
+                <w:szCs w:val="20"/>
+                <w:shd w:fill="ECECEC" w:val="clear"/>
+              </w:rPr>
+              <w:t xml:space="preserve">findDisponibles()</w:t>
+            </w:r>
+            <w:r>
+              <w:rPr>
+                <w:rFonts w:ascii="Calibri" w:cs="Calibri" w:eastAsia="Calibri" w:hAnsi="Calibri"/>
+                <w:sz w:val="22"/>
+                <w:szCs w:val="22"/>
+              </w:rPr>
+              <w:t xml:space="preserve"> et </w:t>
+            </w:r>
+            <w:r>
+              <w:rPr>
+                <w:rFonts w:ascii="Consolas" w:cs="Consolas" w:eastAsia="Consolas" w:hAnsi="Consolas"/>
+                <w:sz w:val="20"/>
+                <w:szCs w:val="20"/>
+                <w:shd w:fill="ECECEC" w:val="clear"/>
+              </w:rPr>
+              <w:t xml:space="preserve">countByType()</w:t>
+            </w:r>
+          </w:p>
+        </w:tc>
+        <w:tc>
+          <w:tcPr>
+            <w:tcW w:type="dxa" w:w="3600"/>
+            <w:tcMar>
+              <w:top w:type="dxa" w:w="60"/>
+              <w:left w:type="dxa" w:w="100"/>
+              <w:bottom w:type="dxa" w:w="60"/>
+              <w:right w:type="dxa" w:w="100"/>
+            </w:tcMar>
+          </w:tcPr>
+          <w:p>
+            <w:pPr>
+              <w:spacing w:after="0"/>
+            </w:pPr>
+            <w:r>
+              <w:rPr>
+                <w:rFonts w:ascii="Calibri" w:cs="Calibri" w:eastAsia="Calibri" w:hAnsi="Calibri"/>
+                <w:sz w:val="22"/>
+                <w:szCs w:val="22"/>
+              </w:rPr>
+              <w:t xml:space="preserve">idem</w:t>
+            </w:r>
+          </w:p>
+        </w:tc>
+        <w:tc>
+          <w:tcPr>
+            <w:tcW w:type="dxa" w:w="2300"/>
+            <w:tcMar>
+              <w:top w:type="dxa" w:w="60"/>
+              <w:left w:type="dxa" w:w="100"/>
+              <w:bottom w:type="dxa" w:w="60"/>
+              <w:right w:type="dxa" w:w="100"/>
+            </w:tcMar>
+          </w:tcPr>
+          <w:p>
+            <w:pPr>
+              <w:spacing w:after="0"/>
+            </w:pPr>
+            <w:r>
+              <w:rPr>
+                <w:rFonts w:ascii="Calibri" w:cs="Calibri" w:eastAsia="Calibri" w:hAnsi="Calibri"/>
+                <w:sz w:val="22"/>
+                <w:szCs w:val="22"/>
+              </w:rPr>
+              <w:t xml:space="preserve">base requise</w:t>
+            </w:r>
+          </w:p>
+        </w:tc>
+      </w:tr>
+      <w:tr>
+        <w:tc>
+          <w:tcPr>
+            <w:tcW w:type="dxa" w:w="4300"/>
+            <w:tcMar>
+              <w:top w:type="dxa" w:w="60"/>
+              <w:left w:type="dxa" w:w="100"/>
+              <w:bottom w:type="dxa" w:w="60"/>
+              <w:right w:type="dxa" w:w="100"/>
+            </w:tcMar>
+          </w:tcPr>
+          <w:p>
+            <w:pPr>
+              <w:spacing w:after="0"/>
+            </w:pPr>
+            <w:r>
+              <w:rPr>
+                <w:rFonts w:ascii="Calibri" w:cs="Calibri" w:eastAsia="Calibri" w:hAnsi="Calibri"/>
+                <w:b/>
+                <w:bCs/>
+                <w:sz w:val="22"/>
+                <w:szCs w:val="22"/>
+              </w:rPr>
+              <w:t xml:space="preserve">E3 N3</w:t>
+            </w:r>
+            <w:r>
+              <w:rPr>
+                <w:rFonts w:ascii="Calibri" w:cs="Calibri" w:eastAsia="Calibri" w:hAnsi="Calibri"/>
+                <w:sz w:val="22"/>
+                <w:szCs w:val="22"/>
+              </w:rPr>
+              <w:t xml:space="preserve"> — transaction avec </w:t>
+            </w:r>
+            <w:r>
+              <w:rPr>
+                <w:rFonts w:ascii="Consolas" w:cs="Consolas" w:eastAsia="Consolas" w:hAnsi="Consolas"/>
+                <w:sz w:val="20"/>
+                <w:szCs w:val="20"/>
+                <w:shd w:fill="ECECEC" w:val="clear"/>
+              </w:rPr>
+              <w:t xml:space="preserve">rollBack()</w:t>
+            </w:r>
+          </w:p>
+        </w:tc>
+        <w:tc>
+          <w:tcPr>
+            <w:tcW w:type="dxa" w:w="3600"/>
+            <w:tcMar>
+              <w:top w:type="dxa" w:w="60"/>
+              <w:left w:type="dxa" w:w="100"/>
+              <w:bottom w:type="dxa" w:w="60"/>
+              <w:right w:type="dxa" w:w="100"/>
+            </w:tcMar>
+          </w:tcPr>
+          <w:p>
+            <w:pPr>
+              <w:spacing w:after="0"/>
+            </w:pPr>
+            <w:r>
+              <w:rPr>
+                <w:rFonts w:ascii="Consolas" w:cs="Consolas" w:eastAsia="Consolas" w:hAnsi="Consolas"/>
+                <w:sz w:val="20"/>
+                <w:szCs w:val="20"/>
+                <w:shd w:fill="ECECEC" w:val="clear"/>
+              </w:rPr>
+              <w:t xml:space="preserve">niveau3/etape3/EmpruntService.php</w:t>
+            </w:r>
+          </w:p>
+        </w:tc>
+        <w:tc>
+          <w:tcPr>
+            <w:tcW w:type="dxa" w:w="2300"/>
+            <w:tcMar>
+              <w:top w:type="dxa" w:w="60"/>
+              <w:left w:type="dxa" w:w="100"/>
+              <w:bottom w:type="dxa" w:w="60"/>
+              <w:right w:type="dxa" w:w="100"/>
+            </w:tcMar>
+          </w:tcPr>
+          <w:p>
+            <w:pPr>
+              <w:spacing w:after="0"/>
+            </w:pPr>
+            <w:r>
+              <w:rPr>
+                <w:rFonts w:ascii="Calibri" w:cs="Calibri" w:eastAsia="Calibri" w:hAnsi="Calibri"/>
+                <w:sz w:val="22"/>
+                <w:szCs w:val="22"/>
+              </w:rPr>
+              <w:t xml:space="preserve">test de sabotage, voir 6.5</w:t>
+            </w:r>
+          </w:p>
+        </w:tc>
+      </w:tr>
+    </w:tbl>
+    <w:p>
+      <w:pPr>
+        <w:spacing w:after="60"/>
+      </w:pPr>
+    </w:p>
+    <w:p>
+      <w:pPr>
+        <w:pBdr>
+          <w:left w:val="single" w:color="1F4E79" w:sz="18"/>
+        </w:pBdr>
+        <w:shd w:fill="FDEADA" w:val="clear"/>
+        <w:spacing w:after="160" w:before="120"/>
+        <w:ind w:left="240" w:right="240"/>
+      </w:pPr>
+      <w:r>
+        <w:rPr>
+          <w:rFonts w:ascii="Calibri" w:cs="Calibri" w:eastAsia="Calibri" w:hAnsi="Calibri"/>
+          <w:b/>
+          <w:bCs/>
+          <w:sz w:val="22"/>
+          <w:szCs w:val="22"/>
+        </w:rPr>
+        <w:t xml:space="preserve">[NOTE]  </w:t>
+      </w:r>
+      <w:r>
+        <w:rPr>
+          <w:rFonts w:ascii="Calibri" w:cs="Calibri" w:eastAsia="Calibri" w:hAnsi="Calibri"/>
+          <w:sz w:val="22"/>
+          <w:szCs w:val="22"/>
+        </w:rPr>
+        <w:t xml:space="preserve">Les corrigés de l'étape 1 et de l'étape 2 s'exécutent sans base de données. Ceux de l'étape 3 exigent l'import de </w:t>
       </w:r>
       <w:r>
         <w:rPr>
@@ -6744,15 +7993,15 @@
           <w:szCs w:val="20"/>
           <w:shd w:fill="ECECEC" w:val="clear"/>
         </w:rPr>
-        <w:t xml:space="preserve">01-hydratation.php</w:t>
-      </w:r>
-      <w:r>
-        <w:rPr>
-          <w:rFonts w:ascii="Calibri" w:cs="Calibri" w:eastAsia="Calibri" w:hAnsi="Calibri"/>
-          <w:sz w:val="22"/>
-          <w:szCs w:val="22"/>
-        </w:rPr>
-        <w:t xml:space="preserve">. Le Repository ne retourne plus des tableaux mais de vrais objets </w:t>
+        <w:t xml:space="preserve">mediatheque.sql</w:t>
+      </w:r>
+      <w:r>
+        <w:rPr>
+          <w:rFonts w:ascii="Calibri" w:cs="Calibri" w:eastAsia="Calibri" w:hAnsi="Calibri"/>
+          <w:sz w:val="22"/>
+          <w:szCs w:val="22"/>
+        </w:rPr>
+        <w:t xml:space="preserve"> et un </w:t>
       </w:r>
       <w:r>
         <w:rPr>
@@ -6761,159 +8010,15 @@
           <w:szCs w:val="20"/>
           <w:shd w:fill="ECECEC" w:val="clear"/>
         </w:rPr>
-        <w:t xml:space="preserve">Livre</w:t>
-      </w:r>
-      <w:r>
-        <w:rPr>
-          <w:rFonts w:ascii="Calibri" w:cs="Calibri" w:eastAsia="Calibri" w:hAnsi="Calibri"/>
-          <w:sz w:val="22"/>
-          <w:szCs w:val="22"/>
-        </w:rPr>
-        <w:t xml:space="preserve">, </w:t>
-      </w:r>
-      <w:r>
-        <w:rPr>
-          <w:rFonts w:ascii="Consolas" w:cs="Consolas" w:eastAsia="Consolas" w:hAnsi="Consolas"/>
-          <w:sz w:val="20"/>
-          <w:szCs w:val="20"/>
-          <w:shd w:fill="ECECEC" w:val="clear"/>
-        </w:rPr>
-        <w:t xml:space="preserve">Dvd</w:t>
-      </w:r>
-      <w:r>
-        <w:rPr>
-          <w:rFonts w:ascii="Calibri" w:cs="Calibri" w:eastAsia="Calibri" w:hAnsi="Calibri"/>
-          <w:sz w:val="22"/>
-          <w:szCs w:val="22"/>
-        </w:rPr>
-        <w:t xml:space="preserve">, </w:t>
-      </w:r>
-      <w:r>
-        <w:rPr>
-          <w:rFonts w:ascii="Consolas" w:cs="Consolas" w:eastAsia="Consolas" w:hAnsi="Consolas"/>
-          <w:sz w:val="20"/>
-          <w:szCs w:val="20"/>
-          <w:shd w:fill="ECECEC" w:val="clear"/>
-        </w:rPr>
-        <w:t xml:space="preserve">JeuVideo</w:t>
-      </w:r>
-      <w:r>
-        <w:rPr>
-          <w:rFonts w:ascii="Calibri" w:cs="Calibri" w:eastAsia="Calibri" w:hAnsi="Calibri"/>
-          <w:sz w:val="22"/>
-          <w:szCs w:val="22"/>
-        </w:rPr>
-        <w:t xml:space="preserve">.</w:t>
-      </w:r>
-    </w:p>
-    <w:p>
-      <w:pPr>
-        <w:spacing w:after="120"/>
-      </w:pPr>
-      <w:r>
-        <w:rPr>
-          <w:rFonts w:ascii="Calibri" w:cs="Calibri" w:eastAsia="Calibri" w:hAnsi="Calibri"/>
-          <w:b/>
-          <w:bCs/>
-          <w:sz w:val="22"/>
-          <w:szCs w:val="22"/>
-        </w:rPr>
-        <w:t xml:space="preserve">Pourquoi la privilégier</w:t>
-      </w:r>
-      <w:r>
-        <w:rPr>
-          <w:rFonts w:ascii="Calibri" w:cs="Calibri" w:eastAsia="Calibri" w:hAnsi="Calibri"/>
-          <w:sz w:val="22"/>
-          <w:szCs w:val="22"/>
-        </w:rPr>
-        <w:t xml:space="preserve"> : c'est l'extension qui referme la boucle de la journée. Le stagiaire qui la réalise comprend rétroactivement à quoi servaient les classes de l'étape 2 — jusque-là, elles pouvaient sembler un exercice gratuit puisque l'étape 3 manipulait des tableaux.</w:t>
-      </w:r>
-    </w:p>
-    <w:p>
-      <w:pPr>
-        <w:spacing w:after="120"/>
-      </w:pPr>
-      <w:r>
-        <w:rPr>
-          <w:rFonts w:ascii="Calibri" w:cs="Calibri" w:eastAsia="Calibri" w:hAnsi="Calibri"/>
-          <w:b/>
-          <w:bCs/>
-          <w:sz w:val="22"/>
-          <w:szCs w:val="22"/>
-        </w:rPr>
-        <w:t xml:space="preserve">Argument jury à leur faire préparer</w:t>
-      </w:r>
-      <w:r>
-        <w:rPr>
-          <w:rFonts w:ascii="Calibri" w:cs="Calibri" w:eastAsia="Calibri" w:hAnsi="Calibri"/>
-          <w:sz w:val="22"/>
-          <w:szCs w:val="22"/>
-        </w:rPr>
-        <w:t xml:space="preserve"> : « J'ai écrit une méthode d'hydratation qui transforme une ligne SQL en objet métier. C'est, en simplifié, ce que fait un ORM comme Doctrine ou Eloquent. » Cette phrase, comprise et défendable, vaut beaucoup à l'oral.</w:t>
-      </w:r>
-    </w:p>
-    <w:p>
-      <w:pPr>
-        <w:spacing w:after="120"/>
-      </w:pPr>
-      <w:r>
-        <w:rPr>
-          <w:rFonts w:ascii="Calibri" w:cs="Calibri" w:eastAsia="Calibri" w:hAnsi="Calibri"/>
-          <w:sz w:val="22"/>
-          <w:szCs w:val="22"/>
-        </w:rPr>
-        <w:t xml:space="preserve">Point technique à surveiller : le bras </w:t>
-      </w:r>
-      <w:r>
-        <w:rPr>
-          <w:rFonts w:ascii="Consolas" w:cs="Consolas" w:eastAsia="Consolas" w:hAnsi="Consolas"/>
-          <w:sz w:val="20"/>
-          <w:szCs w:val="20"/>
-          <w:shd w:fill="ECECEC" w:val="clear"/>
-        </w:rPr>
-        <w:t xml:space="preserve">default</w:t>
-      </w:r>
-      <w:r>
-        <w:rPr>
-          <w:rFonts w:ascii="Calibri" w:cs="Calibri" w:eastAsia="Calibri" w:hAnsi="Calibri"/>
-          <w:sz w:val="22"/>
-          <w:szCs w:val="22"/>
-        </w:rPr>
-        <w:t xml:space="preserve"> du </w:t>
-      </w:r>
-      <w:r>
-        <w:rPr>
-          <w:rFonts w:ascii="Consolas" w:cs="Consolas" w:eastAsia="Consolas" w:hAnsi="Consolas"/>
-          <w:sz w:val="20"/>
-          <w:szCs w:val="20"/>
-          <w:shd w:fill="ECECEC" w:val="clear"/>
-        </w:rPr>
-        <w:t xml:space="preserve">match</w:t>
-      </w:r>
-      <w:r>
-        <w:rPr>
-          <w:rFonts w:ascii="Calibri" w:cs="Calibri" w:eastAsia="Calibri" w:hAnsi="Calibri"/>
-          <w:sz w:val="22"/>
-          <w:szCs w:val="22"/>
-        </w:rPr>
-        <w:t xml:space="preserve"> doit lever une exception. Un stagiaire qui écrit </w:t>
-      </w:r>
-      <w:r>
-        <w:rPr>
-          <w:rFonts w:ascii="Consolas" w:cs="Consolas" w:eastAsia="Consolas" w:hAnsi="Consolas"/>
-          <w:sz w:val="20"/>
-          <w:szCs w:val="20"/>
-          <w:shd w:fill="ECECEC" w:val="clear"/>
-        </w:rPr>
-        <w:t xml:space="preserve">default =&gt; new Livre(...)</w:t>
-      </w:r>
-      <w:r>
-        <w:rPr>
-          <w:rFonts w:ascii="Calibri" w:cs="Calibri" w:eastAsia="Calibri" w:hAnsi="Calibri"/>
-          <w:sz w:val="22"/>
-          <w:szCs w:val="22"/>
-        </w:rPr>
-        <w:t xml:space="preserve"> masque un futur bug — à reprendre.</w:t>
+        <w:t xml:space="preserve">config.php</w:t>
+      </w:r>
+      <w:r>
+        <w:rPr>
+          <w:rFonts w:ascii="Calibri" w:cs="Calibri" w:eastAsia="Calibri" w:hAnsi="Calibri"/>
+          <w:sz w:val="22"/>
+          <w:szCs w:val="22"/>
+        </w:rPr>
+        <w:t xml:space="preserve"> adapté. Vérifiez-les la veille : un corrigé qui ne tourne pas devant la classe coûte plus cher qu'une extension non proposée.</w:t>
       </w:r>
     </w:p>
     <w:p>
@@ -6930,7 +8035,7 @@
           <w:sz w:val="25"/>
           <w:szCs w:val="25"/>
         </w:rPr>
-        <w:t xml:space="preserve">6.2 Transaction</w:t>
+        <w:t xml:space="preserve">6.2 Étape 1 — ISBN, __toString() et jeu d'essai</w:t>
       </w:r>
     </w:p>
     <w:p>
@@ -6943,7 +8048,97 @@
           <w:sz w:val="22"/>
           <w:szCs w:val="22"/>
         </w:rPr>
-        <w:t xml:space="preserve">Fichier </w:t>
+        <w:t xml:space="preserve">Le corrigé est une </w:t>
+      </w:r>
+      <w:r>
+        <w:rPr>
+          <w:rFonts w:ascii="Calibri" w:cs="Calibri" w:eastAsia="Calibri" w:hAnsi="Calibri"/>
+          <w:b/>
+          <w:bCs/>
+          <w:sz w:val="22"/>
+          <w:szCs w:val="22"/>
+        </w:rPr>
+        <w:t xml:space="preserve">classe </w:t>
+      </w:r>
+      <w:r>
+        <w:rPr>
+          <w:rFonts w:ascii="Consolas" w:cs="Consolas" w:eastAsia="Consolas" w:hAnsi="Consolas"/>
+          <w:b/>
+          <w:bCs/>
+          <w:sz w:val="20"/>
+          <w:szCs w:val="20"/>
+          <w:shd w:fill="ECECEC" w:val="clear"/>
+        </w:rPr>
+        <w:t xml:space="preserve">Livre</w:t>
+      </w:r>
+      <w:r>
+        <w:rPr>
+          <w:rFonts w:ascii="Calibri" w:cs="Calibri" w:eastAsia="Calibri" w:hAnsi="Calibri"/>
+          <w:b/>
+          <w:bCs/>
+          <w:sz w:val="22"/>
+          <w:szCs w:val="22"/>
+        </w:rPr>
+        <w:t xml:space="preserve"> complète</w:t>
+      </w:r>
+      <w:r>
+        <w:rPr>
+          <w:rFonts w:ascii="Calibri" w:cs="Calibri" w:eastAsia="Calibri" w:hAnsi="Calibri"/>
+          <w:sz w:val="22"/>
+          <w:szCs w:val="22"/>
+        </w:rPr>
+        <w:t xml:space="preserve">, pas une variante renommée : le stagiaire poursuit son fichier de l'étape 1, il n'en ouvre pas un autre.</w:t>
+      </w:r>
+    </w:p>
+    <w:p>
+      <w:pPr>
+        <w:spacing w:after="120"/>
+      </w:pPr>
+      <w:r>
+        <w:rPr>
+          <w:rFonts w:ascii="Calibri" w:cs="Calibri" w:eastAsia="Calibri" w:hAnsi="Calibri"/>
+          <w:b/>
+          <w:bCs/>
+          <w:sz w:val="22"/>
+          <w:szCs w:val="22"/>
+        </w:rPr>
+        <w:t xml:space="preserve">Le point à faire ressortir</w:t>
+      </w:r>
+      <w:r>
+        <w:rPr>
+          <w:rFonts w:ascii="Calibri" w:cs="Calibri" w:eastAsia="Calibri" w:hAnsi="Calibri"/>
+          <w:sz w:val="22"/>
+          <w:szCs w:val="22"/>
+        </w:rPr>
+        <w:t xml:space="preserve"> : le cours demande « validation de format, 13 chiffres ». Le corrigé va plus loin et vérifie la clé de contrôle ISO 2108. La distinction vaut la digression :</w:t>
+      </w:r>
+    </w:p>
+    <w:p>
+      <w:pPr>
+        <w:pStyle w:val="ListParagraph"/>
+        <w:numPr>
+          <w:ilvl w:val="0"/>
+          <w:numId w:val="2"/>
+        </w:numPr>
+        <w:spacing w:after="60"/>
+      </w:pPr>
+      <w:r>
+        <w:rPr>
+          <w:rFonts w:ascii="Calibri" w:cs="Calibri" w:eastAsia="Calibri" w:hAnsi="Calibri"/>
+          <w:b/>
+          <w:bCs/>
+          <w:sz w:val="22"/>
+          <w:szCs w:val="22"/>
+        </w:rPr>
+        <w:t xml:space="preserve">Validation de format</w:t>
+      </w:r>
+      <w:r>
+        <w:rPr>
+          <w:rFonts w:ascii="Calibri" w:cs="Calibri" w:eastAsia="Calibri" w:hAnsi="Calibri"/>
+          <w:sz w:val="22"/>
+          <w:szCs w:val="22"/>
+        </w:rPr>
+        <w:t xml:space="preserve"> — « ça ressemble à un ISBN ». </w:t>
       </w:r>
       <w:r>
         <w:rPr>
@@ -6952,15 +8147,87 @@
           <w:szCs w:val="20"/>
           <w:shd w:fill="ECECEC" w:val="clear"/>
         </w:rPr>
-        <w:t xml:space="preserve">02-transaction.php</w:t>
-      </w:r>
-      <w:r>
-        <w:rPr>
-          <w:rFonts w:ascii="Calibri" w:cs="Calibri" w:eastAsia="Calibri" w:hAnsi="Calibri"/>
-          <w:sz w:val="22"/>
-          <w:szCs w:val="22"/>
-        </w:rPr>
-        <w:t xml:space="preserve">. Emprunt en deux écritures indissociables, avec </w:t>
+        <w:t xml:space="preserve">1111111111111</w:t>
+      </w:r>
+      <w:r>
+        <w:rPr>
+          <w:rFonts w:ascii="Calibri" w:cs="Calibri" w:eastAsia="Calibri" w:hAnsi="Calibri"/>
+          <w:sz w:val="22"/>
+          <w:szCs w:val="22"/>
+        </w:rPr>
+        <w:t xml:space="preserve"> passerait.</w:t>
+      </w:r>
+    </w:p>
+    <w:p>
+      <w:pPr>
+        <w:pStyle w:val="ListParagraph"/>
+        <w:numPr>
+          <w:ilvl w:val="0"/>
+          <w:numId w:val="2"/>
+        </w:numPr>
+        <w:spacing w:after="60"/>
+      </w:pPr>
+      <w:r>
+        <w:rPr>
+          <w:rFonts w:ascii="Calibri" w:cs="Calibri" w:eastAsia="Calibri" w:hAnsi="Calibri"/>
+          <w:b/>
+          <w:bCs/>
+          <w:sz w:val="22"/>
+          <w:szCs w:val="22"/>
+        </w:rPr>
+        <w:t xml:space="preserve">Validation de validité</w:t>
+      </w:r>
+      <w:r>
+        <w:rPr>
+          <w:rFonts w:ascii="Calibri" w:cs="Calibri" w:eastAsia="Calibri" w:hAnsi="Calibri"/>
+          <w:sz w:val="22"/>
+          <w:szCs w:val="22"/>
+        </w:rPr>
+        <w:t xml:space="preserve"> — « c'est un ISBN réel ». Seul le bon 13e chiffre passe.</w:t>
+      </w:r>
+    </w:p>
+    <w:p>
+      <w:pPr>
+        <w:spacing w:after="120"/>
+      </w:pPr>
+      <w:r>
+        <w:rPr>
+          <w:rFonts w:ascii="Calibri" w:cs="Calibri" w:eastAsia="Calibri" w:hAnsi="Calibri"/>
+          <w:sz w:val="22"/>
+          <w:szCs w:val="22"/>
+        </w:rPr>
+        <w:t xml:space="preserve">Ce raisonnement se transpose tel quel sur IBAN, SIRET, numéro de sécurité sociale, code-barres EAN. C'est </w:t>
+      </w:r>
+      <w:r>
+        <w:rPr>
+          <w:rFonts w:ascii="Calibri" w:cs="Calibri" w:eastAsia="Calibri" w:hAnsi="Calibri"/>
+          <w:b/>
+          <w:bCs/>
+          <w:sz w:val="22"/>
+          <w:szCs w:val="22"/>
+        </w:rPr>
+        <w:t xml:space="preserve">le raisonnement</w:t>
+      </w:r>
+      <w:r>
+        <w:rPr>
+          <w:rFonts w:ascii="Calibri" w:cs="Calibri" w:eastAsia="Calibri" w:hAnsi="Calibri"/>
+          <w:sz w:val="22"/>
+          <w:szCs w:val="22"/>
+        </w:rPr>
+        <w:t xml:space="preserve"> qui intéresse le jury, pas la formule de calcul.</w:t>
+      </w:r>
+    </w:p>
+    <w:p>
+      <w:pPr>
+        <w:spacing w:after="120"/>
+      </w:pPr>
+      <w:r>
+        <w:rPr>
+          <w:rFonts w:ascii="Calibri" w:cs="Calibri" w:eastAsia="Calibri" w:hAnsi="Calibri"/>
+          <w:sz w:val="22"/>
+          <w:szCs w:val="22"/>
+        </w:rPr>
+        <w:t xml:space="preserve">Sur </w:t>
       </w:r>
       <w:r>
         <w:rPr>
@@ -6969,38 +8236,15 @@
           <w:szCs w:val="20"/>
           <w:shd w:fill="ECECEC" w:val="clear"/>
         </w:rPr>
-        <w:t xml:space="preserve">rollBack()</w:t>
-      </w:r>
-      <w:r>
-        <w:rPr>
-          <w:rFonts w:ascii="Calibri" w:cs="Calibri" w:eastAsia="Calibri" w:hAnsi="Calibri"/>
-          <w:sz w:val="22"/>
-          <w:szCs w:val="22"/>
-        </w:rPr>
-        <w:t xml:space="preserve">.</w:t>
-      </w:r>
-    </w:p>
-    <w:p>
-      <w:pPr>
-        <w:spacing w:after="120"/>
-      </w:pPr>
-      <w:r>
-        <w:rPr>
-          <w:rFonts w:ascii="Calibri" w:cs="Calibri" w:eastAsia="Calibri" w:hAnsi="Calibri"/>
-          <w:b/>
-          <w:bCs/>
-          <w:sz w:val="22"/>
-          <w:szCs w:val="22"/>
-        </w:rPr>
-        <w:t xml:space="preserve">Test de vérification à imposer</w:t>
-      </w:r>
-      <w:r>
-        <w:rPr>
-          <w:rFonts w:ascii="Calibri" w:cs="Calibri" w:eastAsia="Calibri" w:hAnsi="Calibri"/>
-          <w:sz w:val="22"/>
-          <w:szCs w:val="22"/>
-        </w:rPr>
-        <w:t xml:space="preserve"> : renommer la table </w:t>
+        <w:t xml:space="preserve">__toString()</w:t>
+      </w:r>
+      <w:r>
+        <w:rPr>
+          <w:rFonts w:ascii="Calibri" w:cs="Calibri" w:eastAsia="Calibri" w:hAnsi="Calibri"/>
+          <w:sz w:val="22"/>
+          <w:szCs w:val="22"/>
+        </w:rPr>
+        <w:t xml:space="preserve">, la réponse attendue à l'oral : </w:t>
       </w:r>
       <w:r>
         <w:rPr>
@@ -7009,15 +8253,15 @@
           <w:szCs w:val="20"/>
           <w:shd w:fill="ECECEC" w:val="clear"/>
         </w:rPr>
-        <w:t xml:space="preserve">emprunts</w:t>
-      </w:r>
-      <w:r>
-        <w:rPr>
-          <w:rFonts w:ascii="Calibri" w:cs="Calibri" w:eastAsia="Calibri" w:hAnsi="Calibri"/>
-          <w:sz w:val="22"/>
-          <w:szCs w:val="22"/>
-        </w:rPr>
-        <w:t xml:space="preserve"> en </w:t>
+        <w:t xml:space="preserve">afficher()</w:t>
+      </w:r>
+      <w:r>
+        <w:rPr>
+          <w:rFonts w:ascii="Calibri" w:cs="Calibri" w:eastAsia="Calibri" w:hAnsi="Calibri"/>
+          <w:sz w:val="22"/>
+          <w:szCs w:val="22"/>
+        </w:rPr>
+        <w:t xml:space="preserve"> est une méthode métier appelée explicitement, dont le nom documente l'intention et dont on peut avoir plusieurs variantes ; </w:t>
       </w:r>
       <w:r>
         <w:rPr>
@@ -7026,80 +8270,15 @@
           <w:szCs w:val="20"/>
           <w:shd w:fill="ECECEC" w:val="clear"/>
         </w:rPr>
-        <w:t xml:space="preserve">emprunts_x</w:t>
-      </w:r>
-      <w:r>
-        <w:rPr>
-          <w:rFonts w:ascii="Calibri" w:cs="Calibri" w:eastAsia="Calibri" w:hAnsi="Calibri"/>
-          <w:sz w:val="22"/>
-          <w:szCs w:val="22"/>
-        </w:rPr>
-        <w:t xml:space="preserve">, relancer un emprunt. Le document doit </w:t>
-      </w:r>
-      <w:r>
-        <w:rPr>
-          <w:rFonts w:ascii="Calibri" w:cs="Calibri" w:eastAsia="Calibri" w:hAnsi="Calibri"/>
-          <w:b/>
-          <w:bCs/>
-          <w:sz w:val="22"/>
-          <w:szCs w:val="22"/>
-        </w:rPr>
-        <w:t xml:space="preserve">rester disponible</w:t>
-      </w:r>
-      <w:r>
-        <w:rPr>
-          <w:rFonts w:ascii="Calibri" w:cs="Calibri" w:eastAsia="Calibri" w:hAnsi="Calibri"/>
-          <w:sz w:val="22"/>
-          <w:szCs w:val="22"/>
-        </w:rPr>
-        <w:t xml:space="preserve">. S'il passe à indisponible, le </w:t>
-      </w:r>
-      <w:r>
-        <w:rPr>
-          <w:rFonts w:ascii="Consolas" w:cs="Consolas" w:eastAsia="Consolas" w:hAnsi="Consolas"/>
-          <w:sz w:val="20"/>
-          <w:szCs w:val="20"/>
-          <w:shd w:fill="ECECEC" w:val="clear"/>
-        </w:rPr>
-        <w:t xml:space="preserve">rollBack()</w:t>
-      </w:r>
-      <w:r>
-        <w:rPr>
-          <w:rFonts w:ascii="Calibri" w:cs="Calibri" w:eastAsia="Calibri" w:hAnsi="Calibri"/>
-          <w:sz w:val="22"/>
-          <w:szCs w:val="22"/>
-        </w:rPr>
-        <w:t xml:space="preserve"> est mal placé — c'est le seul test qui prouve que la transaction fonctionne.</w:t>
-      </w:r>
-    </w:p>
-    <w:p>
-      <w:pPr>
-        <w:spacing w:after="120"/>
-      </w:pPr>
-      <w:r>
-        <w:rPr>
-          <w:rFonts w:ascii="Calibri" w:cs="Calibri" w:eastAsia="Calibri" w:hAnsi="Calibri"/>
-          <w:sz w:val="22"/>
-          <w:szCs w:val="22"/>
-        </w:rPr>
-        <w:t xml:space="preserve">Le </w:t>
-      </w:r>
-      <w:r>
-        <w:rPr>
-          <w:rFonts w:ascii="Consolas" w:cs="Consolas" w:eastAsia="Consolas" w:hAnsi="Consolas"/>
-          <w:sz w:val="20"/>
-          <w:szCs w:val="20"/>
-          <w:shd w:fill="ECECEC" w:val="clear"/>
-        </w:rPr>
-        <w:t xml:space="preserve">FOR UPDATE</w:t>
-      </w:r>
-      <w:r>
-        <w:rPr>
-          <w:rFonts w:ascii="Calibri" w:cs="Calibri" w:eastAsia="Calibri" w:hAnsi="Calibri"/>
-          <w:sz w:val="22"/>
-          <w:szCs w:val="22"/>
-        </w:rPr>
-        <w:t xml:space="preserve"> du corrigé va au-delà de l'attendu. Ne l'imposez pas ; mais si un stagiaire demande « et si deux personnes empruntent en même temps ? », la réponse est là.</w:t>
+        <w:t xml:space="preserve">__toString()</w:t>
+      </w:r>
+      <w:r>
+        <w:rPr>
+          <w:rFonts w:ascii="Calibri" w:cs="Calibri" w:eastAsia="Calibri" w:hAnsi="Calibri"/>
+          <w:sz w:val="22"/>
+          <w:szCs w:val="22"/>
+        </w:rPr>
+        <w:t xml:space="preserve"> est un contrat de conversion invoqué automatiquement par PHP dans tout contexte de chaîne, et unique par classe.</w:t>
       </w:r>
     </w:p>
     <w:p>
@@ -7116,7 +8295,7 @@
           <w:sz w:val="25"/>
           <w:szCs w:val="25"/>
         </w:rPr>
-        <w:t xml:space="preserve">6.3 Enum TypeDocument</w:t>
+        <w:t xml:space="preserve">6.3 Étape 2 — Reservable, le multi-contrat</w:t>
       </w:r>
     </w:p>
     <w:p>
@@ -7126,10 +8305,25 @@
       <w:r>
         <w:rPr>
           <w:rFonts w:ascii="Calibri" w:cs="Calibri" w:eastAsia="Calibri" w:hAnsi="Calibri"/>
-          <w:sz w:val="22"/>
-          <w:szCs w:val="22"/>
-        </w:rPr>
-        <w:t xml:space="preserve">Fichier </w:t>
+          <w:b/>
+          <w:bCs/>
+          <w:sz w:val="22"/>
+          <w:szCs w:val="22"/>
+        </w:rPr>
+        <w:t xml:space="preserve">C'est l'extension la plus formatrice de la journée, et c'est celle à proposer en priorité.</w:t>
+      </w:r>
+    </w:p>
+    <w:p>
+      <w:pPr>
+        <w:spacing w:after="120"/>
+      </w:pPr>
+      <w:r>
+        <w:rPr>
+          <w:rFonts w:ascii="Calibri" w:cs="Calibri" w:eastAsia="Calibri" w:hAnsi="Calibri"/>
+          <w:sz w:val="22"/>
+          <w:szCs w:val="22"/>
+        </w:rPr>
+        <w:t xml:space="preserve">Raison : tant que les trois classes implémentent les mêmes interfaces, l'intérêt d'une interface reste théorique — on pourrait aussi bien mettre </w:t>
       </w:r>
       <w:r>
         <w:rPr>
@@ -7138,28 +8332,15 @@
           <w:szCs w:val="20"/>
           <w:shd w:fill="ECECEC" w:val="clear"/>
         </w:rPr>
-        <w:t xml:space="preserve">03-enum-type-document.php</w:t>
-      </w:r>
-      <w:r>
-        <w:rPr>
-          <w:rFonts w:ascii="Calibri" w:cs="Calibri" w:eastAsia="Calibri" w:hAnsi="Calibri"/>
-          <w:sz w:val="22"/>
-          <w:szCs w:val="22"/>
-        </w:rPr>
-        <w:t xml:space="preserve">. Extension courte, à donner aux stagiaires qui ont fini l'hydratation.</w:t>
-      </w:r>
-    </w:p>
-    <w:p>
-      <w:pPr>
-        <w:spacing w:after="120"/>
-      </w:pPr>
-      <w:r>
-        <w:rPr>
-          <w:rFonts w:ascii="Calibri" w:cs="Calibri" w:eastAsia="Calibri" w:hAnsi="Calibri"/>
-          <w:sz w:val="22"/>
-          <w:szCs w:val="22"/>
-        </w:rPr>
-        <w:t xml:space="preserve">Intérêt pédagogique principal : montrer qu'un enum adossé (</w:t>
+        <w:t xml:space="preserve">emprunter()</w:t>
+      </w:r>
+      <w:r>
+        <w:rPr>
+          <w:rFonts w:ascii="Calibri" w:cs="Calibri" w:eastAsia="Calibri" w:hAnsi="Calibri"/>
+          <w:sz w:val="22"/>
+          <w:szCs w:val="22"/>
+        </w:rPr>
+        <w:t xml:space="preserve"> dans </w:t>
       </w:r>
       <w:r>
         <w:rPr>
@@ -7168,15 +8349,33 @@
           <w:szCs w:val="20"/>
           <w:shd w:fill="ECECEC" w:val="clear"/>
         </w:rPr>
-        <w:t xml:space="preserve">enum TypeDocument: string</w:t>
-      </w:r>
-      <w:r>
-        <w:rPr>
-          <w:rFonts w:ascii="Calibri" w:cs="Calibri" w:eastAsia="Calibri" w:hAnsi="Calibri"/>
-          <w:sz w:val="22"/>
-          <w:szCs w:val="22"/>
-        </w:rPr>
-        <w:t xml:space="preserve">) fait correspondre directement le type PHP et la colonne </w:t>
+        <w:t xml:space="preserve">Document</w:t>
+      </w:r>
+      <w:r>
+        <w:rPr>
+          <w:rFonts w:ascii="Calibri" w:cs="Calibri" w:eastAsia="Calibri" w:hAnsi="Calibri"/>
+          <w:sz w:val="22"/>
+          <w:szCs w:val="22"/>
+        </w:rPr>
+        <w:t xml:space="preserve">. Ici la règle métier de Claire est que </w:t>
+      </w:r>
+      <w:r>
+        <w:rPr>
+          <w:rFonts w:ascii="Calibri" w:cs="Calibri" w:eastAsia="Calibri" w:hAnsi="Calibri"/>
+          <w:b/>
+          <w:bCs/>
+          <w:sz w:val="22"/>
+          <w:szCs w:val="22"/>
+        </w:rPr>
+        <w:t xml:space="preserve">les DVD ne se réservent pas</w:t>
+      </w:r>
+      <w:r>
+        <w:rPr>
+          <w:rFonts w:ascii="Calibri" w:cs="Calibri" w:eastAsia="Calibri" w:hAnsi="Calibri"/>
+          <w:sz w:val="22"/>
+          <w:szCs w:val="22"/>
+        </w:rPr>
+        <w:t xml:space="preserve"> (rotation trop rapide). Donc </w:t>
       </w:r>
       <w:r>
         <w:rPr>
@@ -7185,15 +8384,695 @@
           <w:szCs w:val="20"/>
           <w:shd w:fill="ECECEC" w:val="clear"/>
         </w:rPr>
-        <w:t xml:space="preserve">ENUM</w:t>
-      </w:r>
-      <w:r>
-        <w:rPr>
-          <w:rFonts w:ascii="Calibri" w:cs="Calibri" w:eastAsia="Calibri" w:hAnsi="Calibri"/>
-          <w:sz w:val="22"/>
-          <w:szCs w:val="22"/>
-        </w:rPr>
-        <w:t xml:space="preserve"> MySQL. La conversion devient triviale dans les deux sens.</w:t>
+        <w:t xml:space="preserve">Dvd</w:t>
+      </w:r>
+      <w:r>
+        <w:rPr>
+          <w:rFonts w:ascii="Calibri" w:cs="Calibri" w:eastAsia="Calibri" w:hAnsi="Calibri"/>
+          <w:sz w:val="22"/>
+          <w:szCs w:val="22"/>
+        </w:rPr>
+        <w:t xml:space="preserve"> n'implémente pas </w:t>
+      </w:r>
+      <w:r>
+        <w:rPr>
+          <w:rFonts w:ascii="Consolas" w:cs="Consolas" w:eastAsia="Consolas" w:hAnsi="Consolas"/>
+          <w:sz w:val="20"/>
+          <w:szCs w:val="20"/>
+          <w:shd w:fill="ECECEC" w:val="clear"/>
+        </w:rPr>
+        <w:t xml:space="preserve">Reservable</w:t>
+      </w:r>
+      <w:r>
+        <w:rPr>
+          <w:rFonts w:ascii="Calibri" w:cs="Calibri" w:eastAsia="Calibri" w:hAnsi="Calibri"/>
+          <w:sz w:val="22"/>
+          <w:szCs w:val="22"/>
+        </w:rPr>
+        <w:t xml:space="preserve">.</w:t>
+      </w:r>
+    </w:p>
+    <w:p>
+      <w:pPr>
+        <w:spacing w:after="120"/>
+      </w:pPr>
+      <w:r>
+        <w:rPr>
+          <w:rFonts w:ascii="Calibri" w:cs="Calibri" w:eastAsia="Calibri" w:hAnsi="Calibri"/>
+          <w:sz w:val="22"/>
+          <w:szCs w:val="22"/>
+        </w:rPr>
+        <w:t xml:space="preserve">Le stagiaire se retrouve alors devant un problème qui n'a qu'une seule solution correcte :</w:t>
+      </w:r>
+    </w:p>
+    <w:p>
+      <w:pPr>
+        <w:pStyle w:val="ListParagraph"/>
+        <w:numPr>
+          <w:ilvl w:val="0"/>
+          <w:numId w:val="2"/>
+        </w:numPr>
+        <w:spacing w:after="60"/>
+      </w:pPr>
+      <w:r>
+        <w:rPr>
+          <w:rFonts w:ascii="Calibri" w:cs="Calibri" w:eastAsia="Calibri" w:hAnsi="Calibri"/>
+          <w:sz w:val="22"/>
+          <w:szCs w:val="22"/>
+        </w:rPr>
+        <w:t xml:space="preserve">Mettre </w:t>
+      </w:r>
+      <w:r>
+        <w:rPr>
+          <w:rFonts w:ascii="Consolas" w:cs="Consolas" w:eastAsia="Consolas" w:hAnsi="Consolas"/>
+          <w:sz w:val="20"/>
+          <w:szCs w:val="20"/>
+          <w:shd w:fill="ECECEC" w:val="clear"/>
+        </w:rPr>
+        <w:t xml:space="preserve">reserver()</w:t>
+      </w:r>
+      <w:r>
+        <w:rPr>
+          <w:rFonts w:ascii="Calibri" w:cs="Calibri" w:eastAsia="Calibri" w:hAnsi="Calibri"/>
+          <w:sz w:val="22"/>
+          <w:szCs w:val="22"/>
+        </w:rPr>
+        <w:t xml:space="preserve"> dans </w:t>
+      </w:r>
+      <w:r>
+        <w:rPr>
+          <w:rFonts w:ascii="Consolas" w:cs="Consolas" w:eastAsia="Consolas" w:hAnsi="Consolas"/>
+          <w:sz w:val="20"/>
+          <w:szCs w:val="20"/>
+          <w:shd w:fill="ECECEC" w:val="clear"/>
+        </w:rPr>
+        <w:t xml:space="preserve">Document</w:t>
+      </w:r>
+      <w:r>
+        <w:rPr>
+          <w:rFonts w:ascii="Calibri" w:cs="Calibri" w:eastAsia="Calibri" w:hAnsi="Calibri"/>
+          <w:sz w:val="22"/>
+          <w:szCs w:val="22"/>
+        </w:rPr>
+        <w:t xml:space="preserve"> ? Non — </w:t>
+      </w:r>
+      <w:r>
+        <w:rPr>
+          <w:rFonts w:ascii="Consolas" w:cs="Consolas" w:eastAsia="Consolas" w:hAnsi="Consolas"/>
+          <w:sz w:val="20"/>
+          <w:szCs w:val="20"/>
+          <w:shd w:fill="ECECEC" w:val="clear"/>
+        </w:rPr>
+        <w:t xml:space="preserve">Dvd</w:t>
+      </w:r>
+      <w:r>
+        <w:rPr>
+          <w:rFonts w:ascii="Calibri" w:cs="Calibri" w:eastAsia="Calibri" w:hAnsi="Calibri"/>
+          <w:sz w:val="22"/>
+          <w:szCs w:val="22"/>
+        </w:rPr>
+        <w:t xml:space="preserve"> en hériterait à tort.</w:t>
+      </w:r>
+    </w:p>
+    <w:p>
+      <w:pPr>
+        <w:pStyle w:val="ListParagraph"/>
+        <w:numPr>
+          <w:ilvl w:val="0"/>
+          <w:numId w:val="2"/>
+        </w:numPr>
+        <w:spacing w:after="60"/>
+      </w:pPr>
+      <w:r>
+        <w:rPr>
+          <w:rFonts w:ascii="Calibri" w:cs="Calibri" w:eastAsia="Calibri" w:hAnsi="Calibri"/>
+          <w:sz w:val="22"/>
+          <w:szCs w:val="22"/>
+        </w:rPr>
+        <w:t xml:space="preserve">Créer une classe intermédiaire ? Non — PHP est à héritage simple, et </w:t>
+      </w:r>
+      <w:r>
+        <w:rPr>
+          <w:rFonts w:ascii="Consolas" w:cs="Consolas" w:eastAsia="Consolas" w:hAnsi="Consolas"/>
+          <w:sz w:val="20"/>
+          <w:szCs w:val="20"/>
+          <w:shd w:fill="ECECEC" w:val="clear"/>
+        </w:rPr>
+        <w:t xml:space="preserve">Livre</w:t>
+      </w:r>
+      <w:r>
+        <w:rPr>
+          <w:rFonts w:ascii="Calibri" w:cs="Calibri" w:eastAsia="Calibri" w:hAnsi="Calibri"/>
+          <w:sz w:val="22"/>
+          <w:szCs w:val="22"/>
+        </w:rPr>
+        <w:t xml:space="preserve"> et </w:t>
+      </w:r>
+      <w:r>
+        <w:rPr>
+          <w:rFonts w:ascii="Consolas" w:cs="Consolas" w:eastAsia="Consolas" w:hAnsi="Consolas"/>
+          <w:sz w:val="20"/>
+          <w:szCs w:val="20"/>
+          <w:shd w:fill="ECECEC" w:val="clear"/>
+        </w:rPr>
+        <w:t xml:space="preserve">JeuVideo</w:t>
+      </w:r>
+      <w:r>
+        <w:rPr>
+          <w:rFonts w:ascii="Calibri" w:cs="Calibri" w:eastAsia="Calibri" w:hAnsi="Calibri"/>
+          <w:sz w:val="22"/>
+          <w:szCs w:val="22"/>
+        </w:rPr>
+        <w:t xml:space="preserve"> n'ont rien d'autre en commun.</w:t>
+      </w:r>
+    </w:p>
+    <w:p>
+      <w:pPr>
+        <w:pStyle w:val="ListParagraph"/>
+        <w:numPr>
+          <w:ilvl w:val="0"/>
+          <w:numId w:val="2"/>
+        </w:numPr>
+        <w:spacing w:after="60"/>
+      </w:pPr>
+      <w:r>
+        <w:rPr>
+          <w:rFonts w:ascii="Calibri" w:cs="Calibri" w:eastAsia="Calibri" w:hAnsi="Calibri"/>
+          <w:sz w:val="22"/>
+          <w:szCs w:val="22"/>
+        </w:rPr>
+        <w:t xml:space="preserve">L'interface est la seule réponse. </w:t>
+      </w:r>
+      <w:r>
+        <w:rPr>
+          <w:rFonts w:ascii="Calibri" w:cs="Calibri" w:eastAsia="Calibri" w:hAnsi="Calibri"/>
+          <w:b/>
+          <w:bCs/>
+          <w:sz w:val="22"/>
+          <w:szCs w:val="22"/>
+        </w:rPr>
+        <w:t xml:space="preserve">C'est cette déduction qu'il faut lui faire produire</w:t>
+      </w:r>
+      <w:r>
+        <w:rPr>
+          <w:rFonts w:ascii="Calibri" w:cs="Calibri" w:eastAsia="Calibri" w:hAnsi="Calibri"/>
+          <w:sz w:val="22"/>
+          <w:szCs w:val="22"/>
+        </w:rPr>
+        <w:t xml:space="preserve">, pas la recopie du code.</w:t>
+      </w:r>
+    </w:p>
+    <w:p>
+      <w:pPr>
+        <w:pStyle w:val="Heading3"/>
+        <w:spacing w:after="100" w:before="180"/>
+      </w:pPr>
+      <w:r>
+        <w:rPr>
+          <w:rFonts w:ascii="Calibri" w:cs="Calibri" w:eastAsia="Calibri" w:hAnsi="Calibri"/>
+          <w:b/>
+          <w:bCs/>
+          <w:color w:val="444444"/>
+          <w:sz w:val="22"/>
+          <w:szCs w:val="22"/>
+        </w:rPr>
+        <w:t xml:space="preserve">Le trait, en bonus</w:t>
+      </w:r>
+    </w:p>
+    <w:p>
+      <w:pPr>
+        <w:spacing w:after="120"/>
+      </w:pPr>
+      <w:r>
+        <w:rPr>
+          <w:rFonts w:ascii="Consolas" w:cs="Consolas" w:eastAsia="Consolas" w:hAnsi="Consolas"/>
+          <w:sz w:val="20"/>
+          <w:szCs w:val="20"/>
+          <w:shd w:fill="ECECEC" w:val="clear"/>
+        </w:rPr>
+        <w:t xml:space="preserve">niveau3/etape2/TraitReservation.php</w:t>
+      </w:r>
+      <w:r>
+        <w:rPr>
+          <w:rFonts w:ascii="Calibri" w:cs="Calibri" w:eastAsia="Calibri" w:hAnsi="Calibri"/>
+          <w:sz w:val="22"/>
+          <w:szCs w:val="22"/>
+        </w:rPr>
+        <w:t xml:space="preserve"> répond à la question que posent les meilleurs : « </w:t>
+      </w:r>
+      <w:r>
+        <w:rPr>
+          <w:rFonts w:ascii="Consolas" w:cs="Consolas" w:eastAsia="Consolas" w:hAnsi="Consolas"/>
+          <w:sz w:val="20"/>
+          <w:szCs w:val="20"/>
+          <w:shd w:fill="ECECEC" w:val="clear"/>
+        </w:rPr>
+        <w:t xml:space="preserve">Livre</w:t>
+      </w:r>
+      <w:r>
+        <w:rPr>
+          <w:rFonts w:ascii="Calibri" w:cs="Calibri" w:eastAsia="Calibri" w:hAnsi="Calibri"/>
+          <w:sz w:val="22"/>
+          <w:szCs w:val="22"/>
+        </w:rPr>
+        <w:t xml:space="preserve"> et </w:t>
+      </w:r>
+      <w:r>
+        <w:rPr>
+          <w:rFonts w:ascii="Consolas" w:cs="Consolas" w:eastAsia="Consolas" w:hAnsi="Consolas"/>
+          <w:sz w:val="20"/>
+          <w:szCs w:val="20"/>
+          <w:shd w:fill="ECECEC" w:val="clear"/>
+        </w:rPr>
+        <w:t xml:space="preserve">JeuVideo</w:t>
+      </w:r>
+      <w:r>
+        <w:rPr>
+          <w:rFonts w:ascii="Calibri" w:cs="Calibri" w:eastAsia="Calibri" w:hAnsi="Calibri"/>
+          <w:sz w:val="22"/>
+          <w:szCs w:val="22"/>
+        </w:rPr>
+        <w:t xml:space="preserve"> vont avoir exactement le même code de réservation, on ne peut pas le factoriser ? »</w:t>
+      </w:r>
+    </w:p>
+    <w:p>
+      <w:pPr>
+        <w:spacing w:after="120"/>
+      </w:pPr>
+      <w:r>
+        <w:rPr>
+          <w:rFonts w:ascii="Calibri" w:cs="Calibri" w:eastAsia="Calibri" w:hAnsi="Calibri"/>
+          <w:sz w:val="22"/>
+          <w:szCs w:val="22"/>
+        </w:rPr>
+        <w:t xml:space="preserve">À ne montrer qu'à eux, avec la distinction des trois mécanismes :</w:t>
+      </w:r>
+    </w:p>
+    <w:tbl>
+      <w:tblPr>
+        <w:tblW w:type="dxa" w:w="10200"/>
+        <w:tblBorders>
+          <w:top w:val="single" w:color="auto" w:sz="4"/>
+          <w:left w:val="single" w:color="auto" w:sz="4"/>
+          <w:bottom w:val="single" w:color="auto" w:sz="4"/>
+          <w:right w:val="single" w:color="auto" w:sz="4"/>
+          <w:insideH w:val="single" w:color="auto" w:sz="4"/>
+          <w:insideV w:val="single" w:color="auto" w:sz="4"/>
+        </w:tblBorders>
+      </w:tblPr>
+      <w:tblGrid>
+        <w:gridCol w:w="2200"/>
+        <w:gridCol w:w="2600"/>
+        <w:gridCol w:w="5400"/>
+      </w:tblGrid>
+      <w:tr>
+        <w:trPr>
+          <w:tblHeader/>
+        </w:trPr>
+        <w:tc>
+          <w:tcPr>
+            <w:tcW w:type="dxa" w:w="2200"/>
+            <w:shd w:fill="1F4E79" w:val="clear"/>
+            <w:tcMar>
+              <w:top w:type="dxa" w:w="60"/>
+              <w:left w:type="dxa" w:w="100"/>
+              <w:bottom w:type="dxa" w:w="60"/>
+              <w:right w:type="dxa" w:w="100"/>
+            </w:tcMar>
+          </w:tcPr>
+          <w:p>
+            <w:pPr>
+              <w:spacing w:after="0"/>
+            </w:pPr>
+            <w:r>
+              <w:rPr>
+                <w:rFonts w:ascii="Calibri" w:cs="Calibri" w:eastAsia="Calibri" w:hAnsi="Calibri"/>
+                <w:b/>
+                <w:bCs/>
+                <w:color w:val="FFFFFF"/>
+                <w:sz w:val="22"/>
+                <w:szCs w:val="22"/>
+              </w:rPr>
+              <w:t xml:space="preserve">Mécanisme</w:t>
+            </w:r>
+          </w:p>
+        </w:tc>
+        <w:tc>
+          <w:tcPr>
+            <w:tcW w:type="dxa" w:w="2600"/>
+            <w:shd w:fill="1F4E79" w:val="clear"/>
+            <w:tcMar>
+              <w:top w:type="dxa" w:w="60"/>
+              <w:left w:type="dxa" w:w="100"/>
+              <w:bottom w:type="dxa" w:w="60"/>
+              <w:right w:type="dxa" w:w="100"/>
+            </w:tcMar>
+          </w:tcPr>
+          <w:p>
+            <w:pPr>
+              <w:spacing w:after="0"/>
+            </w:pPr>
+            <w:r>
+              <w:rPr>
+                <w:rFonts w:ascii="Calibri" w:cs="Calibri" w:eastAsia="Calibri" w:hAnsi="Calibri"/>
+                <w:b/>
+                <w:bCs/>
+                <w:color w:val="FFFFFF"/>
+                <w:sz w:val="22"/>
+                <w:szCs w:val="22"/>
+              </w:rPr>
+              <w:t xml:space="preserve">Relation</w:t>
+            </w:r>
+          </w:p>
+        </w:tc>
+        <w:tc>
+          <w:tcPr>
+            <w:tcW w:type="dxa" w:w="5400"/>
+            <w:shd w:fill="1F4E79" w:val="clear"/>
+            <w:tcMar>
+              <w:top w:type="dxa" w:w="60"/>
+              <w:left w:type="dxa" w:w="100"/>
+              <w:bottom w:type="dxa" w:w="60"/>
+              <w:right w:type="dxa" w:w="100"/>
+            </w:tcMar>
+          </w:tcPr>
+          <w:p>
+            <w:pPr>
+              <w:spacing w:after="0"/>
+            </w:pPr>
+            <w:r>
+              <w:rPr>
+                <w:rFonts w:ascii="Calibri" w:cs="Calibri" w:eastAsia="Calibri" w:hAnsi="Calibri"/>
+                <w:b/>
+                <w:bCs/>
+                <w:color w:val="FFFFFF"/>
+                <w:sz w:val="22"/>
+                <w:szCs w:val="22"/>
+              </w:rPr>
+              <w:t xml:space="preserve">Apporte</w:t>
+            </w:r>
+          </w:p>
+        </w:tc>
+      </w:tr>
+      <w:tr>
+        <w:tc>
+          <w:tcPr>
+            <w:tcW w:type="dxa" w:w="2200"/>
+            <w:tcMar>
+              <w:top w:type="dxa" w:w="60"/>
+              <w:left w:type="dxa" w:w="100"/>
+              <w:bottom w:type="dxa" w:w="60"/>
+              <w:right w:type="dxa" w:w="100"/>
+            </w:tcMar>
+          </w:tcPr>
+          <w:p>
+            <w:pPr>
+              <w:spacing w:after="0"/>
+            </w:pPr>
+            <w:r>
+              <w:rPr>
+                <w:rFonts w:ascii="Consolas" w:cs="Consolas" w:eastAsia="Consolas" w:hAnsi="Consolas"/>
+                <w:sz w:val="20"/>
+                <w:szCs w:val="20"/>
+                <w:shd w:fill="ECECEC" w:val="clear"/>
+              </w:rPr>
+              <w:t xml:space="preserve">extends</w:t>
+            </w:r>
+          </w:p>
+        </w:tc>
+        <w:tc>
+          <w:tcPr>
+            <w:tcW w:type="dxa" w:w="2600"/>
+            <w:tcMar>
+              <w:top w:type="dxa" w:w="60"/>
+              <w:left w:type="dxa" w:w="100"/>
+              <w:bottom w:type="dxa" w:w="60"/>
+              <w:right w:type="dxa" w:w="100"/>
+            </w:tcMar>
+          </w:tcPr>
+          <w:p>
+            <w:pPr>
+              <w:spacing w:after="0"/>
+            </w:pPr>
+            <w:r>
+              <w:rPr>
+                <w:rFonts w:ascii="Calibri" w:cs="Calibri" w:eastAsia="Calibri" w:hAnsi="Calibri"/>
+                <w:sz w:val="22"/>
+                <w:szCs w:val="22"/>
+              </w:rPr>
+              <w:t xml:space="preserve">« EST UN »</w:t>
+            </w:r>
+          </w:p>
+        </w:tc>
+        <w:tc>
+          <w:tcPr>
+            <w:tcW w:type="dxa" w:w="5400"/>
+            <w:tcMar>
+              <w:top w:type="dxa" w:w="60"/>
+              <w:left w:type="dxa" w:w="100"/>
+              <w:bottom w:type="dxa" w:w="60"/>
+              <w:right w:type="dxa" w:w="100"/>
+            </w:tcMar>
+          </w:tcPr>
+          <w:p>
+            <w:pPr>
+              <w:spacing w:after="0"/>
+            </w:pPr>
+            <w:r>
+              <w:rPr>
+                <w:rFonts w:ascii="Calibri" w:cs="Calibri" w:eastAsia="Calibri" w:hAnsi="Calibri"/>
+                <w:sz w:val="22"/>
+                <w:szCs w:val="22"/>
+              </w:rPr>
+              <w:t xml:space="preserve">Un type et du code</w:t>
+            </w:r>
+          </w:p>
+        </w:tc>
+      </w:tr>
+      <w:tr>
+        <w:tc>
+          <w:tcPr>
+            <w:tcW w:type="dxa" w:w="2200"/>
+            <w:tcMar>
+              <w:top w:type="dxa" w:w="60"/>
+              <w:left w:type="dxa" w:w="100"/>
+              <w:bottom w:type="dxa" w:w="60"/>
+              <w:right w:type="dxa" w:w="100"/>
+            </w:tcMar>
+          </w:tcPr>
+          <w:p>
+            <w:pPr>
+              <w:spacing w:after="0"/>
+            </w:pPr>
+            <w:r>
+              <w:rPr>
+                <w:rFonts w:ascii="Consolas" w:cs="Consolas" w:eastAsia="Consolas" w:hAnsi="Consolas"/>
+                <w:sz w:val="20"/>
+                <w:szCs w:val="20"/>
+                <w:shd w:fill="ECECEC" w:val="clear"/>
+              </w:rPr>
+              <w:t xml:space="preserve">implements</w:t>
+            </w:r>
+          </w:p>
+        </w:tc>
+        <w:tc>
+          <w:tcPr>
+            <w:tcW w:type="dxa" w:w="2600"/>
+            <w:tcMar>
+              <w:top w:type="dxa" w:w="60"/>
+              <w:left w:type="dxa" w:w="100"/>
+              <w:bottom w:type="dxa" w:w="60"/>
+              <w:right w:type="dxa" w:w="100"/>
+            </w:tcMar>
+          </w:tcPr>
+          <w:p>
+            <w:pPr>
+              <w:spacing w:after="0"/>
+            </w:pPr>
+            <w:r>
+              <w:rPr>
+                <w:rFonts w:ascii="Calibri" w:cs="Calibri" w:eastAsia="Calibri" w:hAnsi="Calibri"/>
+                <w:sz w:val="22"/>
+                <w:szCs w:val="22"/>
+              </w:rPr>
+              <w:t xml:space="preserve">« SAIT FAIRE »</w:t>
+            </w:r>
+          </w:p>
+        </w:tc>
+        <w:tc>
+          <w:tcPr>
+            <w:tcW w:type="dxa" w:w="5400"/>
+            <w:tcMar>
+              <w:top w:type="dxa" w:w="60"/>
+              <w:left w:type="dxa" w:w="100"/>
+              <w:bottom w:type="dxa" w:w="60"/>
+              <w:right w:type="dxa" w:w="100"/>
+            </w:tcMar>
+          </w:tcPr>
+          <w:p>
+            <w:pPr>
+              <w:spacing w:after="0"/>
+            </w:pPr>
+            <w:r>
+              <w:rPr>
+                <w:rFonts w:ascii="Calibri" w:cs="Calibri" w:eastAsia="Calibri" w:hAnsi="Calibri"/>
+                <w:sz w:val="22"/>
+                <w:szCs w:val="22"/>
+              </w:rPr>
+              <w:t xml:space="preserve">Un type, sans code</w:t>
+            </w:r>
+          </w:p>
+        </w:tc>
+      </w:tr>
+      <w:tr>
+        <w:tc>
+          <w:tcPr>
+            <w:tcW w:type="dxa" w:w="2200"/>
+            <w:tcMar>
+              <w:top w:type="dxa" w:w="60"/>
+              <w:left w:type="dxa" w:w="100"/>
+              <w:bottom w:type="dxa" w:w="60"/>
+              <w:right w:type="dxa" w:w="100"/>
+            </w:tcMar>
+          </w:tcPr>
+          <w:p>
+            <w:pPr>
+              <w:spacing w:after="0"/>
+            </w:pPr>
+            <w:r>
+              <w:rPr>
+                <w:rFonts w:ascii="Consolas" w:cs="Consolas" w:eastAsia="Consolas" w:hAnsi="Consolas"/>
+                <w:sz w:val="20"/>
+                <w:szCs w:val="20"/>
+                <w:shd w:fill="ECECEC" w:val="clear"/>
+              </w:rPr>
+              <w:t xml:space="preserve">use</w:t>
+            </w:r>
+            <w:r>
+              <w:rPr>
+                <w:rFonts w:ascii="Calibri" w:cs="Calibri" w:eastAsia="Calibri" w:hAnsi="Calibri"/>
+                <w:sz w:val="22"/>
+                <w:szCs w:val="22"/>
+              </w:rPr>
+              <w:t xml:space="preserve"> (trait)</w:t>
+            </w:r>
+          </w:p>
+        </w:tc>
+        <w:tc>
+          <w:tcPr>
+            <w:tcW w:type="dxa" w:w="2600"/>
+            <w:tcMar>
+              <w:top w:type="dxa" w:w="60"/>
+              <w:left w:type="dxa" w:w="100"/>
+              <w:bottom w:type="dxa" w:w="60"/>
+              <w:right w:type="dxa" w:w="100"/>
+            </w:tcMar>
+          </w:tcPr>
+          <w:p>
+            <w:pPr>
+              <w:spacing w:after="0"/>
+            </w:pPr>
+            <w:r>
+              <w:rPr>
+                <w:rFonts w:ascii="Calibri" w:cs="Calibri" w:eastAsia="Calibri" w:hAnsi="Calibri"/>
+                <w:sz w:val="22"/>
+                <w:szCs w:val="22"/>
+              </w:rPr>
+              <w:t xml:space="preserve">« PARTAGE »</w:t>
+            </w:r>
+          </w:p>
+        </w:tc>
+        <w:tc>
+          <w:tcPr>
+            <w:tcW w:type="dxa" w:w="5400"/>
+            <w:tcMar>
+              <w:top w:type="dxa" w:w="60"/>
+              <w:left w:type="dxa" w:w="100"/>
+              <w:bottom w:type="dxa" w:w="60"/>
+              <w:right w:type="dxa" w:w="100"/>
+            </w:tcMar>
+          </w:tcPr>
+          <w:p>
+            <w:pPr>
+              <w:spacing w:after="0"/>
+            </w:pPr>
+            <w:r>
+              <w:rPr>
+                <w:rFonts w:ascii="Calibri" w:cs="Calibri" w:eastAsia="Calibri" w:hAnsi="Calibri"/>
+                <w:sz w:val="22"/>
+                <w:szCs w:val="22"/>
+              </w:rPr>
+              <w:t xml:space="preserve">Du code, sans type</w:t>
+            </w:r>
+          </w:p>
+        </w:tc>
+      </w:tr>
+    </w:tbl>
+    <w:p>
+      <w:pPr>
+        <w:spacing w:after="60"/>
+      </w:pPr>
+    </w:p>
+    <w:p>
+      <w:pPr>
+        <w:pBdr>
+          <w:left w:val="single" w:color="1F4E79" w:sz="18"/>
+        </w:pBdr>
+        <w:shd w:fill="FDEADA" w:val="clear"/>
+        <w:spacing w:after="160" w:before="120"/>
+        <w:ind w:left="240" w:right="240"/>
+      </w:pPr>
+      <w:r>
+        <w:rPr>
+          <w:rFonts w:ascii="Calibri" w:cs="Calibri" w:eastAsia="Calibri" w:hAnsi="Calibri"/>
+          <w:b/>
+          <w:bCs/>
+          <w:sz w:val="22"/>
+          <w:szCs w:val="22"/>
+        </w:rPr>
+        <w:t xml:space="preserve">[NOTE]  </w:t>
+      </w:r>
+      <w:r>
+        <w:rPr>
+          <w:rFonts w:ascii="Calibri" w:cs="Calibri" w:eastAsia="Calibri" w:hAnsi="Calibri"/>
+          <w:sz w:val="22"/>
+          <w:szCs w:val="22"/>
+        </w:rPr>
+        <w:t xml:space="preserve">Le trait est souvent présenté comme « du multi-héritage en PHP ». C'est faux, et un jury attentif relèvera la formulation. Un trait est de la copie de code à la compilation : </w:t>
+      </w:r>
+      <w:r>
+        <w:rPr>
+          <w:rFonts w:ascii="Consolas" w:cs="Consolas" w:eastAsia="Consolas" w:hAnsi="Consolas"/>
+          <w:sz w:val="20"/>
+          <w:szCs w:val="20"/>
+          <w:shd w:fill="ECECEC" w:val="clear"/>
+        </w:rPr>
+        <w:t xml:space="preserve">$objet instanceof MonTrait</w:t>
+      </w:r>
+      <w:r>
+        <w:rPr>
+          <w:rFonts w:ascii="Calibri" w:cs="Calibri" w:eastAsia="Calibri" w:hAnsi="Calibri"/>
+          <w:sz w:val="22"/>
+          <w:szCs w:val="22"/>
+        </w:rPr>
+        <w:t xml:space="preserve"> est une erreur de syntaxe. C'est pour cela que le corrigé garde l'interface </w:t>
+      </w:r>
+      <w:r>
+        <w:rPr>
+          <w:rFonts w:ascii="Consolas" w:cs="Consolas" w:eastAsia="Consolas" w:hAnsi="Consolas"/>
+          <w:sz w:val="20"/>
+          <w:szCs w:val="20"/>
+          <w:shd w:fill="ECECEC" w:val="clear"/>
+        </w:rPr>
+        <w:t xml:space="preserve">Reservable</w:t>
+      </w:r>
+      <w:r>
+        <w:rPr>
+          <w:rFonts w:ascii="Calibri" w:cs="Calibri" w:eastAsia="Calibri" w:hAnsi="Calibri"/>
+          <w:sz w:val="22"/>
+          <w:szCs w:val="22"/>
+        </w:rPr>
+        <w:t xml:space="preserve"> À CÔTÉ du trait — l'interface donne le type, le trait donne l'implémentation.</w:t>
       </w:r>
     </w:p>
     <w:p>
@@ -7210,7 +9089,7 @@
           <w:sz w:val="25"/>
           <w:szCs w:val="25"/>
         </w:rPr>
-        <w:t xml:space="preserve">6.4 ISBN et jeu d'essai</w:t>
+        <w:t xml:space="preserve">6.4 Étape 2 — enum TypeDocument</w:t>
       </w:r>
     </w:p>
     <w:p>
@@ -7223,7 +9102,7 @@
           <w:sz w:val="22"/>
           <w:szCs w:val="22"/>
         </w:rPr>
-        <w:t xml:space="preserve">Fichier </w:t>
+        <w:t xml:space="preserve">Extension courte, à donner après </w:t>
       </w:r>
       <w:r>
         <w:rPr>
@@ -7232,33 +9111,15 @@
           <w:szCs w:val="20"/>
           <w:shd w:fill="ECECEC" w:val="clear"/>
         </w:rPr>
-        <w:t xml:space="preserve">04-isbn-et-tostring.php</w:t>
-      </w:r>
-      <w:r>
-        <w:rPr>
-          <w:rFonts w:ascii="Calibri" w:cs="Calibri" w:eastAsia="Calibri" w:hAnsi="Calibri"/>
-          <w:sz w:val="22"/>
-          <w:szCs w:val="22"/>
-        </w:rPr>
-        <w:t xml:space="preserve">. Contient une validation ISBN-13 </w:t>
-      </w:r>
-      <w:r>
-        <w:rPr>
-          <w:rFonts w:ascii="Calibri" w:cs="Calibri" w:eastAsia="Calibri" w:hAnsi="Calibri"/>
-          <w:b/>
-          <w:bCs/>
-          <w:sz w:val="22"/>
-          <w:szCs w:val="22"/>
-        </w:rPr>
-        <w:t xml:space="preserve">avec clé de contrôle</w:t>
-      </w:r>
-      <w:r>
-        <w:rPr>
-          <w:rFonts w:ascii="Calibri" w:cs="Calibri" w:eastAsia="Calibri" w:hAnsi="Calibri"/>
-          <w:sz w:val="22"/>
-          <w:szCs w:val="22"/>
-        </w:rPr>
-        <w:t xml:space="preserve">, et un jeu d'essai de 5 cas exécutable (</w:t>
+        <w:t xml:space="preserve">Reservable</w:t>
+      </w:r>
+      <w:r>
+        <w:rPr>
+          <w:rFonts w:ascii="Calibri" w:cs="Calibri" w:eastAsia="Calibri" w:hAnsi="Calibri"/>
+          <w:sz w:val="22"/>
+          <w:szCs w:val="22"/>
+        </w:rPr>
+        <w:t xml:space="preserve">. Le corrigé va au-delà du cours en ajoutant </w:t>
       </w:r>
       <w:r>
         <w:rPr>
@@ -7267,15 +9128,15 @@
           <w:szCs w:val="20"/>
           <w:shd w:fill="ECECEC" w:val="clear"/>
         </w:rPr>
-        <w:t xml:space="preserve">php extensions-niveau3/04-isbn-et-tostring.php</w:t>
-      </w:r>
-      <w:r>
-        <w:rPr>
-          <w:rFonts w:ascii="Calibri" w:cs="Calibri" w:eastAsia="Calibri" w:hAnsi="Calibri"/>
-          <w:sz w:val="22"/>
-          <w:szCs w:val="22"/>
-        </w:rPr>
-        <w:t xml:space="preserve"> → 5/5).</w:t>
+        <w:t xml:space="preserve">estReservable()</w:t>
+      </w:r>
+      <w:r>
+        <w:rPr>
+          <w:rFonts w:ascii="Calibri" w:cs="Calibri" w:eastAsia="Calibri" w:hAnsi="Calibri"/>
+          <w:sz w:val="22"/>
+          <w:szCs w:val="22"/>
+        </w:rPr>
+        <w:t xml:space="preserve"> sur l'enum — et c'est délibéré, car cela ouvre le point de discussion le plus intéressant de la journée.</w:t>
       </w:r>
     </w:p>
     <w:p>
@@ -7285,20 +9146,10 @@
       <w:r>
         <w:rPr>
           <w:rFonts w:ascii="Calibri" w:cs="Calibri" w:eastAsia="Calibri" w:hAnsi="Calibri"/>
-          <w:b/>
-          <w:bCs/>
-          <w:sz w:val="22"/>
-          <w:szCs w:val="22"/>
-        </w:rPr>
-        <w:t xml:space="preserve">Le point à faire ressortir</w:t>
-      </w:r>
-      <w:r>
-        <w:rPr>
-          <w:rFonts w:ascii="Calibri" w:cs="Calibri" w:eastAsia="Calibri" w:hAnsi="Calibri"/>
-          <w:sz w:val="22"/>
-          <w:szCs w:val="22"/>
-        </w:rPr>
-        <w:t xml:space="preserve"> : la plupart des stagiaires valident « 13 chiffres » et s'arrêtent là. </w:t>
+          <w:sz w:val="22"/>
+          <w:szCs w:val="22"/>
+        </w:rPr>
+        <w:t xml:space="preserve">Le bloc 5 de </w:t>
       </w:r>
       <w:r>
         <w:rPr>
@@ -7307,15 +9158,15 @@
           <w:szCs w:val="20"/>
           <w:shd w:fill="ECECEC" w:val="clear"/>
         </w:rPr>
-        <w:t xml:space="preserve">1111111111111</w:t>
-      </w:r>
-      <w:r>
-        <w:rPr>
-          <w:rFonts w:ascii="Calibri" w:cs="Calibri" w:eastAsia="Calibri" w:hAnsi="Calibri"/>
-          <w:sz w:val="22"/>
-          <w:szCs w:val="22"/>
-        </w:rPr>
-        <w:t xml:space="preserve"> passerait. La distinction entre </w:t>
+        <w:t xml:space="preserve">niveau3/etape2/index.php</w:t>
+      </w:r>
+      <w:r>
+        <w:rPr>
+          <w:rFonts w:ascii="Calibri" w:cs="Calibri" w:eastAsia="Calibri" w:hAnsi="Calibri"/>
+          <w:sz w:val="22"/>
+          <w:szCs w:val="22"/>
+        </w:rPr>
+        <w:t xml:space="preserve"> montre que l'enum et l'interface disent la même chose. Donc l'une des deux est redondante. </w:t>
       </w:r>
       <w:r>
         <w:rPr>
@@ -7325,33 +9176,65 @@
           <w:sz w:val="22"/>
           <w:szCs w:val="22"/>
         </w:rPr>
-        <w:t xml:space="preserve">validation de format</w:t>
-      </w:r>
-      <w:r>
-        <w:rPr>
-          <w:rFonts w:ascii="Calibri" w:cs="Calibri" w:eastAsia="Calibri" w:hAnsi="Calibri"/>
-          <w:sz w:val="22"/>
-          <w:szCs w:val="22"/>
-        </w:rPr>
-        <w:t xml:space="preserve"> et </w:t>
-      </w:r>
+        <w:t xml:space="preserve">Question à poser</w:t>
+      </w:r>
+      <w:r>
+        <w:rPr>
+          <w:rFonts w:ascii="Calibri" w:cs="Calibri" w:eastAsia="Calibri" w:hAnsi="Calibri"/>
+          <w:sz w:val="22"/>
+          <w:szCs w:val="22"/>
+        </w:rPr>
+        <w:t xml:space="preserve"> : laquelle garder ?</w:t>
+      </w:r>
+    </w:p>
+    <w:p>
+      <w:pPr>
+        <w:spacing w:after="120"/>
+      </w:pPr>
+      <w:r>
+        <w:rPr>
+          <w:rFonts w:ascii="Calibri" w:cs="Calibri" w:eastAsia="Calibri" w:hAnsi="Calibri"/>
+          <w:i/>
+          <w:iCs/>
+          <w:color w:val="555555"/>
+          <w:sz w:val="22"/>
+          <w:szCs w:val="22"/>
+        </w:rPr>
+        <w:t xml:space="preserve">*Réponse attendue : l'interface. Elle est vérifiée par PHP au chargement de la classe, alors que la méthode de l'enum est une liste maintenue à la main qui peut diverger silencieusement du code réel.*</w:t>
+      </w:r>
+    </w:p>
+    <w:p>
+      <w:pPr>
+        <w:pStyle w:val="Heading2"/>
+        <w:spacing w:after="120" w:before="240"/>
+      </w:pPr>
       <w:r>
         <w:rPr>
           <w:rFonts w:ascii="Calibri" w:cs="Calibri" w:eastAsia="Calibri" w:hAnsi="Calibri"/>
           <w:b/>
           <w:bCs/>
-          <w:sz w:val="22"/>
-          <w:szCs w:val="22"/>
-        </w:rPr>
-        <w:t xml:space="preserve">validation de validité</w:t>
-      </w:r>
-      <w:r>
-        <w:rPr>
-          <w:rFonts w:ascii="Calibri" w:cs="Calibri" w:eastAsia="Calibri" w:hAnsi="Calibri"/>
-          <w:sz w:val="22"/>
-          <w:szCs w:val="22"/>
-        </w:rPr>
-        <w:t xml:space="preserve"> est un raisonnement qui se transpose partout — IBAN, SIRET, numéro de sécurité sociale, code produit.</w:t>
+          <w:color w:val="1F4E79"/>
+          <w:sz w:val="25"/>
+          <w:szCs w:val="25"/>
+        </w:rPr>
+        <w:t xml:space="preserve">6.5 Étape 3 — hydratation et transaction</w:t>
+      </w:r>
+    </w:p>
+    <w:p>
+      <w:pPr>
+        <w:pStyle w:val="Heading3"/>
+        <w:spacing w:after="100" w:before="180"/>
+      </w:pPr>
+      <w:r>
+        <w:rPr>
+          <w:rFonts w:ascii="Calibri" w:cs="Calibri" w:eastAsia="Calibri" w:hAnsi="Calibri"/>
+          <w:b/>
+          <w:bCs/>
+          <w:color w:val="444444"/>
+          <w:sz w:val="22"/>
+          <w:szCs w:val="22"/>
+        </w:rPr>
+        <w:t xml:space="preserve">Hydratation</w:t>
       </w:r>
     </w:p>
     <w:p>
@@ -7364,7 +9247,30 @@
           <w:sz w:val="22"/>
           <w:szCs w:val="22"/>
         </w:rPr>
-        <w:t xml:space="preserve">La fonction </w:t>
+        <w:t xml:space="preserve">L'extension qui referme la boucle de la journée : jusque-là l'étape 3 manipulait des tableaux associatifs, et les classes de l'étape 2 pouvaient sembler un exercice gratuit. Elles deviennent la sortie du Repository.</w:t>
+      </w:r>
+    </w:p>
+    <w:p>
+      <w:pPr>
+        <w:spacing w:after="120"/>
+      </w:pPr>
+      <w:r>
+        <w:rPr>
+          <w:rFonts w:ascii="Calibri" w:cs="Calibri" w:eastAsia="Calibri" w:hAnsi="Calibri"/>
+          <w:b/>
+          <w:bCs/>
+          <w:sz w:val="22"/>
+          <w:szCs w:val="22"/>
+        </w:rPr>
+        <w:t xml:space="preserve">Point de correction non négociable</w:t>
+      </w:r>
+      <w:r>
+        <w:rPr>
+          <w:rFonts w:ascii="Calibri" w:cs="Calibri" w:eastAsia="Calibri" w:hAnsi="Calibri"/>
+          <w:sz w:val="22"/>
+          <w:szCs w:val="22"/>
+        </w:rPr>
+        <w:t xml:space="preserve"> : le bras </w:t>
       </w:r>
       <w:r>
         <w:rPr>
@@ -7373,15 +9279,244 @@
           <w:szCs w:val="20"/>
           <w:shd w:fill="ECECEC" w:val="clear"/>
         </w:rPr>
-        <w:t xml:space="preserve">verifier()</w:t>
-      </w:r>
-      <w:r>
-        <w:rPr>
-          <w:rFonts w:ascii="Calibri" w:cs="Calibri" w:eastAsia="Calibri" w:hAnsi="Calibri"/>
-          <w:sz w:val="22"/>
-          <w:szCs w:val="22"/>
-        </w:rPr>
-        <w:t xml:space="preserve"> du fichier est un micro-framework de test volontairement minimal. Elle prépare PHPUnit sans en imposer l'installation. Pour les stagiaires les plus avancés, c'est le bon moment pour montrer l'équivalent en PHPUnit et faire le rapprochement.</w:t>
+        <w:t xml:space="preserve">default</w:t>
+      </w:r>
+      <w:r>
+        <w:rPr>
+          <w:rFonts w:ascii="Calibri" w:cs="Calibri" w:eastAsia="Calibri" w:hAnsi="Calibri"/>
+          <w:sz w:val="22"/>
+          <w:szCs w:val="22"/>
+        </w:rPr>
+        <w:t xml:space="preserve"> du </w:t>
+      </w:r>
+      <w:r>
+        <w:rPr>
+          <w:rFonts w:ascii="Consolas" w:cs="Consolas" w:eastAsia="Consolas" w:hAnsi="Consolas"/>
+          <w:sz w:val="20"/>
+          <w:szCs w:val="20"/>
+          <w:shd w:fill="ECECEC" w:val="clear"/>
+        </w:rPr>
+        <w:t xml:space="preserve">match</w:t>
+      </w:r>
+      <w:r>
+        <w:rPr>
+          <w:rFonts w:ascii="Calibri" w:cs="Calibri" w:eastAsia="Calibri" w:hAnsi="Calibri"/>
+          <w:sz w:val="22"/>
+          <w:szCs w:val="22"/>
+        </w:rPr>
+        <w:t xml:space="preserve"> doit lever une exception. Un stagiaire qui écrit </w:t>
+      </w:r>
+      <w:r>
+        <w:rPr>
+          <w:rFonts w:ascii="Consolas" w:cs="Consolas" w:eastAsia="Consolas" w:hAnsi="Consolas"/>
+          <w:sz w:val="20"/>
+          <w:szCs w:val="20"/>
+          <w:shd w:fill="ECECEC" w:val="clear"/>
+        </w:rPr>
+        <w:t xml:space="preserve">default =&gt; new Livre(...)</w:t>
+      </w:r>
+      <w:r>
+        <w:rPr>
+          <w:rFonts w:ascii="Calibri" w:cs="Calibri" w:eastAsia="Calibri" w:hAnsi="Calibri"/>
+          <w:sz w:val="22"/>
+          <w:szCs w:val="22"/>
+        </w:rPr>
+        <w:t xml:space="preserve"> masque un futur bug — le jour où un type est ajouté en base sans mise à jour du code, il obtiendra un objet silencieusement faux au lieu d'une erreur.</w:t>
+      </w:r>
+    </w:p>
+    <w:p>
+      <w:pPr>
+        <w:pStyle w:val="Heading3"/>
+        <w:spacing w:after="100" w:before="180"/>
+      </w:pPr>
+      <w:r>
+        <w:rPr>
+          <w:rFonts w:ascii="Calibri" w:cs="Calibri" w:eastAsia="Calibri" w:hAnsi="Calibri"/>
+          <w:b/>
+          <w:bCs/>
+          <w:color w:val="444444"/>
+          <w:sz w:val="22"/>
+          <w:szCs w:val="22"/>
+        </w:rPr>
+        <w:t xml:space="preserve">Transaction — le test de sabotage</w:t>
+      </w:r>
+    </w:p>
+    <w:p>
+      <w:pPr>
+        <w:spacing w:after="120"/>
+      </w:pPr>
+      <w:r>
+        <w:rPr>
+          <w:rFonts w:ascii="Calibri" w:cs="Calibri" w:eastAsia="Calibri" w:hAnsi="Calibri"/>
+          <w:b/>
+          <w:bCs/>
+          <w:sz w:val="22"/>
+          <w:szCs w:val="22"/>
+        </w:rPr>
+        <w:t xml:space="preserve">Le cas nominal ne prouve rien</w:t>
+      </w:r>
+      <w:r>
+        <w:rPr>
+          <w:rFonts w:ascii="Calibri" w:cs="Calibri" w:eastAsia="Calibri" w:hAnsi="Calibri"/>
+          <w:sz w:val="22"/>
+          <w:szCs w:val="22"/>
+        </w:rPr>
+        <w:t xml:space="preserve"> : il passerait aussi sans transaction. Imposez ce protocole :</w:t>
+      </w:r>
+    </w:p>
+    <w:p>
+      <w:pPr>
+        <w:pStyle w:val="ListParagraph"/>
+        <w:numPr>
+          <w:ilvl w:val="0"/>
+          <w:numId w:val="2"/>
+        </w:numPr>
+        <w:spacing w:after="60"/>
+      </w:pPr>
+      <w:r>
+        <w:rPr>
+          <w:rFonts w:ascii="Calibri" w:cs="Calibri" w:eastAsia="Calibri" w:hAnsi="Calibri"/>
+          <w:sz w:val="22"/>
+          <w:szCs w:val="22"/>
+        </w:rPr>
+        <w:t xml:space="preserve">Faire fonctionner un emprunt normal, vérifier les deux tables.</w:t>
+      </w:r>
+    </w:p>
+    <w:p>
+      <w:pPr>
+        <w:pStyle w:val="ListParagraph"/>
+        <w:numPr>
+          <w:ilvl w:val="0"/>
+          <w:numId w:val="2"/>
+        </w:numPr>
+        <w:spacing w:after="60"/>
+      </w:pPr>
+      <w:r>
+        <w:rPr>
+          <w:rFonts w:ascii="Consolas" w:cs="Consolas" w:eastAsia="Consolas" w:hAnsi="Consolas"/>
+          <w:sz w:val="20"/>
+          <w:szCs w:val="20"/>
+          <w:shd w:fill="ECECEC" w:val="clear"/>
+        </w:rPr>
+        <w:t xml:space="preserve">RENAME TABLE emprunts TO emprunts_x;</w:t>
+      </w:r>
+    </w:p>
+    <w:p>
+      <w:pPr>
+        <w:pStyle w:val="ListParagraph"/>
+        <w:numPr>
+          <w:ilvl w:val="0"/>
+          <w:numId w:val="2"/>
+        </w:numPr>
+        <w:spacing w:after="60"/>
+      </w:pPr>
+      <w:r>
+        <w:rPr>
+          <w:rFonts w:ascii="Calibri" w:cs="Calibri" w:eastAsia="Calibri" w:hAnsi="Calibri"/>
+          <w:sz w:val="22"/>
+          <w:szCs w:val="22"/>
+        </w:rPr>
+        <w:t xml:space="preserve">Relancer un emprunt : il doit échouer </w:t>
+      </w:r>
+      <w:r>
+        <w:rPr>
+          <w:rFonts w:ascii="Calibri" w:cs="Calibri" w:eastAsia="Calibri" w:hAnsi="Calibri"/>
+          <w:b/>
+          <w:bCs/>
+          <w:sz w:val="22"/>
+          <w:szCs w:val="22"/>
+        </w:rPr>
+        <w:t xml:space="preserve">et le document doit rester disponible</w:t>
+      </w:r>
+      <w:r>
+        <w:rPr>
+          <w:rFonts w:ascii="Calibri" w:cs="Calibri" w:eastAsia="Calibri" w:hAnsi="Calibri"/>
+          <w:sz w:val="22"/>
+          <w:szCs w:val="22"/>
+        </w:rPr>
+        <w:t xml:space="preserve">.</w:t>
+      </w:r>
+    </w:p>
+    <w:p>
+      <w:pPr>
+        <w:pStyle w:val="ListParagraph"/>
+        <w:numPr>
+          <w:ilvl w:val="0"/>
+          <w:numId w:val="2"/>
+        </w:numPr>
+        <w:spacing w:after="60"/>
+      </w:pPr>
+      <w:r>
+        <w:rPr>
+          <w:rFonts w:ascii="Calibri" w:cs="Calibri" w:eastAsia="Calibri" w:hAnsi="Calibri"/>
+          <w:sz w:val="22"/>
+          <w:szCs w:val="22"/>
+        </w:rPr>
+        <w:t xml:space="preserve">Si le document est passé à indisponible, le </w:t>
+      </w:r>
+      <w:r>
+        <w:rPr>
+          <w:rFonts w:ascii="Consolas" w:cs="Consolas" w:eastAsia="Consolas" w:hAnsi="Consolas"/>
+          <w:sz w:val="20"/>
+          <w:szCs w:val="20"/>
+          <w:shd w:fill="ECECEC" w:val="clear"/>
+        </w:rPr>
+        <w:t xml:space="preserve">rollBack()</w:t>
+      </w:r>
+      <w:r>
+        <w:rPr>
+          <w:rFonts w:ascii="Calibri" w:cs="Calibri" w:eastAsia="Calibri" w:hAnsi="Calibri"/>
+          <w:sz w:val="22"/>
+          <w:szCs w:val="22"/>
+        </w:rPr>
+        <w:t xml:space="preserve"> est mal placé ou absent.</w:t>
+      </w:r>
+    </w:p>
+    <w:p>
+      <w:pPr>
+        <w:pStyle w:val="ListParagraph"/>
+        <w:numPr>
+          <w:ilvl w:val="0"/>
+          <w:numId w:val="2"/>
+        </w:numPr>
+        <w:spacing w:after="60"/>
+      </w:pPr>
+      <w:r>
+        <w:rPr>
+          <w:rFonts w:ascii="Consolas" w:cs="Consolas" w:eastAsia="Consolas" w:hAnsi="Consolas"/>
+          <w:sz w:val="20"/>
+          <w:szCs w:val="20"/>
+          <w:shd w:fill="ECECEC" w:val="clear"/>
+        </w:rPr>
+        <w:t xml:space="preserve">RENAME TABLE emprunts_x TO emprunts;</w:t>
+      </w:r>
+    </w:p>
+    <w:p>
+      <w:pPr>
+        <w:pBdr>
+          <w:left w:val="single" w:color="1F4E79" w:sz="18"/>
+        </w:pBdr>
+        <w:shd w:fill="E2EFDA" w:val="clear"/>
+        <w:spacing w:after="160" w:before="120"/>
+        <w:ind w:left="240" w:right="240"/>
+      </w:pPr>
+      <w:r>
+        <w:rPr>
+          <w:rFonts w:ascii="Calibri" w:cs="Calibri" w:eastAsia="Calibri" w:hAnsi="Calibri"/>
+          <w:b/>
+          <w:bCs/>
+          <w:sz w:val="22"/>
+          <w:szCs w:val="22"/>
+        </w:rPr>
+        <w:t xml:space="preserve">[PRO TIP]  </w:t>
+      </w:r>
+      <w:r>
+        <w:rPr>
+          <w:rFonts w:ascii="Calibri" w:cs="Calibri" w:eastAsia="Calibri" w:hAnsi="Calibri"/>
+          <w:sz w:val="22"/>
+          <w:szCs w:val="22"/>
+        </w:rPr>
+        <w:t xml:space="preserve">Ce protocole en cinq lignes est réutilisable tel quel dans le dossier de projet de certification, sous l'intitulé « jeu d'essai — cas de défaillance ». Peu de candidats en présentent ; c'est un différenciateur réel devant un jury.</w:t>
       </w:r>
     </w:p>
     <w:p>
@@ -11139,7 +13274,49 @@
           <w:sz w:val="22"/>
           <w:szCs w:val="22"/>
         </w:rPr>
-        <w:t xml:space="preserve">Le stagiaire ne distingue pas `$titre` de `$this-&gt;titre`.</w:t>
+        <w:t xml:space="preserve">Le stagiaire ne distingue pas </w:t>
+      </w:r>
+      <w:r>
+        <w:rPr>
+          <w:rFonts w:ascii="Consolas" w:cs="Consolas" w:eastAsia="Consolas" w:hAnsi="Consolas"/>
+          <w:b/>
+          <w:bCs/>
+          <w:sz w:val="20"/>
+          <w:szCs w:val="20"/>
+          <w:shd w:fill="ECECEC" w:val="clear"/>
+        </w:rPr>
+        <w:t xml:space="preserve">$titre</w:t>
+      </w:r>
+      <w:r>
+        <w:rPr>
+          <w:rFonts w:ascii="Calibri" w:cs="Calibri" w:eastAsia="Calibri" w:hAnsi="Calibri"/>
+          <w:b/>
+          <w:bCs/>
+          <w:sz w:val="22"/>
+          <w:szCs w:val="22"/>
+        </w:rPr>
+        <w:t xml:space="preserve"> de </w:t>
+      </w:r>
+      <w:r>
+        <w:rPr>
+          <w:rFonts w:ascii="Consolas" w:cs="Consolas" w:eastAsia="Consolas" w:hAnsi="Consolas"/>
+          <w:b/>
+          <w:bCs/>
+          <w:sz w:val="20"/>
+          <w:szCs w:val="20"/>
+          <w:shd w:fill="ECECEC" w:val="clear"/>
+        </w:rPr>
+        <w:t xml:space="preserve">$this-&gt;titre</w:t>
+      </w:r>
+      <w:r>
+        <w:rPr>
+          <w:rFonts w:ascii="Calibri" w:cs="Calibri" w:eastAsia="Calibri" w:hAnsi="Calibri"/>
+          <w:b/>
+          <w:bCs/>
+          <w:sz w:val="22"/>
+          <w:szCs w:val="22"/>
+        </w:rPr>
+        <w:t xml:space="preserve">.</w:t>
       </w:r>
       <w:r>
         <w:rPr>

</xml_diff>